<commit_message>
E5: integra el trabajo de Codex en el informe y la presentación
- Prototipo con métricas del Ridge en la portada y capturas nuevas
- Sección 5.6 y figura del flujo de trabajo con GitHub y dos agentes
- Anexo H con el registro de modelos y Anexo K de trazabilidad
- Diapositiva nueva sobre cómo se construyó el proyecto

Co-Authored-By: Claude Opus 5.5 <noreply@anthropic.com>
Claude-Session: https://claude.ai/code/session_01Sm1GEyEEaRYCzcLRpQWvbd
</commit_message>
<xml_diff>
--- a/entrega5/TIG_IA_Grupo01_LumineMotors_InformeFinal.docx
+++ b/entrega5/TIG_IA_Grupo01_LumineMotors_InformeFinal.docx
@@ -496,7 +496,7 @@
           <w:sz w:val="20"/>
           <w:szCs w:val="20"/>
         </w:rPr>
-        <w:t xml:space="preserve">	12</w:t>
+        <w:t xml:space="preserve">	13</w:t>
       </w:r>
     </w:p>
     <w:p>
@@ -527,7 +527,7 @@
           <w:sz w:val="20"/>
           <w:szCs w:val="20"/>
         </w:rPr>
-        <w:t xml:space="preserve">	14</w:t>
+        <w:t xml:space="preserve">	15</w:t>
       </w:r>
     </w:p>
     <w:p>
@@ -558,7 +558,7 @@
           <w:sz w:val="20"/>
           <w:szCs w:val="20"/>
         </w:rPr>
-        <w:t xml:space="preserve">	15</w:t>
+        <w:t xml:space="preserve">	16</w:t>
       </w:r>
     </w:p>
     <w:p>
@@ -589,7 +589,7 @@
           <w:sz w:val="20"/>
           <w:szCs w:val="20"/>
         </w:rPr>
-        <w:t xml:space="preserve">	17</w:t>
+        <w:t xml:space="preserve">	18</w:t>
       </w:r>
     </w:p>
     <w:p>
@@ -620,7 +620,7 @@
           <w:sz w:val="20"/>
           <w:szCs w:val="20"/>
         </w:rPr>
-        <w:t xml:space="preserve">	18</w:t>
+        <w:t xml:space="preserve">	19</w:t>
       </w:r>
     </w:p>
     <w:p>
@@ -651,7 +651,7 @@
           <w:sz w:val="20"/>
           <w:szCs w:val="20"/>
         </w:rPr>
-        <w:t xml:space="preserve">	21</w:t>
+        <w:t xml:space="preserve">	22</w:t>
       </w:r>
     </w:p>
     <w:p>
@@ -682,7 +682,7 @@
           <w:sz w:val="18"/>
           <w:szCs w:val="18"/>
         </w:rPr>
-        <w:t xml:space="preserve">	21</w:t>
+        <w:t xml:space="preserve">	22</w:t>
       </w:r>
     </w:p>
     <w:p>
@@ -713,7 +713,7 @@
           <w:sz w:val="18"/>
           <w:szCs w:val="18"/>
         </w:rPr>
-        <w:t xml:space="preserve">	22</w:t>
+        <w:t xml:space="preserve">	23</w:t>
       </w:r>
     </w:p>
     <w:p>
@@ -744,7 +744,7 @@
           <w:sz w:val="18"/>
           <w:szCs w:val="18"/>
         </w:rPr>
-        <w:t xml:space="preserve">	23</w:t>
+        <w:t xml:space="preserve">	24</w:t>
       </w:r>
     </w:p>
     <w:p>
@@ -775,7 +775,7 @@
           <w:sz w:val="18"/>
           <w:szCs w:val="18"/>
         </w:rPr>
-        <w:t xml:space="preserve">	24</w:t>
+        <w:t xml:space="preserve">	25</w:t>
       </w:r>
     </w:p>
     <w:p>
@@ -806,7 +806,7 @@
           <w:sz w:val="18"/>
           <w:szCs w:val="18"/>
         </w:rPr>
-        <w:t xml:space="preserve">	25</w:t>
+        <w:t xml:space="preserve">	26</w:t>
       </w:r>
     </w:p>
     <w:p>
@@ -837,7 +837,7 @@
           <w:sz w:val="18"/>
           <w:szCs w:val="18"/>
         </w:rPr>
-        <w:t xml:space="preserve">	26</w:t>
+        <w:t xml:space="preserve">	27</w:t>
       </w:r>
     </w:p>
     <w:p>
@@ -868,7 +868,7 @@
           <w:sz w:val="18"/>
           <w:szCs w:val="18"/>
         </w:rPr>
-        <w:t xml:space="preserve">	27</w:t>
+        <w:t xml:space="preserve">	28</w:t>
       </w:r>
     </w:p>
     <w:p>
@@ -899,7 +899,7 @@
           <w:sz w:val="18"/>
           <w:szCs w:val="18"/>
         </w:rPr>
-        <w:t xml:space="preserve">	28</w:t>
+        <w:t xml:space="preserve">	30</w:t>
       </w:r>
     </w:p>
     <w:p>
@@ -930,7 +930,7 @@
           <w:sz w:val="18"/>
           <w:szCs w:val="18"/>
         </w:rPr>
-        <w:t xml:space="preserve">	29</w:t>
+        <w:t xml:space="preserve">	31</w:t>
       </w:r>
     </w:p>
     <w:p>
@@ -961,7 +961,38 @@
           <w:sz w:val="18"/>
           <w:szCs w:val="18"/>
         </w:rPr>
-        <w:t xml:space="preserve">	29</w:t>
+        <w:t xml:space="preserve">	31</w:t>
+      </w:r>
+    </w:p>
+    <w:p>
+      <w:pPr>
+        <w:tabs>
+          <w:tab w:val="right" w:pos="9360" w:leader="dot"/>
+        </w:tabs>
+        <w:spacing w:after="30"/>
+        <w:ind w:left="360"/>
+      </w:pPr>
+      <w:r>
+        <w:rPr>
+          <w:rFonts w:ascii="Arial" w:cs="Arial" w:eastAsia="Arial" w:hAnsi="Arial"/>
+          <w:b w:val="false"/>
+          <w:bCs w:val="false"/>
+          <w:color w:val="4B5563"/>
+          <w:sz w:val="18"/>
+          <w:szCs w:val="18"/>
+        </w:rPr>
+        <w:t xml:space="preserve">Anexo K. Trazabilidad y reproducibilidad en GitHub</w:t>
+      </w:r>
+      <w:r>
+        <w:rPr>
+          <w:rFonts w:ascii="Arial" w:cs="Arial" w:eastAsia="Arial" w:hAnsi="Arial"/>
+          <w:b w:val="false"/>
+          <w:bCs w:val="false"/>
+          <w:color w:val="4B5563"/>
+          <w:sz w:val="18"/>
+          <w:szCs w:val="18"/>
+        </w:rPr>
+        <w:t xml:space="preserve">	33</w:t>
       </w:r>
     </w:p>
     <w:p>
@@ -977,7 +1008,7 @@
           <w:sz w:val="18"/>
           <w:szCs w:val="18"/>
         </w:rPr>
-        <w:t xml:space="preserve">El desarrollo va de la página 3 a la 17; portada, índice, referencias y anexos no se cuentan en la extensión. Datos reales, secundarios, sintéticos y supuestos se identifican en cada figura y tabla. Como el calendario del curso no contempló una entrega separada de la Entrega 4, sus componentes se integran en los capítulos 4 a 8 (correspondencia en el Anexo J).</w:t>
+        <w:t xml:space="preserve">El desarrollo va de la página 3 a la 18; portada, índice, referencias y anexos no se cuentan en la extensión. Datos reales, secundarios, sintéticos y supuestos se identifican en cada figura y tabla. Como el calendario del curso no contempló una entrega separada de la Entrega 4, sus componentes se integran en los capítulos 4 a 8 (correspondencia en el Anexo J).</w:t>
       </w:r>
     </w:p>
     <w:p>
@@ -1055,7 +1086,7 @@
         <w:rPr>
           <w:rFonts w:ascii="Arial" w:cs="Arial" w:eastAsia="Arial" w:hAnsi="Arial"/>
         </w:rPr>
-        <w:t xml:space="preserve"> En 10 particiones de conductores no vistos, el modelo final (regresión Ridge con 11 variables) erra por 0,77 ± 0,08 pp, con R² = 0,83 y cobertura de 81%: cumple el objetivo de precisión (≤ 3 pp, R² ≥ 0,80). En 45 jornadas reales de 21 vehículos, el error sube a 2,0 pp; al incorporar datos reales al entrenamiento baja a 1,3 pp y la cobertura llega a 78%. Las instrucciones v3.1 aprobaron 12 de 12 casos de prueba y resistieron 10 de 10 ataques adversariales. Cinco IA distintas auditaron el trabajo; dos de ellas detectaron por separado un defecto de validación que se corrigió. Con el kit de referencia, el ahorro mediano es 19,6% en colectivos, 16,1% en conductores de aplicación y 15,3% en particulares.</w:t>
+        <w:t xml:space="preserve"> En 10 particiones de conductores no vistos, el modelo final (regresión Ridge con 11 variables) erra por 0,77 ± 0,08 pp, con R² = 0,83 y cobertura de 81%: cumple el objetivo de precisión (≤ 3 pp, R² ≥ 0,80). En 45 jornadas reales de 21 vehículos, el error sube a 2,0 pp; al incorporar datos reales al entrenamiento baja a 1,3 pp y la cobertura llega a 78%. Las instrucciones v3.1 aprobaron 12 de 12 casos de prueba y resistieron 10 de 10 ataques adversariales. Cinco IA distintas auditaron el trabajo; dos de ellas detectaron por separado un defecto de validación que se corrigió. Con el kit de referencia, el ahorro mediano es 19,6% en colectivos, 16,1% en conductores de aplicación y 15,3% en particulares. Todo el desarrollo quedó versionado en GitHub: dos agentes de programación (Claude Code y Codex) trabajaron en ramas paralelas, y 20 pruebas automáticas verifican el prototipo en cada cambio.</w:t>
       </w:r>
     </w:p>
     <w:p>
@@ -5329,7 +5360,7 @@
         <w:rPr>
           <w:rFonts w:ascii="Arial" w:cs="Arial" w:eastAsia="Arial" w:hAnsi="Arial"/>
         </w:rPr>
-        <w:t xml:space="preserve"> fijan las reglas legales. El validador cierra el circuito: comprueba que cada número del mensaje exista en el JSON, y si no, el cliente recibe la plantilla determinista.</w:t>
+        <w:t xml:space="preserve"> fijan las reglas legales. El validador cierra el circuito: comprueba que cada número del mensaje exista en el JSON, y si no, el cliente recibe la plantilla determinista. La Figura 2 conserva las cifras de la batería validada; con el modelo Ridge que hoy usa el prototipo, el mismo caso da 19,7% (18,4% a 21,0%) y $159.000 al mes (Anexo G).</w:t>
       </w:r>
     </w:p>
     <w:p>
@@ -5517,7 +5548,7 @@
         <w:rPr>
           <w:rFonts w:ascii="Arial" w:cs="Arial" w:eastAsia="Arial" w:hAnsi="Arial"/>
         </w:rPr>
-        <w:t xml:space="preserve"> en la versión que se implementa (fase F1 del capítulo 7; las capturas del Anexo G muestran aún el GBM de la Entrega 3). Ridge además se explica con coeficientes: más tiempo sobre 60 km/h y más cilindrada bajan el ahorro, y más masa y más subida lo aumentan (Anexo D). El GBM no sobreajusta (100 árboles rinden igual que 300 y la curva de aprendizaje se aplana desde unos 150 conductores), y la variable más influyente es la energía cinética por kilómetro.</w:t>
+        <w:t xml:space="preserve">, y el cambio ya está en el prototipo: Codex lo implementó en una rama paralela, con el intervalo calibrado por conductor (±1,33 pp) y pruebas automáticas que comprueban que Python y JavaScript entreguen la misma cifra (capítulo 5.6). Ridge además se explica con coeficientes: más tiempo sobre 60 km/h y más cilindrada bajan el ahorro, y más masa y más subida lo aumentan (Anexo D). El GBM no sobreajusta (100 árboles rinden igual que 300 y la curva de aprendizaje se aplana desde unos 150 conductores), y la variable más influyente es la energía cinética por kilómetro.</w:t>
       </w:r>
     </w:p>
     <w:p>
@@ -7529,7 +7560,7 @@
         <w:rPr>
           <w:rFonts w:ascii="Arial" w:cs="Arial" w:eastAsia="Arial" w:hAnsi="Arial"/>
         </w:rPr>
-        <w:t xml:space="preserve">5.6. Limitaciones</w:t>
+        <w:t xml:space="preserve">5.6. Cómo se construyó: GitHub, dos agentes de programación y cinco IA auditoras</w:t>
       </w:r>
     </w:p>
     <w:p>
@@ -7541,7 +7572,165 @@
         <w:rPr>
           <w:rFonts w:ascii="Arial" w:cs="Arial" w:eastAsia="Arial" w:hAnsi="Arial"/>
         </w:rPr>
-        <w:t xml:space="preserve">El ahorro es simulado y no medido, con parámetros del kit supuestos a falta de una ficha de proveedor; los perfiles sintéticos reproducen las velocidades de Santiago pero no su diversidad; la validación real usa jornadas de otra ciudad; H3 no se midió; y cada prueba de la capa generativa se ejecutó una vez, aunque un modelo de lenguaje varía entre ejecuciones. Por eso el estimador no debe publicar cifras de diagnóstico antes de la recalibración con telemetría, y la batería de 22 pruebas debe repetirse ante cualquier cambio de modelo o de instrucciones.</w:t>
+        <w:t xml:space="preserve">El proyecto se desarrolló en un repositorio de GitHub (diegoaam0109-ux/lumine) con una regla de trazabilidad: ninguna cifra del informe se escribe a mano, sino que sale de un script versionado. El equipo trabajó con dos agentes de programación en paralelo, una práctica conocida como programación asistida por IA (</w:t>
+      </w:r>
+      <w:r>
+        <w:rPr>
+          <w:rFonts w:ascii="Arial" w:cs="Arial" w:eastAsia="Arial" w:hAnsi="Arial"/>
+          <w:i/>
+          <w:iCs/>
+        </w:rPr>
+        <w:t xml:space="preserve">vibe coding</w:t>
+      </w:r>
+      <w:r>
+        <w:rPr>
+          <w:rFonts w:ascii="Arial" w:cs="Arial" w:eastAsia="Arial" w:hAnsi="Arial"/>
+        </w:rPr>
+        <w:t xml:space="preserve">) que aquí se sometió a control de cambios. Claude Code construyó el simulador, el modelo, el prototipo y los informes en una rama; Codex, en otra, implementó el modelo Ridge en el prototipo, escribió 20 pruebas automáticas, configuró GitHub Actions y reprodujo el proyecto desde cero en un clon limpio (Figura 4). El equipo revisó cada cambio antes de integrarlo. Las cinco IA auditoras no tuvieron acceso al repositorio: sus hallazgos entraron como cambios con autor, fecha y propósito, por lo que cada decisión del informe se puede rastrear hasta el commit que la produjo.</w:t>
+      </w:r>
+    </w:p>
+    <w:p>
+      <w:pPr>
+        <w:keepNext/>
+        <w:spacing w:after="0" w:before="160"/>
+      </w:pPr>
+      <w:r>
+        <w:rPr>
+          <w:rFonts w:ascii="Arial" w:cs="Arial" w:eastAsia="Arial" w:hAnsi="Arial"/>
+          <w:b/>
+          <w:bCs/>
+          <w:color w:val="1F2A44"/>
+          <w:sz w:val="20"/>
+          <w:szCs w:val="20"/>
+        </w:rPr>
+        <w:t xml:space="preserve">Figura 4</w:t>
+      </w:r>
+    </w:p>
+    <w:p>
+      <w:pPr>
+        <w:keepNext/>
+        <w:spacing w:after="80"/>
+      </w:pPr>
+      <w:r>
+        <w:rPr>
+          <w:rFonts w:ascii="Arial" w:cs="Arial" w:eastAsia="Arial" w:hAnsi="Arial"/>
+          <w:i/>
+          <w:iCs/>
+          <w:color w:val="1F2A44"/>
+          <w:sz w:val="20"/>
+          <w:szCs w:val="20"/>
+        </w:rPr>
+        <w:t xml:space="preserve">Flujo de trabajo del proyecto: dos agentes de programación en paralelo, auditoría externa y control automático</w:t>
+      </w:r>
+    </w:p>
+    <w:p>
+      <w:pPr>
+        <w:keepNext/>
+        <w:spacing w:after="40"/>
+        <w:jc w:val="center"/>
+      </w:pPr>
+      <w:r>
+        <w:drawing>
+          <wp:inline distT="0" distB="0" distL="0" distR="0">
+            <wp:extent cx="5943600" cy="2876550"/>
+            <wp:effectExtent t="0" r="0" b="0" l="0"/>
+            <wp:docPr id="1" name="fig_flujo_trabajo.png" descr="fig_flujo_trabajo.png" title="fig_flujo_trabajo.png"/>
+            <wp:cNvGraphicFramePr>
+              <a:graphicFrameLocks xmlns:a="http://schemas.openxmlformats.org/drawingml/2006/main" noChangeAspect="1"/>
+            </wp:cNvGraphicFramePr>
+            <a:graphic xmlns:a="http://schemas.openxmlformats.org/drawingml/2006/main">
+              <a:graphicData uri="http://schemas.openxmlformats.org/drawingml/2006/picture">
+                <pic:pic xmlns:pic="http://schemas.openxmlformats.org/drawingml/2006/picture">
+                  <pic:nvPicPr>
+                    <pic:cNvPr id="0" name="" descr=""/>
+                    <pic:cNvPicPr>
+                      <a:picLocks noChangeAspect="1" noChangeArrowheads="1"/>
+                    </pic:cNvPicPr>
+                  </pic:nvPicPr>
+                  <pic:blipFill>
+                    <a:blip r:embed="rId13" cstate="none"/>
+                    <a:srcRect/>
+                    <a:stretch>
+                      <a:fillRect/>
+                    </a:stretch>
+                  </pic:blipFill>
+                  <pic:spPr bwMode="auto">
+                    <a:xfrm>
+                      <a:off x="0" y="0"/>
+                      <a:ext cx="5943600" cy="2876550"/>
+                    </a:xfrm>
+                    <a:prstGeom prst="rect">
+                      <a:avLst/>
+                    </a:prstGeom>
+                  </pic:spPr>
+                </pic:pic>
+              </a:graphicData>
+            </a:graphic>
+          </wp:inline>
+        </w:drawing>
+      </w:r>
+    </w:p>
+    <w:p>
+      <w:pPr>
+        <w:spacing w:after="160" w:before="60" w:line="240"/>
+        <w:jc w:val="left"/>
+      </w:pPr>
+      <w:r>
+        <w:rPr>
+          <w:rFonts w:ascii="Arial" w:cs="Arial" w:eastAsia="Arial" w:hAnsi="Arial"/>
+          <w:i/>
+          <w:iCs/>
+          <w:color w:val="4B5563"/>
+          <w:sz w:val="17"/>
+          <w:szCs w:val="17"/>
+        </w:rPr>
+        <w:t xml:space="preserve">Nota. </w:t>
+      </w:r>
+      <w:r>
+        <w:rPr>
+          <w:rFonts w:ascii="Arial" w:cs="Arial" w:eastAsia="Arial" w:hAnsi="Arial"/>
+          <w:color w:val="4B5563"/>
+          <w:sz w:val="17"/>
+          <w:szCs w:val="17"/>
+        </w:rPr>
+        <w:t xml:space="preserve">Elaboración propia a partir del historial del repositorio (18 commits entre el 3 y el 27 de octubre de 2026). Detalle de commits, pruebas y tiempos de reproducción en el Anexo K.</w:t>
+      </w:r>
+    </w:p>
+    <w:p>
+      <w:pPr>
+        <w:spacing w:after="120" w:before="0" w:line="264"/>
+        <w:jc w:val="both"/>
+      </w:pPr>
+      <w:r>
+        <w:rPr>
+          <w:rFonts w:ascii="Arial" w:cs="Arial" w:eastAsia="Arial" w:hAnsi="Arial"/>
+        </w:rPr>
+        <w:t xml:space="preserve">La reproducción independiente de Codex fue la prueba más exigente del método. Regeneró la Entrega 3 completa (la simulación tarda 59 segundos y el modelo, 14 minutos) y obtuvo los mismos resultados del validador sobre las respuestas registradas: 0, 4, 11 y 12 de 12 casos. También documentó lo que no salió igual: la validación corregida superó su límite de 40 minutos y el PDF regenerado tuvo 28 páginas en vez de 30 por diferencias de fuentes. Registrar esas diferencias, en lugar de ocultarlas, es parte del rigor.</w:t>
+      </w:r>
+    </w:p>
+    <w:p>
+      <w:pPr>
+        <w:pStyle w:val="Heading2"/>
+        <w:keepNext/>
+        <w:spacing w:after="80" w:before="180"/>
+      </w:pPr>
+      <w:r>
+        <w:rPr>
+          <w:rFonts w:ascii="Arial" w:cs="Arial" w:eastAsia="Arial" w:hAnsi="Arial"/>
+        </w:rPr>
+        <w:t xml:space="preserve">5.7. Limitaciones</w:t>
+      </w:r>
+    </w:p>
+    <w:p>
+      <w:pPr>
+        <w:spacing w:after="120" w:before="0" w:line="264"/>
+        <w:jc w:val="both"/>
+      </w:pPr>
+      <w:r>
+        <w:rPr>
+          <w:rFonts w:ascii="Arial" w:cs="Arial" w:eastAsia="Arial" w:hAnsi="Arial"/>
+        </w:rPr>
+        <w:t xml:space="preserve">El ahorro es simulado y no medido, con parámetros del kit supuestos a falta de una ficha de proveedor; los perfiles sintéticos reproducen las velocidades de Santiago pero no su diversidad; la validación real usa jornadas de otra ciudad; H3 no se midió; cada prueba de la capa generativa se ejecutó una vez, aunque un modelo de lenguaje varía entre ejecuciones; y la versión exacta de varios modelos auditores no quedó registrada (Anexo H). Por eso el estimador no debe publicar cifras de diagnóstico antes de la recalibración con telemetría, y la batería de 22 pruebas debe repetirse ante cualquier cambio de modelo o de instrucciones.</w:t>
       </w:r>
     </w:p>
     <w:p>
@@ -11576,7 +11765,7 @@
         <w:rPr>
           <w:rFonts w:ascii="Arial" w:cs="Arial" w:eastAsia="Arial" w:hAnsi="Arial"/>
         </w:rPr>
-        <w:t xml:space="preserve">La implementación avanza por fases con una decisión explícita en cada hito, de modo que la empresa invierte más solo cuando la evidencia lo justifica (Figura 4).</w:t>
+        <w:t xml:space="preserve">La implementación avanza por fases con una decisión explícita en cada hito, de modo que la empresa invierte más solo cuando la evidencia lo justifica (Figura 5).</w:t>
       </w:r>
     </w:p>
     <w:p>
@@ -11593,7 +11782,7 @@
           <w:sz w:val="20"/>
           <w:szCs w:val="20"/>
         </w:rPr>
-        <w:t xml:space="preserve">Figura 4</w:t>
+        <w:t xml:space="preserve">Figura 5</w:t>
       </w:r>
     </w:p>
     <w:p>
@@ -11638,7 +11827,7 @@
                     </pic:cNvPicPr>
                   </pic:nvPicPr>
                   <pic:blipFill>
-                    <a:blip r:embed="rId13" cstate="none"/>
+                    <a:blip r:embed="rId14" cstate="none"/>
                     <a:srcRect/>
                     <a:stretch>
                       <a:fillRect/>
@@ -12192,7 +12381,7 @@
                 <w:sz w:val="17"/>
                 <w:szCs w:val="17"/>
               </w:rPr>
-              <w:t xml:space="preserve">A/B con 173 prospectos por grupo; nivel 2 con Ridge; 10 instalaciones con telemetría. Decisión: continuar si el efecto supera 3,0 pp</w:t>
+              <w:t xml:space="preserve">A/B con 173 prospectos por grupo; 10 instalaciones con telemetría (el nivel 2 con Ridge ya está en el prototipo). Decisión: continuar si el efecto supera 3,0 pp</w:t>
             </w:r>
           </w:p>
         </w:tc>
@@ -13873,7 +14062,7 @@
           <w:sz w:val="20"/>
           <w:szCs w:val="20"/>
         </w:rPr>
-        <w:t xml:space="preserve">Figura 5</w:t>
+        <w:t xml:space="preserve">Figura 6</w:t>
       </w:r>
     </w:p>
     <w:p>
@@ -13918,7 +14107,7 @@
                     </pic:cNvPicPr>
                   </pic:nvPicPr>
                   <pic:blipFill>
-                    <a:blip r:embed="rId14" cstate="none"/>
+                    <a:blip r:embed="rId15" cstate="none"/>
                     <a:srcRect/>
                     <a:stretch>
                       <a:fillRect/>
@@ -29400,7 +29589,7 @@
         <w:rPr>
           <w:rFonts w:ascii="Arial" w:cs="Arial" w:eastAsia="Arial" w:hAnsi="Arial"/>
         </w:rPr>
-        <w:t xml:space="preserve">El prototipo completo está en el repositorio del proyecto. La interfaz (entrega3/prototipo/app/index.html) es un archivo único que funciona sin conexión y corre el modelo en el navegador; también está publicada como página web.</w:t>
+        <w:t xml:space="preserve">El prototipo completo está en el repositorio del proyecto. La interfaz (entrega3/prototipo/app/index.html) es un archivo único que funciona sin conexión y corre el modelo en el navegador; un flujo de GitHub Actions la publica en GitHub Pages cuando se habilita esa opción en el repositorio.</w:t>
       </w:r>
     </w:p>
     <w:p>
@@ -29852,7 +30041,7 @@
                 <w:sz w:val="17"/>
                 <w:szCs w:val="17"/>
               </w:rPr>
-              <w:t xml:space="preserve">entrega4/redteam/</w:t>
+              <w:t xml:space="preserve">entrenar_ridge.py · app/modelo.json</w:t>
             </w:r>
           </w:p>
         </w:tc>
@@ -29884,7 +30073,7 @@
                 <w:sz w:val="17"/>
                 <w:szCs w:val="17"/>
               </w:rPr>
-              <w:t xml:space="preserve">Ataques, prompts listos, respuestas de ChatGPT y validador adversarial</w:t>
+              <w:t xml:space="preserve">Modelo Ridge del nivel 2 con intervalo calibrado por conductor, exportado al prototipo (Codex)</w:t>
             </w:r>
           </w:p>
         </w:tc>
@@ -29924,7 +30113,7 @@
                 <w:sz w:val="17"/>
                 <w:szCs w:val="17"/>
               </w:rPr>
-              <w:t xml:space="preserve">entrega5/analisis/analisis_final.py</w:t>
+              <w:t xml:space="preserve">tests/ · requirements.txt</w:t>
             </w:r>
           </w:p>
         </w:tc>
@@ -29957,7 +30146,222 @@
                 <w:sz w:val="17"/>
                 <w:szCs w:val="17"/>
               </w:rPr>
-              <w:t xml:space="preserve">Ridge explicable, variación por perfil, tamaño del A/B, evaluación económica y figuras de este informe</w:t>
+              <w:t xml:space="preserve">20 pruebas automáticas y versiones fijadas de las dependencias (Codex)</w:t>
+            </w:r>
+          </w:p>
+        </w:tc>
+      </w:tr>
+      <w:tr>
+        <w:trPr>
+          <w:cantSplit/>
+        </w:trPr>
+        <w:tc>
+          <w:tcPr>
+            <w:tcW w:type="dxa" w:w="3600"/>
+            <w:tcBorders>
+              <w:top w:val="single" w:color="C9D1DB" w:sz="4"/>
+              <w:left w:val="single" w:color="C9D1DB" w:sz="4"/>
+              <w:bottom w:val="single" w:color="C9D1DB" w:sz="4"/>
+              <w:right w:val="single" w:color="C9D1DB" w:sz="4"/>
+            </w:tcBorders>
+            <w:tcMar>
+              <w:top w:type="dxa" w:w="50"/>
+              <w:left w:type="dxa" w:w="80"/>
+              <w:bottom w:type="dxa" w:w="50"/>
+              <w:right w:type="dxa" w:w="80"/>
+            </w:tcMar>
+            <w:vAlign w:val="center"/>
+          </w:tcPr>
+          <w:p>
+            <w:pPr>
+              <w:spacing w:after="0" w:line="230"/>
+              <w:jc w:val="left"/>
+            </w:pPr>
+            <w:r>
+              <w:rPr>
+                <w:rFonts w:ascii="Arial" w:cs="Arial" w:eastAsia="Arial" w:hAnsi="Arial"/>
+                <w:b/>
+                <w:bCs/>
+                <w:sz w:val="17"/>
+                <w:szCs w:val="17"/>
+              </w:rPr>
+              <w:t xml:space="preserve">entrega4/redteam/</w:t>
+            </w:r>
+          </w:p>
+        </w:tc>
+        <w:tc>
+          <w:tcPr>
+            <w:tcW w:type="dxa" w:w="5760"/>
+            <w:tcBorders>
+              <w:top w:val="single" w:color="C9D1DB" w:sz="4"/>
+              <w:left w:val="single" w:color="C9D1DB" w:sz="4"/>
+              <w:bottom w:val="single" w:color="C9D1DB" w:sz="4"/>
+              <w:right w:val="single" w:color="C9D1DB" w:sz="4"/>
+            </w:tcBorders>
+            <w:tcMar>
+              <w:top w:type="dxa" w:w="50"/>
+              <w:left w:type="dxa" w:w="80"/>
+              <w:bottom w:type="dxa" w:w="50"/>
+              <w:right w:type="dxa" w:w="80"/>
+            </w:tcMar>
+            <w:vAlign w:val="center"/>
+          </w:tcPr>
+          <w:p>
+            <w:pPr>
+              <w:spacing w:after="0" w:line="230"/>
+              <w:jc w:val="left"/>
+            </w:pPr>
+            <w:r>
+              <w:rPr>
+                <w:rFonts w:ascii="Arial" w:cs="Arial" w:eastAsia="Arial" w:hAnsi="Arial"/>
+                <w:sz w:val="17"/>
+                <w:szCs w:val="17"/>
+              </w:rPr>
+              <w:t xml:space="preserve">Ataques, prompts listos, respuestas de ChatGPT y validador adversarial</w:t>
+            </w:r>
+          </w:p>
+        </w:tc>
+      </w:tr>
+      <w:tr>
+        <w:trPr>
+          <w:cantSplit/>
+        </w:trPr>
+        <w:tc>
+          <w:tcPr>
+            <w:tcW w:type="dxa" w:w="3600"/>
+            <w:tcBorders>
+              <w:top w:val="single" w:color="C9D1DB" w:sz="4"/>
+              <w:left w:val="single" w:color="C9D1DB" w:sz="4"/>
+              <w:bottom w:val="single" w:color="C9D1DB" w:sz="4"/>
+              <w:right w:val="single" w:color="C9D1DB" w:sz="4"/>
+            </w:tcBorders>
+            <w:shd w:fill="F3F6FA" w:color="auto" w:val="clear"/>
+            <w:tcMar>
+              <w:top w:type="dxa" w:w="50"/>
+              <w:left w:type="dxa" w:w="80"/>
+              <w:bottom w:type="dxa" w:w="50"/>
+              <w:right w:type="dxa" w:w="80"/>
+            </w:tcMar>
+            <w:vAlign w:val="center"/>
+          </w:tcPr>
+          <w:p>
+            <w:pPr>
+              <w:spacing w:after="0" w:line="230"/>
+              <w:jc w:val="left"/>
+            </w:pPr>
+            <w:r>
+              <w:rPr>
+                <w:rFonts w:ascii="Arial" w:cs="Arial" w:eastAsia="Arial" w:hAnsi="Arial"/>
+                <w:b/>
+                <w:bCs/>
+                <w:sz w:val="17"/>
+                <w:szCs w:val="17"/>
+              </w:rPr>
+              <w:t xml:space="preserve">entrega5/analisis/ · entrega5/informe/</w:t>
+            </w:r>
+          </w:p>
+        </w:tc>
+        <w:tc>
+          <w:tcPr>
+            <w:tcW w:type="dxa" w:w="5760"/>
+            <w:tcBorders>
+              <w:top w:val="single" w:color="C9D1DB" w:sz="4"/>
+              <w:left w:val="single" w:color="C9D1DB" w:sz="4"/>
+              <w:bottom w:val="single" w:color="C9D1DB" w:sz="4"/>
+              <w:right w:val="single" w:color="C9D1DB" w:sz="4"/>
+            </w:tcBorders>
+            <w:shd w:fill="F3F6FA" w:color="auto" w:val="clear"/>
+            <w:tcMar>
+              <w:top w:type="dxa" w:w="50"/>
+              <w:left w:type="dxa" w:w="80"/>
+              <w:bottom w:type="dxa" w:w="50"/>
+              <w:right w:type="dxa" w:w="80"/>
+            </w:tcMar>
+            <w:vAlign w:val="center"/>
+          </w:tcPr>
+          <w:p>
+            <w:pPr>
+              <w:spacing w:after="0" w:line="230"/>
+              <w:jc w:val="left"/>
+            </w:pPr>
+            <w:r>
+              <w:rPr>
+                <w:rFonts w:ascii="Arial" w:cs="Arial" w:eastAsia="Arial" w:hAnsi="Arial"/>
+                <w:sz w:val="17"/>
+                <w:szCs w:val="17"/>
+              </w:rPr>
+              <w:t xml:space="preserve">Cifras, figuras y generadores de este informe y de la presentación</w:t>
+            </w:r>
+          </w:p>
+        </w:tc>
+      </w:tr>
+      <w:tr>
+        <w:trPr>
+          <w:cantSplit/>
+        </w:trPr>
+        <w:tc>
+          <w:tcPr>
+            <w:tcW w:type="dxa" w:w="3600"/>
+            <w:tcBorders>
+              <w:top w:val="single" w:color="C9D1DB" w:sz="4"/>
+              <w:left w:val="single" w:color="C9D1DB" w:sz="4"/>
+              <w:bottom w:val="single" w:color="C9D1DB" w:sz="4"/>
+              <w:right w:val="single" w:color="C9D1DB" w:sz="4"/>
+            </w:tcBorders>
+            <w:tcMar>
+              <w:top w:type="dxa" w:w="50"/>
+              <w:left w:type="dxa" w:w="80"/>
+              <w:bottom w:type="dxa" w:w="50"/>
+              <w:right w:type="dxa" w:w="80"/>
+            </w:tcMar>
+            <w:vAlign w:val="center"/>
+          </w:tcPr>
+          <w:p>
+            <w:pPr>
+              <w:spacing w:after="0" w:line="230"/>
+              <w:jc w:val="left"/>
+            </w:pPr>
+            <w:r>
+              <w:rPr>
+                <w:rFonts w:ascii="Arial" w:cs="Arial" w:eastAsia="Arial" w:hAnsi="Arial"/>
+                <w:b/>
+                <w:bCs/>
+                <w:sz w:val="17"/>
+                <w:szCs w:val="17"/>
+              </w:rPr>
+              <w:t xml:space="preserve">.github/workflows/ · REPRODUCIBILIDAD.md</w:t>
+            </w:r>
+          </w:p>
+        </w:tc>
+        <w:tc>
+          <w:tcPr>
+            <w:tcW w:type="dxa" w:w="5760"/>
+            <w:tcBorders>
+              <w:top w:val="single" w:color="C9D1DB" w:sz="4"/>
+              <w:left w:val="single" w:color="C9D1DB" w:sz="4"/>
+              <w:bottom w:val="single" w:color="C9D1DB" w:sz="4"/>
+              <w:right w:val="single" w:color="C9D1DB" w:sz="4"/>
+            </w:tcBorders>
+            <w:tcMar>
+              <w:top w:type="dxa" w:w="50"/>
+              <w:left w:type="dxa" w:w="80"/>
+              <w:bottom w:type="dxa" w:w="50"/>
+              <w:right w:type="dxa" w:w="80"/>
+            </w:tcMar>
+            <w:vAlign w:val="center"/>
+          </w:tcPr>
+          <w:p>
+            <w:pPr>
+              <w:spacing w:after="0" w:line="230"/>
+              <w:jc w:val="left"/>
+            </w:pPr>
+            <w:r>
+              <w:rPr>
+                <w:rFonts w:ascii="Arial" w:cs="Arial" w:eastAsia="Arial" w:hAnsi="Arial"/>
+                <w:sz w:val="17"/>
+                <w:szCs w:val="17"/>
+              </w:rPr>
+              <w:t xml:space="preserve">Pruebas en cada cambio, publicación en Pages y registro de la reproducción en limpio (Codex)</w:t>
             </w:r>
           </w:p>
         </w:tc>
@@ -30020,7 +30424,7 @@
           <w:sz w:val="20"/>
           <w:szCs w:val="20"/>
         </w:rPr>
-        <w:t xml:space="preserve">Vista de diagnóstico de un colectivo</w:t>
+        <w:t xml:space="preserve">Vista de diagnóstico de un colectivo con el modelo Ridge</w:t>
       </w:r>
     </w:p>
     <w:p>
@@ -30032,116 +30436,9 @@
       <w:r>
         <w:drawing>
           <wp:inline distT="0" distB="0" distL="0" distR="0">
-            <wp:extent cx="3429000" cy="3190875"/>
+            <wp:extent cx="5334000" cy="3486150"/>
             <wp:effectExtent t="0" r="0" b="0" l="0"/>
-            <wp:docPr id="1" name="app_diagnostico.png" descr="app_diagnostico.png" title="app_diagnostico.png"/>
-            <wp:cNvGraphicFramePr>
-              <a:graphicFrameLocks xmlns:a="http://schemas.openxmlformats.org/drawingml/2006/main" noChangeAspect="1"/>
-            </wp:cNvGraphicFramePr>
-            <a:graphic xmlns:a="http://schemas.openxmlformats.org/drawingml/2006/main">
-              <a:graphicData uri="http://schemas.openxmlformats.org/drawingml/2006/picture">
-                <pic:pic xmlns:pic="http://schemas.openxmlformats.org/drawingml/2006/picture">
-                  <pic:nvPicPr>
-                    <pic:cNvPr id="0" name="" descr=""/>
-                    <pic:cNvPicPr>
-                      <a:picLocks noChangeAspect="1" noChangeArrowheads="1"/>
-                    </pic:cNvPicPr>
-                  </pic:nvPicPr>
-                  <pic:blipFill>
-                    <a:blip r:embed="rId15" cstate="none"/>
-                    <a:srcRect/>
-                    <a:stretch>
-                      <a:fillRect/>
-                    </a:stretch>
-                  </pic:blipFill>
-                  <pic:spPr bwMode="auto">
-                    <a:xfrm>
-                      <a:off x="0" y="0"/>
-                      <a:ext cx="3429000" cy="3190875"/>
-                    </a:xfrm>
-                    <a:prstGeom prst="rect">
-                      <a:avLst/>
-                    </a:prstGeom>
-                  </pic:spPr>
-                </pic:pic>
-              </a:graphicData>
-            </a:graphic>
-          </wp:inline>
-        </w:drawing>
-      </w:r>
-    </w:p>
-    <w:p>
-      <w:pPr>
-        <w:spacing w:after="160" w:before="60" w:line="240"/>
-        <w:jc w:val="left"/>
-      </w:pPr>
-      <w:r>
-        <w:rPr>
-          <w:rFonts w:ascii="Arial" w:cs="Arial" w:eastAsia="Arial" w:hAnsi="Arial"/>
-          <w:i/>
-          <w:iCs/>
-          <w:color w:val="4B5563"/>
-          <w:sz w:val="17"/>
-          <w:szCs w:val="17"/>
-        </w:rPr>
-        <w:t xml:space="preserve">Nota. </w:t>
-      </w:r>
-      <w:r>
-        <w:rPr>
-          <w:rFonts w:ascii="Arial" w:cs="Arial" w:eastAsia="Arial" w:hAnsi="Arial"/>
-          <w:color w:val="4B5563"/>
-          <w:sz w:val="17"/>
-          <w:szCs w:val="17"/>
-        </w:rPr>
-        <w:t xml:space="preserve">Captura del prototipo. Registro sintético de un colectivo de 213 km diarios; texto generado por Claude con v3.1 y aprobado por el validador.</w:t>
-      </w:r>
-    </w:p>
-    <w:p>
-      <w:pPr>
-        <w:keepNext/>
-        <w:spacing w:after="0" w:before="160"/>
-      </w:pPr>
-      <w:r>
-        <w:rPr>
-          <w:rFonts w:ascii="Arial" w:cs="Arial" w:eastAsia="Arial" w:hAnsi="Arial"/>
-          <w:b/>
-          <w:bCs/>
-          <w:color w:val="1F2A44"/>
-          <w:sz w:val="20"/>
-          <w:szCs w:val="20"/>
-        </w:rPr>
-        <w:t xml:space="preserve">Figura G2</w:t>
-      </w:r>
-    </w:p>
-    <w:p>
-      <w:pPr>
-        <w:keepNext/>
-        <w:spacing w:after="80"/>
-      </w:pPr>
-      <w:r>
-        <w:rPr>
-          <w:rFonts w:ascii="Arial" w:cs="Arial" w:eastAsia="Arial" w:hAnsi="Arial"/>
-          <w:i/>
-          <w:iCs/>
-          <w:color w:val="1F2A44"/>
-          <w:sz w:val="20"/>
-          <w:szCs w:val="20"/>
-        </w:rPr>
-        <w:t xml:space="preserve">Panel del técnico con un ajuste registrado</w:t>
-      </w:r>
-    </w:p>
-    <w:p>
-      <w:pPr>
-        <w:keepNext/>
-        <w:spacing w:after="40"/>
-        <w:jc w:val="center"/>
-      </w:pPr>
-      <w:r>
-        <w:drawing>
-          <wp:inline distT="0" distB="0" distL="0" distR="0">
-            <wp:extent cx="4572000" cy="4086225"/>
-            <wp:effectExtent t="0" r="0" b="0" l="0"/>
-            <wp:docPr id="1" name="app_tecnico.png" descr="app_tecnico.png" title="app_tecnico.png"/>
+            <wp:docPr id="1" name="app_diagnostico_ridge.png" descr="app_diagnostico_ridge.png" title="app_diagnostico_ridge.png"/>
             <wp:cNvGraphicFramePr>
               <a:graphicFrameLocks xmlns:a="http://schemas.openxmlformats.org/drawingml/2006/main" noChangeAspect="1"/>
             </wp:cNvGraphicFramePr>
@@ -30164,7 +30461,7 @@
                   <pic:spPr bwMode="auto">
                     <a:xfrm>
                       <a:off x="0" y="0"/>
-                      <a:ext cx="4572000" cy="4086225"/>
+                      <a:ext cx="5334000" cy="3486150"/>
                     </a:xfrm>
                     <a:prstGeom prst="rect">
                       <a:avLst/>
@@ -30200,7 +30497,114 @@
           <w:sz w:val="17"/>
           <w:szCs w:val="17"/>
         </w:rPr>
-        <w:t xml:space="preserve">Captura del prototipo. El técnico aplicó −1,0 punto por uso permanente del aire acondicionado; el ajuste queda registrado.</w:t>
+        <w:t xml:space="preserve">Captura del prototipo final. Registro sintético de un colectivo de 213 km diarios: 19,7% (18,4% a 21,0%), $159.000 al mes y 22 meses. El texto viene de la plantilla de respaldo, porque las salidas de Claude validadas corresponden a las cifras de la Entrega 3.</w:t>
+      </w:r>
+    </w:p>
+    <w:p>
+      <w:pPr>
+        <w:keepNext/>
+        <w:spacing w:after="0" w:before="160"/>
+      </w:pPr>
+      <w:r>
+        <w:rPr>
+          <w:rFonts w:ascii="Arial" w:cs="Arial" w:eastAsia="Arial" w:hAnsi="Arial"/>
+          <w:b/>
+          <w:bCs/>
+          <w:color w:val="1F2A44"/>
+          <w:sz w:val="20"/>
+          <w:szCs w:val="20"/>
+        </w:rPr>
+        <w:t xml:space="preserve">Figura G2</w:t>
+      </w:r>
+    </w:p>
+    <w:p>
+      <w:pPr>
+        <w:keepNext/>
+        <w:spacing w:after="80"/>
+      </w:pPr>
+      <w:r>
+        <w:rPr>
+          <w:rFonts w:ascii="Arial" w:cs="Arial" w:eastAsia="Arial" w:hAnsi="Arial"/>
+          <w:i/>
+          <w:iCs/>
+          <w:color w:val="1F2A44"/>
+          <w:sz w:val="20"/>
+          <w:szCs w:val="20"/>
+        </w:rPr>
+        <w:t xml:space="preserve">Panel del técnico con un ajuste registrado</w:t>
+      </w:r>
+    </w:p>
+    <w:p>
+      <w:pPr>
+        <w:keepNext/>
+        <w:spacing w:after="40"/>
+        <w:jc w:val="center"/>
+      </w:pPr>
+      <w:r>
+        <w:drawing>
+          <wp:inline distT="0" distB="0" distL="0" distR="0">
+            <wp:extent cx="5334000" cy="3438525"/>
+            <wp:effectExtent t="0" r="0" b="0" l="0"/>
+            <wp:docPr id="1" name="app_tecnico_ridge.png" descr="app_tecnico_ridge.png" title="app_tecnico_ridge.png"/>
+            <wp:cNvGraphicFramePr>
+              <a:graphicFrameLocks xmlns:a="http://schemas.openxmlformats.org/drawingml/2006/main" noChangeAspect="1"/>
+            </wp:cNvGraphicFramePr>
+            <a:graphic xmlns:a="http://schemas.openxmlformats.org/drawingml/2006/main">
+              <a:graphicData uri="http://schemas.openxmlformats.org/drawingml/2006/picture">
+                <pic:pic xmlns:pic="http://schemas.openxmlformats.org/drawingml/2006/picture">
+                  <pic:nvPicPr>
+                    <pic:cNvPr id="0" name="" descr=""/>
+                    <pic:cNvPicPr>
+                      <a:picLocks noChangeAspect="1" noChangeArrowheads="1"/>
+                    </pic:cNvPicPr>
+                  </pic:nvPicPr>
+                  <pic:blipFill>
+                    <a:blip r:embed="rId17" cstate="none"/>
+                    <a:srcRect/>
+                    <a:stretch>
+                      <a:fillRect/>
+                    </a:stretch>
+                  </pic:blipFill>
+                  <pic:spPr bwMode="auto">
+                    <a:xfrm>
+                      <a:off x="0" y="0"/>
+                      <a:ext cx="5334000" cy="3438525"/>
+                    </a:xfrm>
+                    <a:prstGeom prst="rect">
+                      <a:avLst/>
+                    </a:prstGeom>
+                  </pic:spPr>
+                </pic:pic>
+              </a:graphicData>
+            </a:graphic>
+          </wp:inline>
+        </w:drawing>
+      </w:r>
+    </w:p>
+    <w:p>
+      <w:pPr>
+        <w:spacing w:after="160" w:before="60" w:line="240"/>
+        <w:jc w:val="left"/>
+      </w:pPr>
+      <w:r>
+        <w:rPr>
+          <w:rFonts w:ascii="Arial" w:cs="Arial" w:eastAsia="Arial" w:hAnsi="Arial"/>
+          <w:i/>
+          <w:iCs/>
+          <w:color w:val="4B5563"/>
+          <w:sz w:val="17"/>
+          <w:szCs w:val="17"/>
+        </w:rPr>
+        <w:t xml:space="preserve">Nota. </w:t>
+      </w:r>
+      <w:r>
+        <w:rPr>
+          <w:rFonts w:ascii="Arial" w:cs="Arial" w:eastAsia="Arial" w:hAnsi="Arial"/>
+          <w:color w:val="4B5563"/>
+          <w:sz w:val="17"/>
+          <w:szCs w:val="17"/>
+        </w:rPr>
+        <w:t xml:space="preserve">Captura del prototipo final. El técnico aplicó −1,0 punto por uso permanente del aire acondicionado; la cifra pasa a 18,7% y el ajuste queda en el registro con su motivo.</w:t>
       </w:r>
     </w:p>
     <w:p>
@@ -30247,7 +30651,7 @@
           <w:sz w:val="20"/>
           <w:szCs w:val="20"/>
         </w:rPr>
-        <w:t xml:space="preserve">Herramientas de IA utilizadas en el proyecto</w:t>
+        <w:t xml:space="preserve">Herramientas y modelos de IA utilizados en el proyecto</w:t>
       </w:r>
     </w:p>
     <w:tbl>
@@ -30263,10 +30667,10 @@
         </w:tblBorders>
       </w:tblPr>
       <w:tblGrid>
-        <w:gridCol w:w="1200"/>
+        <w:gridCol w:w="2500"/>
+        <w:gridCol w:w="2100"/>
         <w:gridCol w:w="2000"/>
-        <w:gridCol w:w="3080"/>
-        <w:gridCol w:w="3080"/>
+        <w:gridCol w:w="2760"/>
       </w:tblGrid>
       <w:tr>
         <w:trPr>
@@ -30274,7 +30678,7 @@
         </w:trPr>
         <w:tc>
           <w:tcPr>
-            <w:tcW w:type="dxa" w:w="1200"/>
+            <w:tcW w:type="dxa" w:w="2500"/>
             <w:tcBorders>
               <w:top w:val="single" w:color="C9D1DB" w:sz="4"/>
               <w:left w:val="single" w:color="C9D1DB" w:sz="4"/>
@@ -30301,16 +30705,16 @@
                 <w:b/>
                 <w:bCs/>
                 <w:color w:val="FFFFFF"/>
-                <w:sz w:val="17"/>
-                <w:szCs w:val="17"/>
-              </w:rPr>
-              <w:t xml:space="preserve">Etapa</w:t>
-            </w:r>
-          </w:p>
-        </w:tc>
-        <w:tc>
-          <w:tcPr>
-            <w:tcW w:type="dxa" w:w="2000"/>
+                <w:sz w:val="16"/>
+                <w:szCs w:val="16"/>
+              </w:rPr>
+              <w:t xml:space="preserve">Tarea</w:t>
+            </w:r>
+          </w:p>
+        </w:tc>
+        <w:tc>
+          <w:tcPr>
+            <w:tcW w:type="dxa" w:w="2100"/>
             <w:tcBorders>
               <w:top w:val="single" w:color="C9D1DB" w:sz="4"/>
               <w:left w:val="single" w:color="C9D1DB" w:sz="4"/>
@@ -30337,16 +30741,16 @@
                 <w:b/>
                 <w:bCs/>
                 <w:color w:val="FFFFFF"/>
-                <w:sz w:val="17"/>
-                <w:szCs w:val="17"/>
-              </w:rPr>
-              <w:t xml:space="preserve">Herramienta</w:t>
-            </w:r>
-          </w:p>
-        </w:tc>
-        <w:tc>
-          <w:tcPr>
-            <w:tcW w:type="dxa" w:w="3080"/>
+                <w:sz w:val="16"/>
+                <w:szCs w:val="16"/>
+              </w:rPr>
+              <w:t xml:space="preserve">Herramienta y plan</w:t>
+            </w:r>
+          </w:p>
+        </w:tc>
+        <w:tc>
+          <w:tcPr>
+            <w:tcW w:type="dxa" w:w="2000"/>
             <w:tcBorders>
               <w:top w:val="single" w:color="C9D1DB" w:sz="4"/>
               <w:left w:val="single" w:color="C9D1DB" w:sz="4"/>
@@ -30373,16 +30777,16 @@
                 <w:b/>
                 <w:bCs/>
                 <w:color w:val="FFFFFF"/>
-                <w:sz w:val="17"/>
-                <w:szCs w:val="17"/>
-              </w:rPr>
-              <w:t xml:space="preserve">Tarea</w:t>
-            </w:r>
-          </w:p>
-        </w:tc>
-        <w:tc>
-          <w:tcPr>
-            <w:tcW w:type="dxa" w:w="3080"/>
+                <w:sz w:val="16"/>
+                <w:szCs w:val="16"/>
+              </w:rPr>
+              <w:t xml:space="preserve">Versión</w:t>
+            </w:r>
+          </w:p>
+        </w:tc>
+        <w:tc>
+          <w:tcPr>
+            <w:tcW w:type="dxa" w:w="2760"/>
             <w:tcBorders>
               <w:top w:val="single" w:color="C9D1DB" w:sz="4"/>
               <w:left w:val="single" w:color="C9D1DB" w:sz="4"/>
@@ -30409,8 +30813,8 @@
                 <w:b/>
                 <w:bCs/>
                 <w:color w:val="FFFFFF"/>
-                <w:sz w:val="17"/>
-                <w:szCs w:val="17"/>
+                <w:sz w:val="16"/>
+                <w:szCs w:val="16"/>
               </w:rPr>
               <w:t xml:space="preserve">Verificación del equipo</w:t>
             </w:r>
@@ -30423,7 +30827,7 @@
         </w:trPr>
         <w:tc>
           <w:tcPr>
-            <w:tcW w:type="dxa" w:w="1200"/>
+            <w:tcW w:type="dxa" w:w="2500"/>
             <w:tcBorders>
               <w:top w:val="single" w:color="C9D1DB" w:sz="4"/>
               <w:left w:val="single" w:color="C9D1DB" w:sz="4"/>
@@ -30448,10 +30852,42 @@
                 <w:rFonts w:ascii="Arial" w:cs="Arial" w:eastAsia="Arial" w:hAnsi="Arial"/>
                 <w:b/>
                 <w:bCs/>
-                <w:sz w:val="17"/>
-                <w:szCs w:val="17"/>
-              </w:rPr>
-              <w:t xml:space="preserve">Entrega 1</w:t>
+                <w:sz w:val="16"/>
+                <w:szCs w:val="16"/>
+              </w:rPr>
+              <w:t xml:space="preserve">E1: investigación de mercado y entorno</w:t>
+            </w:r>
+          </w:p>
+        </w:tc>
+        <w:tc>
+          <w:tcPr>
+            <w:tcW w:type="dxa" w:w="2100"/>
+            <w:tcBorders>
+              <w:top w:val="single" w:color="C9D1DB" w:sz="4"/>
+              <w:left w:val="single" w:color="C9D1DB" w:sz="4"/>
+              <w:bottom w:val="single" w:color="C9D1DB" w:sz="4"/>
+              <w:right w:val="single" w:color="C9D1DB" w:sz="4"/>
+            </w:tcBorders>
+            <w:tcMar>
+              <w:top w:type="dxa" w:w="50"/>
+              <w:left w:type="dxa" w:w="80"/>
+              <w:bottom w:type="dxa" w:w="50"/>
+              <w:right w:type="dxa" w:w="80"/>
+            </w:tcMar>
+            <w:vAlign w:val="center"/>
+          </w:tcPr>
+          <w:p>
+            <w:pPr>
+              <w:spacing w:after="0" w:line="230"/>
+              <w:jc w:val="left"/>
+            </w:pPr>
+            <w:r>
+              <w:rPr>
+                <w:rFonts w:ascii="Arial" w:cs="Arial" w:eastAsia="Arial" w:hAnsi="Arial"/>
+                <w:sz w:val="16"/>
+                <w:szCs w:val="16"/>
+              </w:rPr>
+              <w:t xml:space="preserve">Gemini (premium), Claude (Pro) y Grok (gratuito)</w:t>
             </w:r>
           </w:p>
         </w:tc>
@@ -30480,72 +30916,40 @@
             <w:r>
               <w:rPr>
                 <w:rFonts w:ascii="Arial" w:cs="Arial" w:eastAsia="Arial" w:hAnsi="Arial"/>
-                <w:sz w:val="17"/>
-                <w:szCs w:val="17"/>
-              </w:rPr>
-              <w:t xml:space="preserve">Gemini, Claude y Grok</w:t>
-            </w:r>
-          </w:p>
-        </w:tc>
-        <w:tc>
-          <w:tcPr>
-            <w:tcW w:type="dxa" w:w="3080"/>
-            <w:tcBorders>
-              <w:top w:val="single" w:color="C9D1DB" w:sz="4"/>
-              <w:left w:val="single" w:color="C9D1DB" w:sz="4"/>
-              <w:bottom w:val="single" w:color="C9D1DB" w:sz="4"/>
-              <w:right w:val="single" w:color="C9D1DB" w:sz="4"/>
-            </w:tcBorders>
-            <w:tcMar>
-              <w:top w:type="dxa" w:w="50"/>
-              <w:left w:type="dxa" w:w="80"/>
-              <w:bottom w:type="dxa" w:w="50"/>
-              <w:right w:type="dxa" w:w="80"/>
-            </w:tcMar>
-            <w:vAlign w:val="center"/>
-          </w:tcPr>
-          <w:p>
-            <w:pPr>
-              <w:spacing w:after="0" w:line="230"/>
-              <w:jc w:val="left"/>
-            </w:pPr>
-            <w:r>
-              <w:rPr>
-                <w:rFonts w:ascii="Arial" w:cs="Arial" w:eastAsia="Arial" w:hAnsi="Arial"/>
-                <w:sz w:val="17"/>
-                <w:szCs w:val="17"/>
-              </w:rPr>
-              <w:t xml:space="preserve">Investigación de mercado y entorno</w:t>
-            </w:r>
-          </w:p>
-        </w:tc>
-        <w:tc>
-          <w:tcPr>
-            <w:tcW w:type="dxa" w:w="3080"/>
-            <w:tcBorders>
-              <w:top w:val="single" w:color="C9D1DB" w:sz="4"/>
-              <w:left w:val="single" w:color="C9D1DB" w:sz="4"/>
-              <w:bottom w:val="single" w:color="C9D1DB" w:sz="4"/>
-              <w:right w:val="single" w:color="C9D1DB" w:sz="4"/>
-            </w:tcBorders>
-            <w:tcMar>
-              <w:top w:type="dxa" w:w="50"/>
-              <w:left w:type="dxa" w:w="80"/>
-              <w:bottom w:type="dxa" w:w="50"/>
-              <w:right w:type="dxa" w:w="80"/>
-            </w:tcMar>
-            <w:vAlign w:val="center"/>
-          </w:tcPr>
-          <w:p>
-            <w:pPr>
-              <w:spacing w:after="0" w:line="230"/>
-              <w:jc w:val="left"/>
-            </w:pPr>
-            <w:r>
-              <w:rPr>
-                <w:rFonts w:ascii="Arial" w:cs="Arial" w:eastAsia="Arial" w:hAnsi="Arial"/>
-                <w:sz w:val="17"/>
-                <w:szCs w:val="17"/>
+                <w:sz w:val="16"/>
+                <w:szCs w:val="16"/>
+              </w:rPr>
+              <w:t xml:space="preserve">Vigentes en agosto y septiembre de 2026; no registradas</w:t>
+            </w:r>
+          </w:p>
+        </w:tc>
+        <w:tc>
+          <w:tcPr>
+            <w:tcW w:type="dxa" w:w="2760"/>
+            <w:tcBorders>
+              <w:top w:val="single" w:color="C9D1DB" w:sz="4"/>
+              <w:left w:val="single" w:color="C9D1DB" w:sz="4"/>
+              <w:bottom w:val="single" w:color="C9D1DB" w:sz="4"/>
+              <w:right w:val="single" w:color="C9D1DB" w:sz="4"/>
+            </w:tcBorders>
+            <w:tcMar>
+              <w:top w:type="dxa" w:w="50"/>
+              <w:left w:type="dxa" w:w="80"/>
+              <w:bottom w:type="dxa" w:w="50"/>
+              <w:right w:type="dxa" w:w="80"/>
+            </w:tcMar>
+            <w:vAlign w:val="center"/>
+          </w:tcPr>
+          <w:p>
+            <w:pPr>
+              <w:spacing w:after="0" w:line="230"/>
+              <w:jc w:val="left"/>
+            </w:pPr>
+            <w:r>
+              <w:rPr>
+                <w:rFonts w:ascii="Arial" w:cs="Arial" w:eastAsia="Arial" w:hAnsi="Arial"/>
+                <w:sz w:val="16"/>
+                <w:szCs w:val="16"/>
               </w:rPr>
               <w:t xml:space="preserve">Contraste con fuentes; afirmaciones no verificables retiradas en la Entrega 2</w:t>
             </w:r>
@@ -30558,7 +30962,7 @@
         </w:trPr>
         <w:tc>
           <w:tcPr>
-            <w:tcW w:type="dxa" w:w="1200"/>
+            <w:tcW w:type="dxa" w:w="2500"/>
             <w:tcBorders>
               <w:top w:val="single" w:color="C9D1DB" w:sz="4"/>
               <w:left w:val="single" w:color="C9D1DB" w:sz="4"/>
@@ -30584,10 +30988,43 @@
                 <w:rFonts w:ascii="Arial" w:cs="Arial" w:eastAsia="Arial" w:hAnsi="Arial"/>
                 <w:b/>
                 <w:bCs/>
-                <w:sz w:val="17"/>
-                <w:szCs w:val="17"/>
-              </w:rPr>
-              <w:t xml:space="preserve">Entregas 2 y 3</w:t>
+                <w:sz w:val="16"/>
+                <w:szCs w:val="16"/>
+              </w:rPr>
+              <w:t xml:space="preserve">E2 a E5: simulador, modelo, prototipo, validador, análisis e informes</w:t>
+            </w:r>
+          </w:p>
+        </w:tc>
+        <w:tc>
+          <w:tcPr>
+            <w:tcW w:type="dxa" w:w="2100"/>
+            <w:tcBorders>
+              <w:top w:val="single" w:color="C9D1DB" w:sz="4"/>
+              <w:left w:val="single" w:color="C9D1DB" w:sz="4"/>
+              <w:bottom w:val="single" w:color="C9D1DB" w:sz="4"/>
+              <w:right w:val="single" w:color="C9D1DB" w:sz="4"/>
+            </w:tcBorders>
+            <w:shd w:fill="F3F6FA" w:color="auto" w:val="clear"/>
+            <w:tcMar>
+              <w:top w:type="dxa" w:w="50"/>
+              <w:left w:type="dxa" w:w="80"/>
+              <w:bottom w:type="dxa" w:w="50"/>
+              <w:right w:type="dxa" w:w="80"/>
+            </w:tcMar>
+            <w:vAlign w:val="center"/>
+          </w:tcPr>
+          <w:p>
+            <w:pPr>
+              <w:spacing w:after="0" w:line="230"/>
+              <w:jc w:val="left"/>
+            </w:pPr>
+            <w:r>
+              <w:rPr>
+                <w:rFonts w:ascii="Arial" w:cs="Arial" w:eastAsia="Arial" w:hAnsi="Arial"/>
+                <w:sz w:val="16"/>
+                <w:szCs w:val="16"/>
+              </w:rPr>
+              <w:t xml:space="preserve">Claude Code (Pro)</w:t>
             </w:r>
           </w:p>
         </w:tc>
@@ -30617,16 +31054,16 @@
             <w:r>
               <w:rPr>
                 <w:rFonts w:ascii="Arial" w:cs="Arial" w:eastAsia="Arial" w:hAnsi="Arial"/>
-                <w:sz w:val="17"/>
-                <w:szCs w:val="17"/>
-              </w:rPr>
-              <w:t xml:space="preserve">Claude (con Claude Code)</w:t>
-            </w:r>
-          </w:p>
-        </w:tc>
-        <w:tc>
-          <w:tcPr>
-            <w:tcW w:type="dxa" w:w="3080"/>
+                <w:sz w:val="16"/>
+                <w:szCs w:val="16"/>
+              </w:rPr>
+              <w:t xml:space="preserve">Registrada en cada sesión</w:t>
+            </w:r>
+          </w:p>
+        </w:tc>
+        <w:tc>
+          <w:tcPr>
+            <w:tcW w:type="dxa" w:w="2760"/>
             <w:tcBorders>
               <w:top w:val="single" w:color="C9D1DB" w:sz="4"/>
               <w:left w:val="single" w:color="C9D1DB" w:sz="4"/>
@@ -30650,43 +31087,10 @@
             <w:r>
               <w:rPr>
                 <w:rFonts w:ascii="Arial" w:cs="Arial" w:eastAsia="Arial" w:hAnsi="Arial"/>
-                <w:sz w:val="17"/>
-                <w:szCs w:val="17"/>
-              </w:rPr>
-              <w:t xml:space="preserve">Programación del simulador, el modelo, el validador y la interfaz; figuras; redacción</w:t>
-            </w:r>
-          </w:p>
-        </w:tc>
-        <w:tc>
-          <w:tcPr>
-            <w:tcW w:type="dxa" w:w="3080"/>
-            <w:tcBorders>
-              <w:top w:val="single" w:color="C9D1DB" w:sz="4"/>
-              <w:left w:val="single" w:color="C9D1DB" w:sz="4"/>
-              <w:bottom w:val="single" w:color="C9D1DB" w:sz="4"/>
-              <w:right w:val="single" w:color="C9D1DB" w:sz="4"/>
-            </w:tcBorders>
-            <w:shd w:fill="F3F6FA" w:color="auto" w:val="clear"/>
-            <w:tcMar>
-              <w:top w:type="dxa" w:w="50"/>
-              <w:left w:type="dxa" w:w="80"/>
-              <w:bottom w:type="dxa" w:w="50"/>
-              <w:right w:type="dxa" w:w="80"/>
-            </w:tcMar>
-            <w:vAlign w:val="center"/>
-          </w:tcPr>
-          <w:p>
-            <w:pPr>
-              <w:spacing w:after="0" w:line="230"/>
-              <w:jc w:val="left"/>
-            </w:pPr>
-            <w:r>
-              <w:rPr>
-                <w:rFonts w:ascii="Arial" w:cs="Arial" w:eastAsia="Arial" w:hAnsi="Arial"/>
-                <w:sz w:val="17"/>
-                <w:szCs w:val="17"/>
-              </w:rPr>
-              <w:t xml:space="preserve">Código ejecutado y reproducible; cada cifra proviene de los archivos de resultados</w:t>
+                <w:sz w:val="16"/>
+                <w:szCs w:val="16"/>
+              </w:rPr>
+              <w:t xml:space="preserve">Código ejecutado; 15 commits; cada cifra sale de un script</w:t>
             </w:r>
           </w:p>
         </w:tc>
@@ -30697,7 +31101,7 @@
         </w:trPr>
         <w:tc>
           <w:tcPr>
-            <w:tcW w:type="dxa" w:w="1200"/>
+            <w:tcW w:type="dxa" w:w="2500"/>
             <w:tcBorders>
               <w:top w:val="single" w:color="C9D1DB" w:sz="4"/>
               <w:left w:val="single" w:color="C9D1DB" w:sz="4"/>
@@ -30722,10 +31126,42 @@
                 <w:rFonts w:ascii="Arial" w:cs="Arial" w:eastAsia="Arial" w:hAnsi="Arial"/>
                 <w:b/>
                 <w:bCs/>
-                <w:sz w:val="17"/>
-                <w:szCs w:val="17"/>
-              </w:rPr>
-              <w:t xml:space="preserve">Entrega 3</w:t>
+                <w:sz w:val="16"/>
+                <w:szCs w:val="16"/>
+              </w:rPr>
+              <w:t xml:space="preserve">E3: capa generativa del prototipo (48 salidas)</w:t>
+            </w:r>
+          </w:p>
+        </w:tc>
+        <w:tc>
+          <w:tcPr>
+            <w:tcW w:type="dxa" w:w="2100"/>
+            <w:tcBorders>
+              <w:top w:val="single" w:color="C9D1DB" w:sz="4"/>
+              <w:left w:val="single" w:color="C9D1DB" w:sz="4"/>
+              <w:bottom w:val="single" w:color="C9D1DB" w:sz="4"/>
+              <w:right w:val="single" w:color="C9D1DB" w:sz="4"/>
+            </w:tcBorders>
+            <w:tcMar>
+              <w:top w:type="dxa" w:w="50"/>
+              <w:left w:type="dxa" w:w="80"/>
+              <w:bottom w:type="dxa" w:w="50"/>
+              <w:right w:type="dxa" w:w="80"/>
+            </w:tcMar>
+            <w:vAlign w:val="center"/>
+          </w:tcPr>
+          <w:p>
+            <w:pPr>
+              <w:spacing w:after="0" w:line="230"/>
+              <w:jc w:val="left"/>
+            </w:pPr>
+            <w:r>
+              <w:rPr>
+                <w:rFonts w:ascii="Arial" w:cs="Arial" w:eastAsia="Arial" w:hAnsi="Arial"/>
+                <w:sz w:val="16"/>
+                <w:szCs w:val="16"/>
+              </w:rPr>
+              <w:t xml:space="preserve">API de Claude</w:t>
             </w:r>
           </w:p>
         </w:tc>
@@ -30754,72 +31190,40 @@
             <w:r>
               <w:rPr>
                 <w:rFonts w:ascii="Arial" w:cs="Arial" w:eastAsia="Arial" w:hAnsi="Arial"/>
-                <w:sz w:val="17"/>
-                <w:szCs w:val="17"/>
-              </w:rPr>
-              <w:t xml:space="preserve">Claude</w:t>
-            </w:r>
-          </w:p>
-        </w:tc>
-        <w:tc>
-          <w:tcPr>
-            <w:tcW w:type="dxa" w:w="3080"/>
-            <w:tcBorders>
-              <w:top w:val="single" w:color="C9D1DB" w:sz="4"/>
-              <w:left w:val="single" w:color="C9D1DB" w:sz="4"/>
-              <w:bottom w:val="single" w:color="C9D1DB" w:sz="4"/>
-              <w:right w:val="single" w:color="C9D1DB" w:sz="4"/>
-            </w:tcBorders>
-            <w:tcMar>
-              <w:top w:type="dxa" w:w="50"/>
-              <w:left w:type="dxa" w:w="80"/>
-              <w:bottom w:type="dxa" w:w="50"/>
-              <w:right w:type="dxa" w:w="80"/>
-            </w:tcMar>
-            <w:vAlign w:val="center"/>
-          </w:tcPr>
-          <w:p>
-            <w:pPr>
-              <w:spacing w:after="0" w:line="230"/>
-              <w:jc w:val="left"/>
-            </w:pPr>
-            <w:r>
-              <w:rPr>
-                <w:rFonts w:ascii="Arial" w:cs="Arial" w:eastAsia="Arial" w:hAnsi="Arial"/>
-                <w:sz w:val="17"/>
-                <w:szCs w:val="17"/>
-              </w:rPr>
-              <w:t xml:space="preserve">Capa generativa del prototipo (48 salidas)</w:t>
-            </w:r>
-          </w:p>
-        </w:tc>
-        <w:tc>
-          <w:tcPr>
-            <w:tcW w:type="dxa" w:w="3080"/>
-            <w:tcBorders>
-              <w:top w:val="single" w:color="C9D1DB" w:sz="4"/>
-              <w:left w:val="single" w:color="C9D1DB" w:sz="4"/>
-              <w:bottom w:val="single" w:color="C9D1DB" w:sz="4"/>
-              <w:right w:val="single" w:color="C9D1DB" w:sz="4"/>
-            </w:tcBorders>
-            <w:tcMar>
-              <w:top w:type="dxa" w:w="50"/>
-              <w:left w:type="dxa" w:w="80"/>
-              <w:bottom w:type="dxa" w:w="50"/>
-              <w:right w:type="dxa" w:w="80"/>
-            </w:tcMar>
-            <w:vAlign w:val="center"/>
-          </w:tcPr>
-          <w:p>
-            <w:pPr>
-              <w:spacing w:after="0" w:line="230"/>
-              <w:jc w:val="left"/>
-            </w:pPr>
-            <w:r>
-              <w:rPr>
-                <w:rFonts w:ascii="Arial" w:cs="Arial" w:eastAsia="Arial" w:hAnsi="Arial"/>
-                <w:sz w:val="17"/>
-                <w:szCs w:val="17"/>
+                <w:sz w:val="16"/>
+                <w:szCs w:val="16"/>
+              </w:rPr>
+              <w:t xml:space="preserve">Registrada en generador.py</w:t>
+            </w:r>
+          </w:p>
+        </w:tc>
+        <w:tc>
+          <w:tcPr>
+            <w:tcW w:type="dxa" w:w="2760"/>
+            <w:tcBorders>
+              <w:top w:val="single" w:color="C9D1DB" w:sz="4"/>
+              <w:left w:val="single" w:color="C9D1DB" w:sz="4"/>
+              <w:bottom w:val="single" w:color="C9D1DB" w:sz="4"/>
+              <w:right w:val="single" w:color="C9D1DB" w:sz="4"/>
+            </w:tcBorders>
+            <w:tcMar>
+              <w:top w:type="dxa" w:w="50"/>
+              <w:left w:type="dxa" w:w="80"/>
+              <w:bottom w:type="dxa" w:w="50"/>
+              <w:right w:type="dxa" w:w="80"/>
+            </w:tcMar>
+            <w:vAlign w:val="center"/>
+          </w:tcPr>
+          <w:p>
+            <w:pPr>
+              <w:spacing w:after="0" w:line="230"/>
+              <w:jc w:val="left"/>
+            </w:pPr>
+            <w:r>
+              <w:rPr>
+                <w:rFonts w:ascii="Arial" w:cs="Arial" w:eastAsia="Arial" w:hAnsi="Arial"/>
+                <w:sz w:val="16"/>
+                <w:szCs w:val="16"/>
               </w:rPr>
               <w:t xml:space="preserve">Validador de nueve criterios y revisión de cada falla</w:t>
             </w:r>
@@ -30832,7 +31236,7 @@
         </w:trPr>
         <w:tc>
           <w:tcPr>
-            <w:tcW w:type="dxa" w:w="1200"/>
+            <w:tcW w:type="dxa" w:w="2500"/>
             <w:tcBorders>
               <w:top w:val="single" w:color="C9D1DB" w:sz="4"/>
               <w:left w:val="single" w:color="C9D1DB" w:sz="4"/>
@@ -30858,10 +31262,43 @@
                 <w:rFonts w:ascii="Arial" w:cs="Arial" w:eastAsia="Arial" w:hAnsi="Arial"/>
                 <w:b/>
                 <w:bCs/>
-                <w:sz w:val="17"/>
-                <w:szCs w:val="17"/>
-              </w:rPr>
-              <w:t xml:space="preserve">Final</w:t>
+                <w:sz w:val="16"/>
+                <w:szCs w:val="16"/>
+              </w:rPr>
+              <w:t xml:space="preserve">Verificación manual de tres cálculos</w:t>
+            </w:r>
+          </w:p>
+        </w:tc>
+        <w:tc>
+          <w:tcPr>
+            <w:tcW w:type="dxa" w:w="2100"/>
+            <w:tcBorders>
+              <w:top w:val="single" w:color="C9D1DB" w:sz="4"/>
+              <w:left w:val="single" w:color="C9D1DB" w:sz="4"/>
+              <w:bottom w:val="single" w:color="C9D1DB" w:sz="4"/>
+              <w:right w:val="single" w:color="C9D1DB" w:sz="4"/>
+            </w:tcBorders>
+            <w:shd w:fill="F3F6FA" w:color="auto" w:val="clear"/>
+            <w:tcMar>
+              <w:top w:type="dxa" w:w="50"/>
+              <w:left w:type="dxa" w:w="80"/>
+              <w:bottom w:type="dxa" w:w="50"/>
+              <w:right w:type="dxa" w:w="80"/>
+            </w:tcMar>
+            <w:vAlign w:val="center"/>
+          </w:tcPr>
+          <w:p>
+            <w:pPr>
+              <w:spacing w:after="0" w:line="230"/>
+              <w:jc w:val="left"/>
+            </w:pPr>
+            <w:r>
+              <w:rPr>
+                <w:rFonts w:ascii="Arial" w:cs="Arial" w:eastAsia="Arial" w:hAnsi="Arial"/>
+                <w:sz w:val="16"/>
+                <w:szCs w:val="16"/>
+              </w:rPr>
+              <w:t xml:space="preserve">Gemini (premium)</w:t>
             </w:r>
           </w:p>
         </w:tc>
@@ -30891,16 +31328,16 @@
             <w:r>
               <w:rPr>
                 <w:rFonts w:ascii="Arial" w:cs="Arial" w:eastAsia="Arial" w:hAnsi="Arial"/>
-                <w:sz w:val="17"/>
-                <w:szCs w:val="17"/>
-              </w:rPr>
-              <w:t xml:space="preserve">Gemini, ChatGPT y DeepSeek</w:t>
-            </w:r>
-          </w:p>
-        </w:tc>
-        <w:tc>
-          <w:tcPr>
-            <w:tcW w:type="dxa" w:w="3080"/>
+                <w:sz w:val="16"/>
+                <w:szCs w:val="16"/>
+              </w:rPr>
+              <w:t xml:space="preserve">3.1 Pro o 4 Argon; no registrada</w:t>
+            </w:r>
+          </w:p>
+        </w:tc>
+        <w:tc>
+          <w:tcPr>
+            <w:tcW w:type="dxa" w:w="2760"/>
             <w:tcBorders>
               <w:top w:val="single" w:color="C9D1DB" w:sz="4"/>
               <w:left w:val="single" w:color="C9D1DB" w:sz="4"/>
@@ -30924,43 +31361,10 @@
             <w:r>
               <w:rPr>
                 <w:rFonts w:ascii="Arial" w:cs="Arial" w:eastAsia="Arial" w:hAnsi="Arial"/>
-                <w:sz w:val="17"/>
-                <w:szCs w:val="17"/>
-              </w:rPr>
-              <w:t xml:space="preserve">Auditoría de cálculos, código y validación</w:t>
-            </w:r>
-          </w:p>
-        </w:tc>
-        <w:tc>
-          <w:tcPr>
-            <w:tcW w:type="dxa" w:w="3080"/>
-            <w:tcBorders>
-              <w:top w:val="single" w:color="C9D1DB" w:sz="4"/>
-              <w:left w:val="single" w:color="C9D1DB" w:sz="4"/>
-              <w:bottom w:val="single" w:color="C9D1DB" w:sz="4"/>
-              <w:right w:val="single" w:color="C9D1DB" w:sz="4"/>
-            </w:tcBorders>
-            <w:shd w:fill="F3F6FA" w:color="auto" w:val="clear"/>
-            <w:tcMar>
-              <w:top w:type="dxa" w:w="50"/>
-              <w:left w:type="dxa" w:w="80"/>
-              <w:bottom w:type="dxa" w:w="50"/>
-              <w:right w:type="dxa" w:w="80"/>
-            </w:tcMar>
-            <w:vAlign w:val="center"/>
-          </w:tcPr>
-          <w:p>
-            <w:pPr>
-              <w:spacing w:after="0" w:line="230"/>
-              <w:jc w:val="left"/>
-            </w:pPr>
-            <w:r>
-              <w:rPr>
-                <w:rFonts w:ascii="Arial" w:cs="Arial" w:eastAsia="Arial" w:hAnsi="Arial"/>
-                <w:sz w:val="17"/>
-                <w:szCs w:val="17"/>
-              </w:rPr>
-              <w:t xml:space="preserve">Hallazgos contrastados con el código; dos defectos corregidos</w:t>
+                <w:sz w:val="16"/>
+                <w:szCs w:val="16"/>
+              </w:rPr>
+              <w:t xml:space="preserve">Coincidencia con el informe técnico</w:t>
             </w:r>
           </w:p>
         </w:tc>
@@ -30971,7 +31375,7 @@
         </w:trPr>
         <w:tc>
           <w:tcPr>
-            <w:tcW w:type="dxa" w:w="1200"/>
+            <w:tcW w:type="dxa" w:w="2500"/>
             <w:tcBorders>
               <w:top w:val="single" w:color="C9D1DB" w:sz="4"/>
               <w:left w:val="single" w:color="C9D1DB" w:sz="4"/>
@@ -30996,10 +31400,42 @@
                 <w:rFonts w:ascii="Arial" w:cs="Arial" w:eastAsia="Arial" w:hAnsi="Arial"/>
                 <w:b/>
                 <w:bCs/>
-                <w:sz w:val="17"/>
-                <w:szCs w:val="17"/>
-              </w:rPr>
-              <w:t xml:space="preserve">Final</w:t>
+                <w:sz w:val="16"/>
+                <w:szCs w:val="16"/>
+              </w:rPr>
+              <w:t xml:space="preserve">Revisión de código</w:t>
+            </w:r>
+          </w:p>
+        </w:tc>
+        <w:tc>
+          <w:tcPr>
+            <w:tcW w:type="dxa" w:w="2100"/>
+            <w:tcBorders>
+              <w:top w:val="single" w:color="C9D1DB" w:sz="4"/>
+              <w:left w:val="single" w:color="C9D1DB" w:sz="4"/>
+              <w:bottom w:val="single" w:color="C9D1DB" w:sz="4"/>
+              <w:right w:val="single" w:color="C9D1DB" w:sz="4"/>
+            </w:tcBorders>
+            <w:tcMar>
+              <w:top w:type="dxa" w:w="50"/>
+              <w:left w:type="dxa" w:w="80"/>
+              <w:bottom w:type="dxa" w:w="50"/>
+              <w:right w:type="dxa" w:w="80"/>
+            </w:tcMar>
+            <w:vAlign w:val="center"/>
+          </w:tcPr>
+          <w:p>
+            <w:pPr>
+              <w:spacing w:after="0" w:line="230"/>
+              <w:jc w:val="left"/>
+            </w:pPr>
+            <w:r>
+              <w:rPr>
+                <w:rFonts w:ascii="Arial" w:cs="Arial" w:eastAsia="Arial" w:hAnsi="Arial"/>
+                <w:sz w:val="16"/>
+                <w:szCs w:val="16"/>
+              </w:rPr>
+              <w:t xml:space="preserve">ChatGPT (premium)</w:t>
             </w:r>
           </w:p>
         </w:tc>
@@ -31028,74 +31464,42 @@
             <w:r>
               <w:rPr>
                 <w:rFonts w:ascii="Arial" w:cs="Arial" w:eastAsia="Arial" w:hAnsi="Arial"/>
-                <w:sz w:val="17"/>
-                <w:szCs w:val="17"/>
-              </w:rPr>
-              <w:t xml:space="preserve">Grok y ChatGPT</w:t>
-            </w:r>
-          </w:p>
-        </w:tc>
-        <w:tc>
-          <w:tcPr>
-            <w:tcW w:type="dxa" w:w="3080"/>
-            <w:tcBorders>
-              <w:top w:val="single" w:color="C9D1DB" w:sz="4"/>
-              <w:left w:val="single" w:color="C9D1DB" w:sz="4"/>
-              <w:bottom w:val="single" w:color="C9D1DB" w:sz="4"/>
-              <w:right w:val="single" w:color="C9D1DB" w:sz="4"/>
-            </w:tcBorders>
-            <w:tcMar>
-              <w:top w:type="dxa" w:w="50"/>
-              <w:left w:type="dxa" w:w="80"/>
-              <w:bottom w:type="dxa" w:w="50"/>
-              <w:right w:type="dxa" w:w="80"/>
-            </w:tcMar>
-            <w:vAlign w:val="center"/>
-          </w:tcPr>
-          <w:p>
-            <w:pPr>
-              <w:spacing w:after="0" w:line="230"/>
-              <w:jc w:val="left"/>
-            </w:pPr>
-            <w:r>
-              <w:rPr>
-                <w:rFonts w:ascii="Arial" w:cs="Arial" w:eastAsia="Arial" w:hAnsi="Arial"/>
-                <w:sz w:val="17"/>
-                <w:szCs w:val="17"/>
-              </w:rPr>
-              <w:t xml:space="preserve">Ataques adversariales y respuestas con v3.1</w:t>
-            </w:r>
-          </w:p>
-        </w:tc>
-        <w:tc>
-          <w:tcPr>
-            <w:tcW w:type="dxa" w:w="3080"/>
-            <w:tcBorders>
-              <w:top w:val="single" w:color="C9D1DB" w:sz="4"/>
-              <w:left w:val="single" w:color="C9D1DB" w:sz="4"/>
-              <w:bottom w:val="single" w:color="C9D1DB" w:sz="4"/>
-              <w:right w:val="single" w:color="C9D1DB" w:sz="4"/>
-            </w:tcBorders>
-            <w:tcMar>
-              <w:top w:type="dxa" w:w="50"/>
-              <w:left w:type="dxa" w:w="80"/>
-              <w:bottom w:type="dxa" w:w="50"/>
-              <w:right w:type="dxa" w:w="80"/>
-            </w:tcMar>
-            <w:vAlign w:val="center"/>
-          </w:tcPr>
-          <w:p>
-            <w:pPr>
-              <w:spacing w:after="0" w:line="230"/>
-              <w:jc w:val="left"/>
-            </w:pPr>
-            <w:r>
-              <w:rPr>
-                <w:rFonts w:ascii="Arial" w:cs="Arial" w:eastAsia="Arial" w:hAnsi="Arial"/>
-                <w:sz w:val="17"/>
-                <w:szCs w:val="17"/>
-              </w:rPr>
-              <w:t xml:space="preserve">Validador más revisión humana de cada respuesta</w:t>
+                <w:sz w:val="16"/>
+                <w:szCs w:val="16"/>
+              </w:rPr>
+              <w:t xml:space="preserve">6.1 Sol o Astra 6 Max; no registrada</w:t>
+            </w:r>
+          </w:p>
+        </w:tc>
+        <w:tc>
+          <w:tcPr>
+            <w:tcW w:type="dxa" w:w="2760"/>
+            <w:tcBorders>
+              <w:top w:val="single" w:color="C9D1DB" w:sz="4"/>
+              <w:left w:val="single" w:color="C9D1DB" w:sz="4"/>
+              <w:bottom w:val="single" w:color="C9D1DB" w:sz="4"/>
+              <w:right w:val="single" w:color="C9D1DB" w:sz="4"/>
+            </w:tcBorders>
+            <w:tcMar>
+              <w:top w:type="dxa" w:w="50"/>
+              <w:left w:type="dxa" w:w="80"/>
+              <w:bottom w:type="dxa" w:w="50"/>
+              <w:right w:type="dxa" w:w="80"/>
+            </w:tcMar>
+            <w:vAlign w:val="center"/>
+          </w:tcPr>
+          <w:p>
+            <w:pPr>
+              <w:spacing w:after="0" w:line="230"/>
+              <w:jc w:val="left"/>
+            </w:pPr>
+            <w:r>
+              <w:rPr>
+                <w:rFonts w:ascii="Arial" w:cs="Arial" w:eastAsia="Arial" w:hAnsi="Arial"/>
+                <w:sz w:val="16"/>
+                <w:szCs w:val="16"/>
+              </w:rPr>
+              <w:t xml:space="preserve">Dos hallazgos correctos corregidos; exageraciones descartadas</w:t>
             </w:r>
           </w:p>
         </w:tc>
@@ -31106,7 +31510,7 @@
         </w:trPr>
         <w:tc>
           <w:tcPr>
-            <w:tcW w:type="dxa" w:w="1200"/>
+            <w:tcW w:type="dxa" w:w="2500"/>
             <w:tcBorders>
               <w:top w:val="single" w:color="C9D1DB" w:sz="4"/>
               <w:left w:val="single" w:color="C9D1DB" w:sz="4"/>
@@ -31132,10 +31536,43 @@
                 <w:rFonts w:ascii="Arial" w:cs="Arial" w:eastAsia="Arial" w:hAnsi="Arial"/>
                 <w:b/>
                 <w:bCs/>
-                <w:sz w:val="17"/>
-                <w:szCs w:val="17"/>
-              </w:rPr>
-              <w:t xml:space="preserve">Final</w:t>
+                <w:sz w:val="16"/>
+                <w:szCs w:val="16"/>
+              </w:rPr>
+              <w:t xml:space="preserve">Auditoría del diseño de validación</w:t>
+            </w:r>
+          </w:p>
+        </w:tc>
+        <w:tc>
+          <w:tcPr>
+            <w:tcW w:type="dxa" w:w="2100"/>
+            <w:tcBorders>
+              <w:top w:val="single" w:color="C9D1DB" w:sz="4"/>
+              <w:left w:val="single" w:color="C9D1DB" w:sz="4"/>
+              <w:bottom w:val="single" w:color="C9D1DB" w:sz="4"/>
+              <w:right w:val="single" w:color="C9D1DB" w:sz="4"/>
+            </w:tcBorders>
+            <w:shd w:fill="F3F6FA" w:color="auto" w:val="clear"/>
+            <w:tcMar>
+              <w:top w:type="dxa" w:w="50"/>
+              <w:left w:type="dxa" w:w="80"/>
+              <w:bottom w:type="dxa" w:w="50"/>
+              <w:right w:type="dxa" w:w="80"/>
+            </w:tcMar>
+            <w:vAlign w:val="center"/>
+          </w:tcPr>
+          <w:p>
+            <w:pPr>
+              <w:spacing w:after="0" w:line="230"/>
+              <w:jc w:val="left"/>
+            </w:pPr>
+            <w:r>
+              <w:rPr>
+                <w:rFonts w:ascii="Arial" w:cs="Arial" w:eastAsia="Arial" w:hAnsi="Arial"/>
+                <w:sz w:val="16"/>
+                <w:szCs w:val="16"/>
+              </w:rPr>
+              <w:t xml:space="preserve">DeepSeek</w:t>
             </w:r>
           </w:p>
         </w:tc>
@@ -31165,16 +31602,16 @@
             <w:r>
               <w:rPr>
                 <w:rFonts w:ascii="Arial" w:cs="Arial" w:eastAsia="Arial" w:hAnsi="Arial"/>
-                <w:sz w:val="17"/>
-                <w:szCs w:val="17"/>
-              </w:rPr>
-              <w:t xml:space="preserve">Canva IA</w:t>
-            </w:r>
-          </w:p>
-        </w:tc>
-        <w:tc>
-          <w:tcPr>
-            <w:tcW w:type="dxa" w:w="3080"/>
+                <w:sz w:val="16"/>
+                <w:szCs w:val="16"/>
+              </w:rPr>
+              <w:t xml:space="preserve">Vigente en octubre de 2026; no registrada</w:t>
+            </w:r>
+          </w:p>
+        </w:tc>
+        <w:tc>
+          <w:tcPr>
+            <w:tcW w:type="dxa" w:w="2760"/>
             <w:tcBorders>
               <w:top w:val="single" w:color="C9D1DB" w:sz="4"/>
               <w:left w:val="single" w:color="C9D1DB" w:sz="4"/>
@@ -31198,43 +31635,10 @@
             <w:r>
               <w:rPr>
                 <w:rFonts w:ascii="Arial" w:cs="Arial" w:eastAsia="Arial" w:hAnsi="Arial"/>
-                <w:sz w:val="17"/>
-                <w:szCs w:val="17"/>
-              </w:rPr>
-              <w:t xml:space="preserve">Infografía para la presentación</w:t>
-            </w:r>
-          </w:p>
-        </w:tc>
-        <w:tc>
-          <w:tcPr>
-            <w:tcW w:type="dxa" w:w="3080"/>
-            <w:tcBorders>
-              <w:top w:val="single" w:color="C9D1DB" w:sz="4"/>
-              <w:left w:val="single" w:color="C9D1DB" w:sz="4"/>
-              <w:bottom w:val="single" w:color="C9D1DB" w:sz="4"/>
-              <w:right w:val="single" w:color="C9D1DB" w:sz="4"/>
-            </w:tcBorders>
-            <w:shd w:fill="F3F6FA" w:color="auto" w:val="clear"/>
-            <w:tcMar>
-              <w:top w:type="dxa" w:w="50"/>
-              <w:left w:type="dxa" w:w="80"/>
-              <w:bottom w:type="dxa" w:w="50"/>
-              <w:right w:type="dxa" w:w="80"/>
-            </w:tcMar>
-            <w:vAlign w:val="center"/>
-          </w:tcPr>
-          <w:p>
-            <w:pPr>
-              <w:spacing w:after="0" w:line="230"/>
-              <w:jc w:val="left"/>
-            </w:pPr>
-            <w:r>
-              <w:rPr>
-                <w:rFonts w:ascii="Arial" w:cs="Arial" w:eastAsia="Arial" w:hAnsi="Arial"/>
-                <w:sz w:val="17"/>
-                <w:szCs w:val="17"/>
-              </w:rPr>
-              <w:t xml:space="preserve">Errores corregidos antes de usarla</w:t>
+                <w:sz w:val="16"/>
+                <w:szCs w:val="16"/>
+              </w:rPr>
+              <w:t xml:space="preserve">Seis pruebas implementadas en mejoras_e4.py</w:t>
             </w:r>
           </w:p>
         </w:tc>
@@ -31245,7 +31649,7 @@
         </w:trPr>
         <w:tc>
           <w:tcPr>
-            <w:tcW w:type="dxa" w:w="1200"/>
+            <w:tcW w:type="dxa" w:w="2500"/>
             <w:tcBorders>
               <w:top w:val="single" w:color="C9D1DB" w:sz="4"/>
               <w:left w:val="single" w:color="C9D1DB" w:sz="4"/>
@@ -31270,10 +31674,42 @@
                 <w:rFonts w:ascii="Arial" w:cs="Arial" w:eastAsia="Arial" w:hAnsi="Arial"/>
                 <w:b/>
                 <w:bCs/>
-                <w:sz w:val="17"/>
-                <w:szCs w:val="17"/>
-              </w:rPr>
-              <w:t xml:space="preserve">Final</w:t>
+                <w:sz w:val="16"/>
+                <w:szCs w:val="16"/>
+              </w:rPr>
+              <w:t xml:space="preserve">10 ataques adversariales</w:t>
+            </w:r>
+          </w:p>
+        </w:tc>
+        <w:tc>
+          <w:tcPr>
+            <w:tcW w:type="dxa" w:w="2100"/>
+            <w:tcBorders>
+              <w:top w:val="single" w:color="C9D1DB" w:sz="4"/>
+              <w:left w:val="single" w:color="C9D1DB" w:sz="4"/>
+              <w:bottom w:val="single" w:color="C9D1DB" w:sz="4"/>
+              <w:right w:val="single" w:color="C9D1DB" w:sz="4"/>
+            </w:tcBorders>
+            <w:tcMar>
+              <w:top w:type="dxa" w:w="50"/>
+              <w:left w:type="dxa" w:w="80"/>
+              <w:bottom w:type="dxa" w:w="50"/>
+              <w:right w:type="dxa" w:w="80"/>
+            </w:tcMar>
+            <w:vAlign w:val="center"/>
+          </w:tcPr>
+          <w:p>
+            <w:pPr>
+              <w:spacing w:after="0" w:line="230"/>
+              <w:jc w:val="left"/>
+            </w:pPr>
+            <w:r>
+              <w:rPr>
+                <w:rFonts w:ascii="Arial" w:cs="Arial" w:eastAsia="Arial" w:hAnsi="Arial"/>
+                <w:sz w:val="16"/>
+                <w:szCs w:val="16"/>
+              </w:rPr>
+              <w:t xml:space="preserve">Grok (gratuito)</w:t>
             </w:r>
           </w:p>
         </w:tc>
@@ -31302,74 +31738,455 @@
             <w:r>
               <w:rPr>
                 <w:rFonts w:ascii="Arial" w:cs="Arial" w:eastAsia="Arial" w:hAnsi="Arial"/>
-                <w:sz w:val="17"/>
-                <w:szCs w:val="17"/>
-              </w:rPr>
-              <w:t xml:space="preserve">Claude (con Claude Code)</w:t>
-            </w:r>
-          </w:p>
-        </w:tc>
-        <w:tc>
-          <w:tcPr>
-            <w:tcW w:type="dxa" w:w="3080"/>
-            <w:tcBorders>
-              <w:top w:val="single" w:color="C9D1DB" w:sz="4"/>
-              <w:left w:val="single" w:color="C9D1DB" w:sz="4"/>
-              <w:bottom w:val="single" w:color="C9D1DB" w:sz="4"/>
-              <w:right w:val="single" w:color="C9D1DB" w:sz="4"/>
-            </w:tcBorders>
-            <w:tcMar>
-              <w:top w:type="dxa" w:w="50"/>
-              <w:left w:type="dxa" w:w="80"/>
-              <w:bottom w:type="dxa" w:w="50"/>
-              <w:right w:type="dxa" w:w="80"/>
-            </w:tcMar>
-            <w:vAlign w:val="center"/>
-          </w:tcPr>
-          <w:p>
-            <w:pPr>
-              <w:spacing w:after="0" w:line="230"/>
-              <w:jc w:val="left"/>
-            </w:pPr>
-            <w:r>
-              <w:rPr>
-                <w:rFonts w:ascii="Arial" w:cs="Arial" w:eastAsia="Arial" w:hAnsi="Arial"/>
-                <w:sz w:val="17"/>
-                <w:szCs w:val="17"/>
-              </w:rPr>
-              <w:t xml:space="preserve">Análisis final, figuras y redacción de este informe</w:t>
-            </w:r>
-          </w:p>
-        </w:tc>
-        <w:tc>
-          <w:tcPr>
-            <w:tcW w:type="dxa" w:w="3080"/>
-            <w:tcBorders>
-              <w:top w:val="single" w:color="C9D1DB" w:sz="4"/>
-              <w:left w:val="single" w:color="C9D1DB" w:sz="4"/>
-              <w:bottom w:val="single" w:color="C9D1DB" w:sz="4"/>
-              <w:right w:val="single" w:color="C9D1DB" w:sz="4"/>
-            </w:tcBorders>
-            <w:tcMar>
-              <w:top w:type="dxa" w:w="50"/>
-              <w:left w:type="dxa" w:w="80"/>
-              <w:bottom w:type="dxa" w:w="50"/>
-              <w:right w:type="dxa" w:w="80"/>
-            </w:tcMar>
-            <w:vAlign w:val="center"/>
-          </w:tcPr>
-          <w:p>
-            <w:pPr>
-              <w:spacing w:after="0" w:line="230"/>
-              <w:jc w:val="left"/>
-            </w:pPr>
-            <w:r>
-              <w:rPr>
-                <w:rFonts w:ascii="Arial" w:cs="Arial" w:eastAsia="Arial" w:hAnsi="Arial"/>
-                <w:sz w:val="17"/>
-                <w:szCs w:val="17"/>
-              </w:rPr>
-              <w:t xml:space="preserve">Cifras regenerables con mejoras_e4.py y analisis_final.py; referencias revisadas</w:t>
+                <w:sz w:val="16"/>
+                <w:szCs w:val="16"/>
+              </w:rPr>
+              <w:t xml:space="preserve">Vigente en octubre de 2026; no registrada</w:t>
+            </w:r>
+          </w:p>
+        </w:tc>
+        <w:tc>
+          <w:tcPr>
+            <w:tcW w:type="dxa" w:w="2760"/>
+            <w:tcBorders>
+              <w:top w:val="single" w:color="C9D1DB" w:sz="4"/>
+              <w:left w:val="single" w:color="C9D1DB" w:sz="4"/>
+              <w:bottom w:val="single" w:color="C9D1DB" w:sz="4"/>
+              <w:right w:val="single" w:color="C9D1DB" w:sz="4"/>
+            </w:tcBorders>
+            <w:tcMar>
+              <w:top w:type="dxa" w:w="50"/>
+              <w:left w:type="dxa" w:w="80"/>
+              <w:bottom w:type="dxa" w:w="50"/>
+              <w:right w:type="dxa" w:w="80"/>
+            </w:tcMar>
+            <w:vAlign w:val="center"/>
+          </w:tcPr>
+          <w:p>
+            <w:pPr>
+              <w:spacing w:after="0" w:line="230"/>
+              <w:jc w:val="left"/>
+            </w:pPr>
+            <w:r>
+              <w:rPr>
+                <w:rFonts w:ascii="Arial" w:cs="Arial" w:eastAsia="Arial" w:hAnsi="Arial"/>
+                <w:sz w:val="16"/>
+                <w:szCs w:val="16"/>
+              </w:rPr>
+              <w:t xml:space="preserve">Dos notas ajustadas al contexto chileno</w:t>
+            </w:r>
+          </w:p>
+        </w:tc>
+      </w:tr>
+      <w:tr>
+        <w:trPr>
+          <w:cantSplit/>
+        </w:trPr>
+        <w:tc>
+          <w:tcPr>
+            <w:tcW w:type="dxa" w:w="2500"/>
+            <w:tcBorders>
+              <w:top w:val="single" w:color="C9D1DB" w:sz="4"/>
+              <w:left w:val="single" w:color="C9D1DB" w:sz="4"/>
+              <w:bottom w:val="single" w:color="C9D1DB" w:sz="4"/>
+              <w:right w:val="single" w:color="C9D1DB" w:sz="4"/>
+            </w:tcBorders>
+            <w:shd w:fill="F3F6FA" w:color="auto" w:val="clear"/>
+            <w:tcMar>
+              <w:top w:type="dxa" w:w="50"/>
+              <w:left w:type="dxa" w:w="80"/>
+              <w:bottom w:type="dxa" w:w="50"/>
+              <w:right w:type="dxa" w:w="80"/>
+            </w:tcMar>
+            <w:vAlign w:val="center"/>
+          </w:tcPr>
+          <w:p>
+            <w:pPr>
+              <w:spacing w:after="0" w:line="230"/>
+              <w:jc w:val="left"/>
+            </w:pPr>
+            <w:r>
+              <w:rPr>
+                <w:rFonts w:ascii="Arial" w:cs="Arial" w:eastAsia="Arial" w:hAnsi="Arial"/>
+                <w:b/>
+                <w:bCs/>
+                <w:sz w:val="16"/>
+                <w:szCs w:val="16"/>
+              </w:rPr>
+              <w:t xml:space="preserve">Respuestas a los ataques</w:t>
+            </w:r>
+          </w:p>
+        </w:tc>
+        <w:tc>
+          <w:tcPr>
+            <w:tcW w:type="dxa" w:w="2100"/>
+            <w:tcBorders>
+              <w:top w:val="single" w:color="C9D1DB" w:sz="4"/>
+              <w:left w:val="single" w:color="C9D1DB" w:sz="4"/>
+              <w:bottom w:val="single" w:color="C9D1DB" w:sz="4"/>
+              <w:right w:val="single" w:color="C9D1DB" w:sz="4"/>
+            </w:tcBorders>
+            <w:shd w:fill="F3F6FA" w:color="auto" w:val="clear"/>
+            <w:tcMar>
+              <w:top w:type="dxa" w:w="50"/>
+              <w:left w:type="dxa" w:w="80"/>
+              <w:bottom w:type="dxa" w:w="50"/>
+              <w:right w:type="dxa" w:w="80"/>
+            </w:tcMar>
+            <w:vAlign w:val="center"/>
+          </w:tcPr>
+          <w:p>
+            <w:pPr>
+              <w:spacing w:after="0" w:line="230"/>
+              <w:jc w:val="left"/>
+            </w:pPr>
+            <w:r>
+              <w:rPr>
+                <w:rFonts w:ascii="Arial" w:cs="Arial" w:eastAsia="Arial" w:hAnsi="Arial"/>
+                <w:sz w:val="16"/>
+                <w:szCs w:val="16"/>
+              </w:rPr>
+              <w:t xml:space="preserve">ChatGPT (premium)</w:t>
+            </w:r>
+          </w:p>
+        </w:tc>
+        <w:tc>
+          <w:tcPr>
+            <w:tcW w:type="dxa" w:w="2000"/>
+            <w:tcBorders>
+              <w:top w:val="single" w:color="C9D1DB" w:sz="4"/>
+              <w:left w:val="single" w:color="C9D1DB" w:sz="4"/>
+              <w:bottom w:val="single" w:color="C9D1DB" w:sz="4"/>
+              <w:right w:val="single" w:color="C9D1DB" w:sz="4"/>
+            </w:tcBorders>
+            <w:shd w:fill="F3F6FA" w:color="auto" w:val="clear"/>
+            <w:tcMar>
+              <w:top w:type="dxa" w:w="50"/>
+              <w:left w:type="dxa" w:w="80"/>
+              <w:bottom w:type="dxa" w:w="50"/>
+              <w:right w:type="dxa" w:w="80"/>
+            </w:tcMar>
+            <w:vAlign w:val="center"/>
+          </w:tcPr>
+          <w:p>
+            <w:pPr>
+              <w:spacing w:after="0" w:line="230"/>
+              <w:jc w:val="left"/>
+            </w:pPr>
+            <w:r>
+              <w:rPr>
+                <w:rFonts w:ascii="Arial" w:cs="Arial" w:eastAsia="Arial" w:hAnsi="Arial"/>
+                <w:sz w:val="16"/>
+                <w:szCs w:val="16"/>
+              </w:rPr>
+              <w:t xml:space="preserve">Astra 6 Max</w:t>
+            </w:r>
+          </w:p>
+        </w:tc>
+        <w:tc>
+          <w:tcPr>
+            <w:tcW w:type="dxa" w:w="2760"/>
+            <w:tcBorders>
+              <w:top w:val="single" w:color="C9D1DB" w:sz="4"/>
+              <w:left w:val="single" w:color="C9D1DB" w:sz="4"/>
+              <w:bottom w:val="single" w:color="C9D1DB" w:sz="4"/>
+              <w:right w:val="single" w:color="C9D1DB" w:sz="4"/>
+            </w:tcBorders>
+            <w:shd w:fill="F3F6FA" w:color="auto" w:val="clear"/>
+            <w:tcMar>
+              <w:top w:type="dxa" w:w="50"/>
+              <w:left w:type="dxa" w:w="80"/>
+              <w:bottom w:type="dxa" w:w="50"/>
+              <w:right w:type="dxa" w:w="80"/>
+            </w:tcMar>
+            <w:vAlign w:val="center"/>
+          </w:tcPr>
+          <w:p>
+            <w:pPr>
+              <w:spacing w:after="0" w:line="230"/>
+              <w:jc w:val="left"/>
+            </w:pPr>
+            <w:r>
+              <w:rPr>
+                <w:rFonts w:ascii="Arial" w:cs="Arial" w:eastAsia="Arial" w:hAnsi="Arial"/>
+                <w:sz w:val="16"/>
+                <w:szCs w:val="16"/>
+              </w:rPr>
+              <w:t xml:space="preserve">Validador más revisión humana: 10 de 10</w:t>
+            </w:r>
+          </w:p>
+        </w:tc>
+      </w:tr>
+      <w:tr>
+        <w:trPr>
+          <w:cantSplit/>
+        </w:trPr>
+        <w:tc>
+          <w:tcPr>
+            <w:tcW w:type="dxa" w:w="2500"/>
+            <w:tcBorders>
+              <w:top w:val="single" w:color="C9D1DB" w:sz="4"/>
+              <w:left w:val="single" w:color="C9D1DB" w:sz="4"/>
+              <w:bottom w:val="single" w:color="C9D1DB" w:sz="4"/>
+              <w:right w:val="single" w:color="C9D1DB" w:sz="4"/>
+            </w:tcBorders>
+            <w:tcMar>
+              <w:top w:type="dxa" w:w="50"/>
+              <w:left w:type="dxa" w:w="80"/>
+              <w:bottom w:type="dxa" w:w="50"/>
+              <w:right w:type="dxa" w:w="80"/>
+            </w:tcMar>
+            <w:vAlign w:val="center"/>
+          </w:tcPr>
+          <w:p>
+            <w:pPr>
+              <w:spacing w:after="0" w:line="230"/>
+              <w:jc w:val="left"/>
+            </w:pPr>
+            <w:r>
+              <w:rPr>
+                <w:rFonts w:ascii="Arial" w:cs="Arial" w:eastAsia="Arial" w:hAnsi="Arial"/>
+                <w:b/>
+                <w:bCs/>
+                <w:sz w:val="16"/>
+                <w:szCs w:val="16"/>
+              </w:rPr>
+              <w:t xml:space="preserve">Infografía para la presentación</w:t>
+            </w:r>
+          </w:p>
+        </w:tc>
+        <w:tc>
+          <w:tcPr>
+            <w:tcW w:type="dxa" w:w="2100"/>
+            <w:tcBorders>
+              <w:top w:val="single" w:color="C9D1DB" w:sz="4"/>
+              <w:left w:val="single" w:color="C9D1DB" w:sz="4"/>
+              <w:bottom w:val="single" w:color="C9D1DB" w:sz="4"/>
+              <w:right w:val="single" w:color="C9D1DB" w:sz="4"/>
+            </w:tcBorders>
+            <w:tcMar>
+              <w:top w:type="dxa" w:w="50"/>
+              <w:left w:type="dxa" w:w="80"/>
+              <w:bottom w:type="dxa" w:w="50"/>
+              <w:right w:type="dxa" w:w="80"/>
+            </w:tcMar>
+            <w:vAlign w:val="center"/>
+          </w:tcPr>
+          <w:p>
+            <w:pPr>
+              <w:spacing w:after="0" w:line="230"/>
+              <w:jc w:val="left"/>
+            </w:pPr>
+            <w:r>
+              <w:rPr>
+                <w:rFonts w:ascii="Arial" w:cs="Arial" w:eastAsia="Arial" w:hAnsi="Arial"/>
+                <w:sz w:val="16"/>
+                <w:szCs w:val="16"/>
+              </w:rPr>
+              <w:t xml:space="preserve">Canva IA (Pro para empresas)</w:t>
+            </w:r>
+          </w:p>
+        </w:tc>
+        <w:tc>
+          <w:tcPr>
+            <w:tcW w:type="dxa" w:w="2000"/>
+            <w:tcBorders>
+              <w:top w:val="single" w:color="C9D1DB" w:sz="4"/>
+              <w:left w:val="single" w:color="C9D1DB" w:sz="4"/>
+              <w:bottom w:val="single" w:color="C9D1DB" w:sz="4"/>
+              <w:right w:val="single" w:color="C9D1DB" w:sz="4"/>
+            </w:tcBorders>
+            <w:tcMar>
+              <w:top w:type="dxa" w:w="50"/>
+              <w:left w:type="dxa" w:w="80"/>
+              <w:bottom w:type="dxa" w:w="50"/>
+              <w:right w:type="dxa" w:w="80"/>
+            </w:tcMar>
+            <w:vAlign w:val="center"/>
+          </w:tcPr>
+          <w:p>
+            <w:pPr>
+              <w:spacing w:after="0" w:line="230"/>
+              <w:jc w:val="left"/>
+            </w:pPr>
+            <w:r>
+              <w:rPr>
+                <w:rFonts w:ascii="Arial" w:cs="Arial" w:eastAsia="Arial" w:hAnsi="Arial"/>
+                <w:sz w:val="16"/>
+                <w:szCs w:val="16"/>
+              </w:rPr>
+              <w:t xml:space="preserve">Vigente en octubre de 2026; no registrada</w:t>
+            </w:r>
+          </w:p>
+        </w:tc>
+        <w:tc>
+          <w:tcPr>
+            <w:tcW w:type="dxa" w:w="2760"/>
+            <w:tcBorders>
+              <w:top w:val="single" w:color="C9D1DB" w:sz="4"/>
+              <w:left w:val="single" w:color="C9D1DB" w:sz="4"/>
+              <w:bottom w:val="single" w:color="C9D1DB" w:sz="4"/>
+              <w:right w:val="single" w:color="C9D1DB" w:sz="4"/>
+            </w:tcBorders>
+            <w:tcMar>
+              <w:top w:type="dxa" w:w="50"/>
+              <w:left w:type="dxa" w:w="80"/>
+              <w:bottom w:type="dxa" w:w="50"/>
+              <w:right w:type="dxa" w:w="80"/>
+            </w:tcMar>
+            <w:vAlign w:val="center"/>
+          </w:tcPr>
+          <w:p>
+            <w:pPr>
+              <w:spacing w:after="0" w:line="230"/>
+              <w:jc w:val="left"/>
+            </w:pPr>
+            <w:r>
+              <w:rPr>
+                <w:rFonts w:ascii="Arial" w:cs="Arial" w:eastAsia="Arial" w:hAnsi="Arial"/>
+                <w:sz w:val="16"/>
+                <w:szCs w:val="16"/>
+              </w:rPr>
+              <w:t xml:space="preserve">Errores corregidos antes de usarla</w:t>
+            </w:r>
+          </w:p>
+        </w:tc>
+      </w:tr>
+      <w:tr>
+        <w:trPr>
+          <w:cantSplit/>
+        </w:trPr>
+        <w:tc>
+          <w:tcPr>
+            <w:tcW w:type="dxa" w:w="2500"/>
+            <w:tcBorders>
+              <w:top w:val="single" w:color="C9D1DB" w:sz="4"/>
+              <w:left w:val="single" w:color="C9D1DB" w:sz="4"/>
+              <w:bottom w:val="single" w:color="C9D1DB" w:sz="4"/>
+              <w:right w:val="single" w:color="C9D1DB" w:sz="4"/>
+            </w:tcBorders>
+            <w:shd w:fill="F3F6FA" w:color="auto" w:val="clear"/>
+            <w:tcMar>
+              <w:top w:type="dxa" w:w="50"/>
+              <w:left w:type="dxa" w:w="80"/>
+              <w:bottom w:type="dxa" w:w="50"/>
+              <w:right w:type="dxa" w:w="80"/>
+            </w:tcMar>
+            <w:vAlign w:val="center"/>
+          </w:tcPr>
+          <w:p>
+            <w:pPr>
+              <w:spacing w:after="0" w:line="230"/>
+              <w:jc w:val="left"/>
+            </w:pPr>
+            <w:r>
+              <w:rPr>
+                <w:rFonts w:ascii="Arial" w:cs="Arial" w:eastAsia="Arial" w:hAnsi="Arial"/>
+                <w:b/>
+                <w:bCs/>
+                <w:sz w:val="16"/>
+                <w:szCs w:val="16"/>
+              </w:rPr>
+              <w:t xml:space="preserve">Ridge en el prototipo, 20 pruebas, CI, Pages y reproducción en limpio</w:t>
+            </w:r>
+          </w:p>
+        </w:tc>
+        <w:tc>
+          <w:tcPr>
+            <w:tcW w:type="dxa" w:w="2100"/>
+            <w:tcBorders>
+              <w:top w:val="single" w:color="C9D1DB" w:sz="4"/>
+              <w:left w:val="single" w:color="C9D1DB" w:sz="4"/>
+              <w:bottom w:val="single" w:color="C9D1DB" w:sz="4"/>
+              <w:right w:val="single" w:color="C9D1DB" w:sz="4"/>
+            </w:tcBorders>
+            <w:shd w:fill="F3F6FA" w:color="auto" w:val="clear"/>
+            <w:tcMar>
+              <w:top w:type="dxa" w:w="50"/>
+              <w:left w:type="dxa" w:w="80"/>
+              <w:bottom w:type="dxa" w:w="50"/>
+              <w:right w:type="dxa" w:w="80"/>
+            </w:tcMar>
+            <w:vAlign w:val="center"/>
+          </w:tcPr>
+          <w:p>
+            <w:pPr>
+              <w:spacing w:after="0" w:line="230"/>
+              <w:jc w:val="left"/>
+            </w:pPr>
+            <w:r>
+              <w:rPr>
+                <w:rFonts w:ascii="Arial" w:cs="Arial" w:eastAsia="Arial" w:hAnsi="Arial"/>
+                <w:sz w:val="16"/>
+                <w:szCs w:val="16"/>
+              </w:rPr>
+              <w:t xml:space="preserve">Codex (ChatGPT premium)</w:t>
+            </w:r>
+          </w:p>
+        </w:tc>
+        <w:tc>
+          <w:tcPr>
+            <w:tcW w:type="dxa" w:w="2000"/>
+            <w:tcBorders>
+              <w:top w:val="single" w:color="C9D1DB" w:sz="4"/>
+              <w:left w:val="single" w:color="C9D1DB" w:sz="4"/>
+              <w:bottom w:val="single" w:color="C9D1DB" w:sz="4"/>
+              <w:right w:val="single" w:color="C9D1DB" w:sz="4"/>
+            </w:tcBorders>
+            <w:shd w:fill="F3F6FA" w:color="auto" w:val="clear"/>
+            <w:tcMar>
+              <w:top w:type="dxa" w:w="50"/>
+              <w:left w:type="dxa" w:w="80"/>
+              <w:bottom w:type="dxa" w:w="50"/>
+              <w:right w:type="dxa" w:w="80"/>
+            </w:tcMar>
+            <w:vAlign w:val="center"/>
+          </w:tcPr>
+          <w:p>
+            <w:pPr>
+              <w:spacing w:after="0" w:line="230"/>
+              <w:jc w:val="left"/>
+            </w:pPr>
+            <w:r>
+              <w:rPr>
+                <w:rFonts w:ascii="Arial" w:cs="Arial" w:eastAsia="Arial" w:hAnsi="Arial"/>
+                <w:sz w:val="16"/>
+                <w:szCs w:val="16"/>
+              </w:rPr>
+              <w:t xml:space="preserve">Vigente en octubre de 2026</w:t>
+            </w:r>
+          </w:p>
+        </w:tc>
+        <w:tc>
+          <w:tcPr>
+            <w:tcW w:type="dxa" w:w="2760"/>
+            <w:tcBorders>
+              <w:top w:val="single" w:color="C9D1DB" w:sz="4"/>
+              <w:left w:val="single" w:color="C9D1DB" w:sz="4"/>
+              <w:bottom w:val="single" w:color="C9D1DB" w:sz="4"/>
+              <w:right w:val="single" w:color="C9D1DB" w:sz="4"/>
+            </w:tcBorders>
+            <w:shd w:fill="F3F6FA" w:color="auto" w:val="clear"/>
+            <w:tcMar>
+              <w:top w:type="dxa" w:w="50"/>
+              <w:left w:type="dxa" w:w="80"/>
+              <w:bottom w:type="dxa" w:w="50"/>
+              <w:right w:type="dxa" w:w="80"/>
+            </w:tcMar>
+            <w:vAlign w:val="center"/>
+          </w:tcPr>
+          <w:p>
+            <w:pPr>
+              <w:spacing w:after="0" w:line="230"/>
+              <w:jc w:val="left"/>
+            </w:pPr>
+            <w:r>
+              <w:rPr>
+                <w:rFonts w:ascii="Arial" w:cs="Arial" w:eastAsia="Arial" w:hAnsi="Arial"/>
+                <w:sz w:val="16"/>
+                <w:szCs w:val="16"/>
+              </w:rPr>
+              <w:t xml:space="preserve">Revisión del diff y 20/20 pruebas al integrar (commit e5fc3e1)</w:t>
             </w:r>
           </w:p>
         </w:tc>
@@ -31398,7 +32215,7 @@
           <w:sz w:val="17"/>
           <w:szCs w:val="17"/>
         </w:rPr>
-        <w:t xml:space="preserve">Elaboración propia. Ninguna respuesta de IA se usó como evidencia sin verificarla: las cifras provienen del simulador, de los datos citados o de cálculos reproducibles.</w:t>
+        <w:t xml:space="preserve">Elaboración propia. Se anota la versión exacta solo cuando quedó registrada; en los demás casos, el producto, el plan y la fecha. Lección del proyecto: registrar la versión es parte de la reproducibilidad, porque las salidas de un modelo generativo cambian entre versiones. Ninguna respuesta de IA se usó como evidencia sin verificarla.</w:t>
       </w:r>
     </w:p>
     <w:p>
@@ -35490,6 +36307,2296 @@
           <w:szCs w:val="17"/>
         </w:rPr>
         <w:t xml:space="preserve">Elaboración propia.</w:t>
+      </w:r>
+    </w:p>
+    <w:p>
+      <w:pPr>
+        <w:pStyle w:val="Heading2"/>
+        <w:keepNext/>
+        <w:spacing w:after="80" w:before="180"/>
+      </w:pPr>
+      <w:r>
+        <w:rPr>
+          <w:rFonts w:ascii="Arial" w:cs="Arial" w:eastAsia="Arial" w:hAnsi="Arial"/>
+        </w:rPr>
+        <w:t xml:space="preserve">Anexo K. Trazabilidad y reproducibilidad en GitHub</w:t>
+      </w:r>
+    </w:p>
+    <w:p>
+      <w:pPr>
+        <w:spacing w:after="120" w:before="0" w:line="264"/>
+        <w:jc w:val="both"/>
+      </w:pPr>
+      <w:r>
+        <w:rPr>
+          <w:rFonts w:ascii="Arial" w:cs="Arial" w:eastAsia="Arial" w:hAnsi="Arial"/>
+        </w:rPr>
+        <w:t xml:space="preserve">Repositorio: github.com/diegoaam0109-ux/lumine (rama claude/quirky-darwin-326nn0). El acceso para revisión se entrega al profesor como colaborador de solo lectura. Cada entrega tiene su carpeta (entrega3/, entrega4/ y entrega5/) y cada cambio queda con autor, fecha y propósito.</w:t>
+      </w:r>
+    </w:p>
+    <w:p>
+      <w:pPr>
+        <w:keepNext/>
+        <w:spacing w:after="0" w:before="160"/>
+      </w:pPr>
+      <w:r>
+        <w:rPr>
+          <w:rFonts w:ascii="Arial" w:cs="Arial" w:eastAsia="Arial" w:hAnsi="Arial"/>
+          <w:b/>
+          <w:bCs/>
+          <w:color w:val="1F2A44"/>
+          <w:sz w:val="20"/>
+          <w:szCs w:val="20"/>
+        </w:rPr>
+        <w:t xml:space="preserve">Tabla K1</w:t>
+      </w:r>
+    </w:p>
+    <w:p>
+      <w:pPr>
+        <w:keepNext/>
+        <w:spacing w:after="80"/>
+      </w:pPr>
+      <w:r>
+        <w:rPr>
+          <w:rFonts w:ascii="Arial" w:cs="Arial" w:eastAsia="Arial" w:hAnsi="Arial"/>
+          <w:i/>
+          <w:iCs/>
+          <w:color w:val="1F2A44"/>
+          <w:sz w:val="20"/>
+          <w:szCs w:val="20"/>
+        </w:rPr>
+        <w:t xml:space="preserve">Commits clave del proyecto</w:t>
+      </w:r>
+    </w:p>
+    <w:tbl>
+      <w:tblPr>
+        <w:tblW w:type="dxa" w:w="9360"/>
+        <w:tblBorders>
+          <w:top w:val="single" w:color="auto" w:sz="4"/>
+          <w:left w:val="single" w:color="auto" w:sz="4"/>
+          <w:bottom w:val="single" w:color="auto" w:sz="4"/>
+          <w:right w:val="single" w:color="auto" w:sz="4"/>
+          <w:insideH w:val="single" w:color="auto" w:sz="4"/>
+          <w:insideV w:val="single" w:color="auto" w:sz="4"/>
+        </w:tblBorders>
+      </w:tblPr>
+      <w:tblGrid>
+        <w:gridCol w:w="900"/>
+        <w:gridCol w:w="1100"/>
+        <w:gridCol w:w="1900"/>
+        <w:gridCol w:w="5460"/>
+      </w:tblGrid>
+      <w:tr>
+        <w:trPr>
+          <w:tblHeader/>
+        </w:trPr>
+        <w:tc>
+          <w:tcPr>
+            <w:tcW w:type="dxa" w:w="900"/>
+            <w:tcBorders>
+              <w:top w:val="single" w:color="C9D1DB" w:sz="4"/>
+              <w:left w:val="single" w:color="C9D1DB" w:sz="4"/>
+              <w:bottom w:val="single" w:color="C9D1DB" w:sz="4"/>
+              <w:right w:val="single" w:color="C9D1DB" w:sz="4"/>
+            </w:tcBorders>
+            <w:shd w:fill="1F2A44" w:color="auto" w:val="clear"/>
+            <w:tcMar>
+              <w:top w:type="dxa" w:w="50"/>
+              <w:left w:type="dxa" w:w="80"/>
+              <w:bottom w:type="dxa" w:w="50"/>
+              <w:right w:type="dxa" w:w="80"/>
+            </w:tcMar>
+            <w:vAlign w:val="center"/>
+          </w:tcPr>
+          <w:p>
+            <w:pPr>
+              <w:spacing w:after="0" w:line="230"/>
+              <w:jc w:val="left"/>
+            </w:pPr>
+            <w:r>
+              <w:rPr>
+                <w:rFonts w:ascii="Arial" w:cs="Arial" w:eastAsia="Arial" w:hAnsi="Arial"/>
+                <w:b/>
+                <w:bCs/>
+                <w:color w:val="FFFFFF"/>
+                <w:sz w:val="17"/>
+                <w:szCs w:val="17"/>
+              </w:rPr>
+              <w:t xml:space="preserve">Fecha</w:t>
+            </w:r>
+          </w:p>
+        </w:tc>
+        <w:tc>
+          <w:tcPr>
+            <w:tcW w:type="dxa" w:w="1100"/>
+            <w:tcBorders>
+              <w:top w:val="single" w:color="C9D1DB" w:sz="4"/>
+              <w:left w:val="single" w:color="C9D1DB" w:sz="4"/>
+              <w:bottom w:val="single" w:color="C9D1DB" w:sz="4"/>
+              <w:right w:val="single" w:color="C9D1DB" w:sz="4"/>
+            </w:tcBorders>
+            <w:shd w:fill="1F2A44" w:color="auto" w:val="clear"/>
+            <w:tcMar>
+              <w:top w:type="dxa" w:w="50"/>
+              <w:left w:type="dxa" w:w="80"/>
+              <w:bottom w:type="dxa" w:w="50"/>
+              <w:right w:type="dxa" w:w="80"/>
+            </w:tcMar>
+            <w:vAlign w:val="center"/>
+          </w:tcPr>
+          <w:p>
+            <w:pPr>
+              <w:spacing w:after="0" w:line="230"/>
+              <w:jc w:val="left"/>
+            </w:pPr>
+            <w:r>
+              <w:rPr>
+                <w:rFonts w:ascii="Arial" w:cs="Arial" w:eastAsia="Arial" w:hAnsi="Arial"/>
+                <w:b/>
+                <w:bCs/>
+                <w:color w:val="FFFFFF"/>
+                <w:sz w:val="17"/>
+                <w:szCs w:val="17"/>
+              </w:rPr>
+              <w:t xml:space="preserve">Commit</w:t>
+            </w:r>
+          </w:p>
+        </w:tc>
+        <w:tc>
+          <w:tcPr>
+            <w:tcW w:type="dxa" w:w="1900"/>
+            <w:tcBorders>
+              <w:top w:val="single" w:color="C9D1DB" w:sz="4"/>
+              <w:left w:val="single" w:color="C9D1DB" w:sz="4"/>
+              <w:bottom w:val="single" w:color="C9D1DB" w:sz="4"/>
+              <w:right w:val="single" w:color="C9D1DB" w:sz="4"/>
+            </w:tcBorders>
+            <w:shd w:fill="1F2A44" w:color="auto" w:val="clear"/>
+            <w:tcMar>
+              <w:top w:type="dxa" w:w="50"/>
+              <w:left w:type="dxa" w:w="80"/>
+              <w:bottom w:type="dxa" w:w="50"/>
+              <w:right w:type="dxa" w:w="80"/>
+            </w:tcMar>
+            <w:vAlign w:val="center"/>
+          </w:tcPr>
+          <w:p>
+            <w:pPr>
+              <w:spacing w:after="0" w:line="230"/>
+              <w:jc w:val="left"/>
+            </w:pPr>
+            <w:r>
+              <w:rPr>
+                <w:rFonts w:ascii="Arial" w:cs="Arial" w:eastAsia="Arial" w:hAnsi="Arial"/>
+                <w:b/>
+                <w:bCs/>
+                <w:color w:val="FFFFFF"/>
+                <w:sz w:val="17"/>
+                <w:szCs w:val="17"/>
+              </w:rPr>
+              <w:t xml:space="preserve">Autor</w:t>
+            </w:r>
+          </w:p>
+        </w:tc>
+        <w:tc>
+          <w:tcPr>
+            <w:tcW w:type="dxa" w:w="5460"/>
+            <w:tcBorders>
+              <w:top w:val="single" w:color="C9D1DB" w:sz="4"/>
+              <w:left w:val="single" w:color="C9D1DB" w:sz="4"/>
+              <w:bottom w:val="single" w:color="C9D1DB" w:sz="4"/>
+              <w:right w:val="single" w:color="C9D1DB" w:sz="4"/>
+            </w:tcBorders>
+            <w:shd w:fill="1F2A44" w:color="auto" w:val="clear"/>
+            <w:tcMar>
+              <w:top w:type="dxa" w:w="50"/>
+              <w:left w:type="dxa" w:w="80"/>
+              <w:bottom w:type="dxa" w:w="50"/>
+              <w:right w:type="dxa" w:w="80"/>
+            </w:tcMar>
+            <w:vAlign w:val="center"/>
+          </w:tcPr>
+          <w:p>
+            <w:pPr>
+              <w:spacing w:after="0" w:line="230"/>
+              <w:jc w:val="left"/>
+            </w:pPr>
+            <w:r>
+              <w:rPr>
+                <w:rFonts w:ascii="Arial" w:cs="Arial" w:eastAsia="Arial" w:hAnsi="Arial"/>
+                <w:b/>
+                <w:bCs/>
+                <w:color w:val="FFFFFF"/>
+                <w:sz w:val="17"/>
+                <w:szCs w:val="17"/>
+              </w:rPr>
+              <w:t xml:space="preserve">Cambio</w:t>
+            </w:r>
+          </w:p>
+        </w:tc>
+      </w:tr>
+      <w:tr>
+        <w:trPr>
+          <w:cantSplit/>
+        </w:trPr>
+        <w:tc>
+          <w:tcPr>
+            <w:tcW w:type="dxa" w:w="900"/>
+            <w:tcBorders>
+              <w:top w:val="single" w:color="C9D1DB" w:sz="4"/>
+              <w:left w:val="single" w:color="C9D1DB" w:sz="4"/>
+              <w:bottom w:val="single" w:color="C9D1DB" w:sz="4"/>
+              <w:right w:val="single" w:color="C9D1DB" w:sz="4"/>
+            </w:tcBorders>
+            <w:tcMar>
+              <w:top w:type="dxa" w:w="50"/>
+              <w:left w:type="dxa" w:w="80"/>
+              <w:bottom w:type="dxa" w:w="50"/>
+              <w:right w:type="dxa" w:w="80"/>
+            </w:tcMar>
+            <w:vAlign w:val="center"/>
+          </w:tcPr>
+          <w:p>
+            <w:pPr>
+              <w:spacing w:after="0" w:line="230"/>
+              <w:jc w:val="left"/>
+            </w:pPr>
+            <w:r>
+              <w:rPr>
+                <w:rFonts w:ascii="Arial" w:cs="Arial" w:eastAsia="Arial" w:hAnsi="Arial"/>
+                <w:b/>
+                <w:bCs/>
+                <w:sz w:val="17"/>
+                <w:szCs w:val="17"/>
+              </w:rPr>
+              <w:t xml:space="preserve">4 oct</w:t>
+            </w:r>
+          </w:p>
+        </w:tc>
+        <w:tc>
+          <w:tcPr>
+            <w:tcW w:type="dxa" w:w="1100"/>
+            <w:tcBorders>
+              <w:top w:val="single" w:color="C9D1DB" w:sz="4"/>
+              <w:left w:val="single" w:color="C9D1DB" w:sz="4"/>
+              <w:bottom w:val="single" w:color="C9D1DB" w:sz="4"/>
+              <w:right w:val="single" w:color="C9D1DB" w:sz="4"/>
+            </w:tcBorders>
+            <w:tcMar>
+              <w:top w:type="dxa" w:w="50"/>
+              <w:left w:type="dxa" w:w="80"/>
+              <w:bottom w:type="dxa" w:w="50"/>
+              <w:right w:type="dxa" w:w="80"/>
+            </w:tcMar>
+            <w:vAlign w:val="center"/>
+          </w:tcPr>
+          <w:p>
+            <w:pPr>
+              <w:spacing w:after="0" w:line="230"/>
+              <w:jc w:val="left"/>
+            </w:pPr>
+            <w:r>
+              <w:rPr>
+                <w:rFonts w:ascii="Arial" w:cs="Arial" w:eastAsia="Arial" w:hAnsi="Arial"/>
+                <w:sz w:val="17"/>
+                <w:szCs w:val="17"/>
+              </w:rPr>
+              <w:t xml:space="preserve">80fbd59</w:t>
+            </w:r>
+          </w:p>
+        </w:tc>
+        <w:tc>
+          <w:tcPr>
+            <w:tcW w:type="dxa" w:w="1900"/>
+            <w:tcBorders>
+              <w:top w:val="single" w:color="C9D1DB" w:sz="4"/>
+              <w:left w:val="single" w:color="C9D1DB" w:sz="4"/>
+              <w:bottom w:val="single" w:color="C9D1DB" w:sz="4"/>
+              <w:right w:val="single" w:color="C9D1DB" w:sz="4"/>
+            </w:tcBorders>
+            <w:tcMar>
+              <w:top w:type="dxa" w:w="50"/>
+              <w:left w:type="dxa" w:w="80"/>
+              <w:bottom w:type="dxa" w:w="50"/>
+              <w:right w:type="dxa" w:w="80"/>
+            </w:tcMar>
+            <w:vAlign w:val="center"/>
+          </w:tcPr>
+          <w:p>
+            <w:pPr>
+              <w:spacing w:after="0" w:line="230"/>
+              <w:jc w:val="left"/>
+            </w:pPr>
+            <w:r>
+              <w:rPr>
+                <w:rFonts w:ascii="Arial" w:cs="Arial" w:eastAsia="Arial" w:hAnsi="Arial"/>
+                <w:sz w:val="17"/>
+                <w:szCs w:val="17"/>
+              </w:rPr>
+              <w:t xml:space="preserve">Claude Code</w:t>
+            </w:r>
+          </w:p>
+        </w:tc>
+        <w:tc>
+          <w:tcPr>
+            <w:tcW w:type="dxa" w:w="5460"/>
+            <w:tcBorders>
+              <w:top w:val="single" w:color="C9D1DB" w:sz="4"/>
+              <w:left w:val="single" w:color="C9D1DB" w:sz="4"/>
+              <w:bottom w:val="single" w:color="C9D1DB" w:sz="4"/>
+              <w:right w:val="single" w:color="C9D1DB" w:sz="4"/>
+            </w:tcBorders>
+            <w:tcMar>
+              <w:top w:type="dxa" w:w="50"/>
+              <w:left w:type="dxa" w:w="80"/>
+              <w:bottom w:type="dxa" w:w="50"/>
+              <w:right w:type="dxa" w:w="80"/>
+            </w:tcMar>
+            <w:vAlign w:val="center"/>
+          </w:tcPr>
+          <w:p>
+            <w:pPr>
+              <w:spacing w:after="0" w:line="230"/>
+              <w:jc w:val="left"/>
+            </w:pPr>
+            <w:r>
+              <w:rPr>
+                <w:rFonts w:ascii="Arial" w:cs="Arial" w:eastAsia="Arial" w:hAnsi="Arial"/>
+                <w:sz w:val="17"/>
+                <w:szCs w:val="17"/>
+              </w:rPr>
+              <w:t xml:space="preserve">Entrega 3: simulador, modelo, prototipo, prompts RAFA y validador</w:t>
+            </w:r>
+          </w:p>
+        </w:tc>
+      </w:tr>
+      <w:tr>
+        <w:trPr>
+          <w:cantSplit/>
+        </w:trPr>
+        <w:tc>
+          <w:tcPr>
+            <w:tcW w:type="dxa" w:w="900"/>
+            <w:tcBorders>
+              <w:top w:val="single" w:color="C9D1DB" w:sz="4"/>
+              <w:left w:val="single" w:color="C9D1DB" w:sz="4"/>
+              <w:bottom w:val="single" w:color="C9D1DB" w:sz="4"/>
+              <w:right w:val="single" w:color="C9D1DB" w:sz="4"/>
+            </w:tcBorders>
+            <w:shd w:fill="F3F6FA" w:color="auto" w:val="clear"/>
+            <w:tcMar>
+              <w:top w:type="dxa" w:w="50"/>
+              <w:left w:type="dxa" w:w="80"/>
+              <w:bottom w:type="dxa" w:w="50"/>
+              <w:right w:type="dxa" w:w="80"/>
+            </w:tcMar>
+            <w:vAlign w:val="center"/>
+          </w:tcPr>
+          <w:p>
+            <w:pPr>
+              <w:spacing w:after="0" w:line="230"/>
+              <w:jc w:val="left"/>
+            </w:pPr>
+            <w:r>
+              <w:rPr>
+                <w:rFonts w:ascii="Arial" w:cs="Arial" w:eastAsia="Arial" w:hAnsi="Arial"/>
+                <w:b/>
+                <w:bCs/>
+                <w:sz w:val="17"/>
+                <w:szCs w:val="17"/>
+              </w:rPr>
+              <w:t xml:space="preserve">9 oct</w:t>
+            </w:r>
+          </w:p>
+        </w:tc>
+        <w:tc>
+          <w:tcPr>
+            <w:tcW w:type="dxa" w:w="1100"/>
+            <w:tcBorders>
+              <w:top w:val="single" w:color="C9D1DB" w:sz="4"/>
+              <w:left w:val="single" w:color="C9D1DB" w:sz="4"/>
+              <w:bottom w:val="single" w:color="C9D1DB" w:sz="4"/>
+              <w:right w:val="single" w:color="C9D1DB" w:sz="4"/>
+            </w:tcBorders>
+            <w:shd w:fill="F3F6FA" w:color="auto" w:val="clear"/>
+            <w:tcMar>
+              <w:top w:type="dxa" w:w="50"/>
+              <w:left w:type="dxa" w:w="80"/>
+              <w:bottom w:type="dxa" w:w="50"/>
+              <w:right w:type="dxa" w:w="80"/>
+            </w:tcMar>
+            <w:vAlign w:val="center"/>
+          </w:tcPr>
+          <w:p>
+            <w:pPr>
+              <w:spacing w:after="0" w:line="230"/>
+              <w:jc w:val="left"/>
+            </w:pPr>
+            <w:r>
+              <w:rPr>
+                <w:rFonts w:ascii="Arial" w:cs="Arial" w:eastAsia="Arial" w:hAnsi="Arial"/>
+                <w:sz w:val="17"/>
+                <w:szCs w:val="17"/>
+              </w:rPr>
+              <w:t xml:space="preserve">c4a0832</w:t>
+            </w:r>
+          </w:p>
+        </w:tc>
+        <w:tc>
+          <w:tcPr>
+            <w:tcW w:type="dxa" w:w="1900"/>
+            <w:tcBorders>
+              <w:top w:val="single" w:color="C9D1DB" w:sz="4"/>
+              <w:left w:val="single" w:color="C9D1DB" w:sz="4"/>
+              <w:bottom w:val="single" w:color="C9D1DB" w:sz="4"/>
+              <w:right w:val="single" w:color="C9D1DB" w:sz="4"/>
+            </w:tcBorders>
+            <w:shd w:fill="F3F6FA" w:color="auto" w:val="clear"/>
+            <w:tcMar>
+              <w:top w:type="dxa" w:w="50"/>
+              <w:left w:type="dxa" w:w="80"/>
+              <w:bottom w:type="dxa" w:w="50"/>
+              <w:right w:type="dxa" w:w="80"/>
+            </w:tcMar>
+            <w:vAlign w:val="center"/>
+          </w:tcPr>
+          <w:p>
+            <w:pPr>
+              <w:spacing w:after="0" w:line="230"/>
+              <w:jc w:val="left"/>
+            </w:pPr>
+            <w:r>
+              <w:rPr>
+                <w:rFonts w:ascii="Arial" w:cs="Arial" w:eastAsia="Arial" w:hAnsi="Arial"/>
+                <w:sz w:val="17"/>
+                <w:szCs w:val="17"/>
+              </w:rPr>
+              <w:t xml:space="preserve">Claude Code</w:t>
+            </w:r>
+          </w:p>
+        </w:tc>
+        <w:tc>
+          <w:tcPr>
+            <w:tcW w:type="dxa" w:w="5460"/>
+            <w:tcBorders>
+              <w:top w:val="single" w:color="C9D1DB" w:sz="4"/>
+              <w:left w:val="single" w:color="C9D1DB" w:sz="4"/>
+              <w:bottom w:val="single" w:color="C9D1DB" w:sz="4"/>
+              <w:right w:val="single" w:color="C9D1DB" w:sz="4"/>
+            </w:tcBorders>
+            <w:shd w:fill="F3F6FA" w:color="auto" w:val="clear"/>
+            <w:tcMar>
+              <w:top w:type="dxa" w:w="50"/>
+              <w:left w:type="dxa" w:w="80"/>
+              <w:bottom w:type="dxa" w:w="50"/>
+              <w:right w:type="dxa" w:w="80"/>
+            </w:tcMar>
+            <w:vAlign w:val="center"/>
+          </w:tcPr>
+          <w:p>
+            <w:pPr>
+              <w:spacing w:after="0" w:line="230"/>
+              <w:jc w:val="left"/>
+            </w:pPr>
+            <w:r>
+              <w:rPr>
+                <w:rFonts w:ascii="Arial" w:cs="Arial" w:eastAsia="Arial" w:hAnsi="Arial"/>
+                <w:sz w:val="17"/>
+                <w:szCs w:val="17"/>
+              </w:rPr>
+              <w:t xml:space="preserve">Validación corregida tras la revisión de ChatGPT y DeepSeek (GroupKFold, 10 particiones, Ridge)</w:t>
+            </w:r>
+          </w:p>
+        </w:tc>
+      </w:tr>
+      <w:tr>
+        <w:trPr>
+          <w:cantSplit/>
+        </w:trPr>
+        <w:tc>
+          <w:tcPr>
+            <w:tcW w:type="dxa" w:w="900"/>
+            <w:tcBorders>
+              <w:top w:val="single" w:color="C9D1DB" w:sz="4"/>
+              <w:left w:val="single" w:color="C9D1DB" w:sz="4"/>
+              <w:bottom w:val="single" w:color="C9D1DB" w:sz="4"/>
+              <w:right w:val="single" w:color="C9D1DB" w:sz="4"/>
+            </w:tcBorders>
+            <w:tcMar>
+              <w:top w:type="dxa" w:w="50"/>
+              <w:left w:type="dxa" w:w="80"/>
+              <w:bottom w:type="dxa" w:w="50"/>
+              <w:right w:type="dxa" w:w="80"/>
+            </w:tcMar>
+            <w:vAlign w:val="center"/>
+          </w:tcPr>
+          <w:p>
+            <w:pPr>
+              <w:spacing w:after="0" w:line="230"/>
+              <w:jc w:val="left"/>
+            </w:pPr>
+            <w:r>
+              <w:rPr>
+                <w:rFonts w:ascii="Arial" w:cs="Arial" w:eastAsia="Arial" w:hAnsi="Arial"/>
+                <w:b/>
+                <w:bCs/>
+                <w:sz w:val="17"/>
+                <w:szCs w:val="17"/>
+              </w:rPr>
+              <w:t xml:space="preserve">21 oct</w:t>
+            </w:r>
+          </w:p>
+        </w:tc>
+        <w:tc>
+          <w:tcPr>
+            <w:tcW w:type="dxa" w:w="1100"/>
+            <w:tcBorders>
+              <w:top w:val="single" w:color="C9D1DB" w:sz="4"/>
+              <w:left w:val="single" w:color="C9D1DB" w:sz="4"/>
+              <w:bottom w:val="single" w:color="C9D1DB" w:sz="4"/>
+              <w:right w:val="single" w:color="C9D1DB" w:sz="4"/>
+            </w:tcBorders>
+            <w:tcMar>
+              <w:top w:type="dxa" w:w="50"/>
+              <w:left w:type="dxa" w:w="80"/>
+              <w:bottom w:type="dxa" w:w="50"/>
+              <w:right w:type="dxa" w:w="80"/>
+            </w:tcMar>
+            <w:vAlign w:val="center"/>
+          </w:tcPr>
+          <w:p>
+            <w:pPr>
+              <w:spacing w:after="0" w:line="230"/>
+              <w:jc w:val="left"/>
+            </w:pPr>
+            <w:r>
+              <w:rPr>
+                <w:rFonts w:ascii="Arial" w:cs="Arial" w:eastAsia="Arial" w:hAnsi="Arial"/>
+                <w:sz w:val="17"/>
+                <w:szCs w:val="17"/>
+              </w:rPr>
+              <w:t xml:space="preserve">4e1538e</w:t>
+            </w:r>
+          </w:p>
+        </w:tc>
+        <w:tc>
+          <w:tcPr>
+            <w:tcW w:type="dxa" w:w="1900"/>
+            <w:tcBorders>
+              <w:top w:val="single" w:color="C9D1DB" w:sz="4"/>
+              <w:left w:val="single" w:color="C9D1DB" w:sz="4"/>
+              <w:bottom w:val="single" w:color="C9D1DB" w:sz="4"/>
+              <w:right w:val="single" w:color="C9D1DB" w:sz="4"/>
+            </w:tcBorders>
+            <w:tcMar>
+              <w:top w:type="dxa" w:w="50"/>
+              <w:left w:type="dxa" w:w="80"/>
+              <w:bottom w:type="dxa" w:w="50"/>
+              <w:right w:type="dxa" w:w="80"/>
+            </w:tcMar>
+            <w:vAlign w:val="center"/>
+          </w:tcPr>
+          <w:p>
+            <w:pPr>
+              <w:spacing w:after="0" w:line="230"/>
+              <w:jc w:val="left"/>
+            </w:pPr>
+            <w:r>
+              <w:rPr>
+                <w:rFonts w:ascii="Arial" w:cs="Arial" w:eastAsia="Arial" w:hAnsi="Arial"/>
+                <w:sz w:val="17"/>
+                <w:szCs w:val="17"/>
+              </w:rPr>
+              <w:t xml:space="preserve">Claude Code</w:t>
+            </w:r>
+          </w:p>
+        </w:tc>
+        <w:tc>
+          <w:tcPr>
+            <w:tcW w:type="dxa" w:w="5460"/>
+            <w:tcBorders>
+              <w:top w:val="single" w:color="C9D1DB" w:sz="4"/>
+              <w:left w:val="single" w:color="C9D1DB" w:sz="4"/>
+              <w:bottom w:val="single" w:color="C9D1DB" w:sz="4"/>
+              <w:right w:val="single" w:color="C9D1DB" w:sz="4"/>
+            </w:tcBorders>
+            <w:tcMar>
+              <w:top w:type="dxa" w:w="50"/>
+              <w:left w:type="dxa" w:w="80"/>
+              <w:bottom w:type="dxa" w:w="50"/>
+              <w:right w:type="dxa" w:w="80"/>
+            </w:tcMar>
+            <w:vAlign w:val="center"/>
+          </w:tcPr>
+          <w:p>
+            <w:pPr>
+              <w:spacing w:after="0" w:line="230"/>
+              <w:jc w:val="left"/>
+            </w:pPr>
+            <w:r>
+              <w:rPr>
+                <w:rFonts w:ascii="Arial" w:cs="Arial" w:eastAsia="Arial" w:hAnsi="Arial"/>
+                <w:sz w:val="17"/>
+                <w:szCs w:val="17"/>
+              </w:rPr>
+              <w:t xml:space="preserve">Se elimina el trabajo en terreno y se declara como limitación</w:t>
+            </w:r>
+          </w:p>
+        </w:tc>
+      </w:tr>
+      <w:tr>
+        <w:trPr>
+          <w:cantSplit/>
+        </w:trPr>
+        <w:tc>
+          <w:tcPr>
+            <w:tcW w:type="dxa" w:w="900"/>
+            <w:tcBorders>
+              <w:top w:val="single" w:color="C9D1DB" w:sz="4"/>
+              <w:left w:val="single" w:color="C9D1DB" w:sz="4"/>
+              <w:bottom w:val="single" w:color="C9D1DB" w:sz="4"/>
+              <w:right w:val="single" w:color="C9D1DB" w:sz="4"/>
+            </w:tcBorders>
+            <w:shd w:fill="F3F6FA" w:color="auto" w:val="clear"/>
+            <w:tcMar>
+              <w:top w:type="dxa" w:w="50"/>
+              <w:left w:type="dxa" w:w="80"/>
+              <w:bottom w:type="dxa" w:w="50"/>
+              <w:right w:type="dxa" w:w="80"/>
+            </w:tcMar>
+            <w:vAlign w:val="center"/>
+          </w:tcPr>
+          <w:p>
+            <w:pPr>
+              <w:spacing w:after="0" w:line="230"/>
+              <w:jc w:val="left"/>
+            </w:pPr>
+            <w:r>
+              <w:rPr>
+                <w:rFonts w:ascii="Arial" w:cs="Arial" w:eastAsia="Arial" w:hAnsi="Arial"/>
+                <w:b/>
+                <w:bCs/>
+                <w:sz w:val="17"/>
+                <w:szCs w:val="17"/>
+              </w:rPr>
+              <w:t xml:space="preserve">24 oct</w:t>
+            </w:r>
+          </w:p>
+        </w:tc>
+        <w:tc>
+          <w:tcPr>
+            <w:tcW w:type="dxa" w:w="1100"/>
+            <w:tcBorders>
+              <w:top w:val="single" w:color="C9D1DB" w:sz="4"/>
+              <w:left w:val="single" w:color="C9D1DB" w:sz="4"/>
+              <w:bottom w:val="single" w:color="C9D1DB" w:sz="4"/>
+              <w:right w:val="single" w:color="C9D1DB" w:sz="4"/>
+            </w:tcBorders>
+            <w:shd w:fill="F3F6FA" w:color="auto" w:val="clear"/>
+            <w:tcMar>
+              <w:top w:type="dxa" w:w="50"/>
+              <w:left w:type="dxa" w:w="80"/>
+              <w:bottom w:type="dxa" w:w="50"/>
+              <w:right w:type="dxa" w:w="80"/>
+            </w:tcMar>
+            <w:vAlign w:val="center"/>
+          </w:tcPr>
+          <w:p>
+            <w:pPr>
+              <w:spacing w:after="0" w:line="230"/>
+              <w:jc w:val="left"/>
+            </w:pPr>
+            <w:r>
+              <w:rPr>
+                <w:rFonts w:ascii="Arial" w:cs="Arial" w:eastAsia="Arial" w:hAnsi="Arial"/>
+                <w:sz w:val="17"/>
+                <w:szCs w:val="17"/>
+              </w:rPr>
+              <w:t xml:space="preserve">0b4b29f</w:t>
+            </w:r>
+          </w:p>
+        </w:tc>
+        <w:tc>
+          <w:tcPr>
+            <w:tcW w:type="dxa" w:w="1900"/>
+            <w:tcBorders>
+              <w:top w:val="single" w:color="C9D1DB" w:sz="4"/>
+              <w:left w:val="single" w:color="C9D1DB" w:sz="4"/>
+              <w:bottom w:val="single" w:color="C9D1DB" w:sz="4"/>
+              <w:right w:val="single" w:color="C9D1DB" w:sz="4"/>
+            </w:tcBorders>
+            <w:shd w:fill="F3F6FA" w:color="auto" w:val="clear"/>
+            <w:tcMar>
+              <w:top w:type="dxa" w:w="50"/>
+              <w:left w:type="dxa" w:w="80"/>
+              <w:bottom w:type="dxa" w:w="50"/>
+              <w:right w:type="dxa" w:w="80"/>
+            </w:tcMar>
+            <w:vAlign w:val="center"/>
+          </w:tcPr>
+          <w:p>
+            <w:pPr>
+              <w:spacing w:after="0" w:line="230"/>
+              <w:jc w:val="left"/>
+            </w:pPr>
+            <w:r>
+              <w:rPr>
+                <w:rFonts w:ascii="Arial" w:cs="Arial" w:eastAsia="Arial" w:hAnsi="Arial"/>
+                <w:sz w:val="17"/>
+                <w:szCs w:val="17"/>
+              </w:rPr>
+              <w:t xml:space="preserve">Claude Code</w:t>
+            </w:r>
+          </w:p>
+        </w:tc>
+        <w:tc>
+          <w:tcPr>
+            <w:tcW w:type="dxa" w:w="5460"/>
+            <w:tcBorders>
+              <w:top w:val="single" w:color="C9D1DB" w:sz="4"/>
+              <w:left w:val="single" w:color="C9D1DB" w:sz="4"/>
+              <w:bottom w:val="single" w:color="C9D1DB" w:sz="4"/>
+              <w:right w:val="single" w:color="C9D1DB" w:sz="4"/>
+            </w:tcBorders>
+            <w:shd w:fill="F3F6FA" w:color="auto" w:val="clear"/>
+            <w:tcMar>
+              <w:top w:type="dxa" w:w="50"/>
+              <w:left w:type="dxa" w:w="80"/>
+              <w:bottom w:type="dxa" w:w="50"/>
+              <w:right w:type="dxa" w:w="80"/>
+            </w:tcMar>
+            <w:vAlign w:val="center"/>
+          </w:tcPr>
+          <w:p>
+            <w:pPr>
+              <w:spacing w:after="0" w:line="230"/>
+              <w:jc w:val="left"/>
+            </w:pPr>
+            <w:r>
+              <w:rPr>
+                <w:rFonts w:ascii="Arial" w:cs="Arial" w:eastAsia="Arial" w:hAnsi="Arial"/>
+                <w:sz w:val="17"/>
+                <w:szCs w:val="17"/>
+              </w:rPr>
+              <w:t xml:space="preserve">Red team completo: 10 de 10 ataques resistidos</w:t>
+            </w:r>
+          </w:p>
+        </w:tc>
+      </w:tr>
+      <w:tr>
+        <w:trPr>
+          <w:cantSplit/>
+        </w:trPr>
+        <w:tc>
+          <w:tcPr>
+            <w:tcW w:type="dxa" w:w="900"/>
+            <w:tcBorders>
+              <w:top w:val="single" w:color="C9D1DB" w:sz="4"/>
+              <w:left w:val="single" w:color="C9D1DB" w:sz="4"/>
+              <w:bottom w:val="single" w:color="C9D1DB" w:sz="4"/>
+              <w:right w:val="single" w:color="C9D1DB" w:sz="4"/>
+            </w:tcBorders>
+            <w:tcMar>
+              <w:top w:type="dxa" w:w="50"/>
+              <w:left w:type="dxa" w:w="80"/>
+              <w:bottom w:type="dxa" w:w="50"/>
+              <w:right w:type="dxa" w:w="80"/>
+            </w:tcMar>
+            <w:vAlign w:val="center"/>
+          </w:tcPr>
+          <w:p>
+            <w:pPr>
+              <w:spacing w:after="0" w:line="230"/>
+              <w:jc w:val="left"/>
+            </w:pPr>
+            <w:r>
+              <w:rPr>
+                <w:rFonts w:ascii="Arial" w:cs="Arial" w:eastAsia="Arial" w:hAnsi="Arial"/>
+                <w:b/>
+                <w:bCs/>
+                <w:sz w:val="17"/>
+                <w:szCs w:val="17"/>
+              </w:rPr>
+              <w:t xml:space="preserve">24 oct</w:t>
+            </w:r>
+          </w:p>
+        </w:tc>
+        <w:tc>
+          <w:tcPr>
+            <w:tcW w:type="dxa" w:w="1100"/>
+            <w:tcBorders>
+              <w:top w:val="single" w:color="C9D1DB" w:sz="4"/>
+              <w:left w:val="single" w:color="C9D1DB" w:sz="4"/>
+              <w:bottom w:val="single" w:color="C9D1DB" w:sz="4"/>
+              <w:right w:val="single" w:color="C9D1DB" w:sz="4"/>
+            </w:tcBorders>
+            <w:tcMar>
+              <w:top w:type="dxa" w:w="50"/>
+              <w:left w:type="dxa" w:w="80"/>
+              <w:bottom w:type="dxa" w:w="50"/>
+              <w:right w:type="dxa" w:w="80"/>
+            </w:tcMar>
+            <w:vAlign w:val="center"/>
+          </w:tcPr>
+          <w:p>
+            <w:pPr>
+              <w:spacing w:after="0" w:line="230"/>
+              <w:jc w:val="left"/>
+            </w:pPr>
+            <w:r>
+              <w:rPr>
+                <w:rFonts w:ascii="Arial" w:cs="Arial" w:eastAsia="Arial" w:hAnsi="Arial"/>
+                <w:sz w:val="17"/>
+                <w:szCs w:val="17"/>
+              </w:rPr>
+              <w:t xml:space="preserve">892f1e0</w:t>
+            </w:r>
+          </w:p>
+        </w:tc>
+        <w:tc>
+          <w:tcPr>
+            <w:tcW w:type="dxa" w:w="1900"/>
+            <w:tcBorders>
+              <w:top w:val="single" w:color="C9D1DB" w:sz="4"/>
+              <w:left w:val="single" w:color="C9D1DB" w:sz="4"/>
+              <w:bottom w:val="single" w:color="C9D1DB" w:sz="4"/>
+              <w:right w:val="single" w:color="C9D1DB" w:sz="4"/>
+            </w:tcBorders>
+            <w:tcMar>
+              <w:top w:type="dxa" w:w="50"/>
+              <w:left w:type="dxa" w:w="80"/>
+              <w:bottom w:type="dxa" w:w="50"/>
+              <w:right w:type="dxa" w:w="80"/>
+            </w:tcMar>
+            <w:vAlign w:val="center"/>
+          </w:tcPr>
+          <w:p>
+            <w:pPr>
+              <w:spacing w:after="0" w:line="230"/>
+              <w:jc w:val="left"/>
+            </w:pPr>
+            <w:r>
+              <w:rPr>
+                <w:rFonts w:ascii="Arial" w:cs="Arial" w:eastAsia="Arial" w:hAnsi="Arial"/>
+                <w:sz w:val="17"/>
+                <w:szCs w:val="17"/>
+              </w:rPr>
+              <w:t xml:space="preserve">Claude Code</w:t>
+            </w:r>
+          </w:p>
+        </w:tc>
+        <w:tc>
+          <w:tcPr>
+            <w:tcW w:type="dxa" w:w="5460"/>
+            <w:tcBorders>
+              <w:top w:val="single" w:color="C9D1DB" w:sz="4"/>
+              <w:left w:val="single" w:color="C9D1DB" w:sz="4"/>
+              <w:bottom w:val="single" w:color="C9D1DB" w:sz="4"/>
+              <w:right w:val="single" w:color="C9D1DB" w:sz="4"/>
+            </w:tcBorders>
+            <w:tcMar>
+              <w:top w:type="dxa" w:w="50"/>
+              <w:left w:type="dxa" w:w="80"/>
+              <w:bottom w:type="dxa" w:w="50"/>
+              <w:right w:type="dxa" w:w="80"/>
+            </w:tcMar>
+            <w:vAlign w:val="center"/>
+          </w:tcPr>
+          <w:p>
+            <w:pPr>
+              <w:spacing w:after="0" w:line="230"/>
+              <w:jc w:val="left"/>
+            </w:pPr>
+            <w:r>
+              <w:rPr>
+                <w:rFonts w:ascii="Arial" w:cs="Arial" w:eastAsia="Arial" w:hAnsi="Arial"/>
+                <w:sz w:val="17"/>
+                <w:szCs w:val="17"/>
+              </w:rPr>
+              <w:t xml:space="preserve">Informe final con generador y paginación automática</w:t>
+            </w:r>
+          </w:p>
+        </w:tc>
+      </w:tr>
+      <w:tr>
+        <w:trPr>
+          <w:cantSplit/>
+        </w:trPr>
+        <w:tc>
+          <w:tcPr>
+            <w:tcW w:type="dxa" w:w="900"/>
+            <w:tcBorders>
+              <w:top w:val="single" w:color="C9D1DB" w:sz="4"/>
+              <w:left w:val="single" w:color="C9D1DB" w:sz="4"/>
+              <w:bottom w:val="single" w:color="C9D1DB" w:sz="4"/>
+              <w:right w:val="single" w:color="C9D1DB" w:sz="4"/>
+            </w:tcBorders>
+            <w:shd w:fill="F3F6FA" w:color="auto" w:val="clear"/>
+            <w:tcMar>
+              <w:top w:type="dxa" w:w="50"/>
+              <w:left w:type="dxa" w:w="80"/>
+              <w:bottom w:type="dxa" w:w="50"/>
+              <w:right w:type="dxa" w:w="80"/>
+            </w:tcMar>
+            <w:vAlign w:val="center"/>
+          </w:tcPr>
+          <w:p>
+            <w:pPr>
+              <w:spacing w:after="0" w:line="230"/>
+              <w:jc w:val="left"/>
+            </w:pPr>
+            <w:r>
+              <w:rPr>
+                <w:rFonts w:ascii="Arial" w:cs="Arial" w:eastAsia="Arial" w:hAnsi="Arial"/>
+                <w:b/>
+                <w:bCs/>
+                <w:sz w:val="17"/>
+                <w:szCs w:val="17"/>
+              </w:rPr>
+              <w:t xml:space="preserve">26 oct</w:t>
+            </w:r>
+          </w:p>
+        </w:tc>
+        <w:tc>
+          <w:tcPr>
+            <w:tcW w:type="dxa" w:w="1100"/>
+            <w:tcBorders>
+              <w:top w:val="single" w:color="C9D1DB" w:sz="4"/>
+              <w:left w:val="single" w:color="C9D1DB" w:sz="4"/>
+              <w:bottom w:val="single" w:color="C9D1DB" w:sz="4"/>
+              <w:right w:val="single" w:color="C9D1DB" w:sz="4"/>
+            </w:tcBorders>
+            <w:shd w:fill="F3F6FA" w:color="auto" w:val="clear"/>
+            <w:tcMar>
+              <w:top w:type="dxa" w:w="50"/>
+              <w:left w:type="dxa" w:w="80"/>
+              <w:bottom w:type="dxa" w:w="50"/>
+              <w:right w:type="dxa" w:w="80"/>
+            </w:tcMar>
+            <w:vAlign w:val="center"/>
+          </w:tcPr>
+          <w:p>
+            <w:pPr>
+              <w:spacing w:after="0" w:line="230"/>
+              <w:jc w:val="left"/>
+            </w:pPr>
+            <w:r>
+              <w:rPr>
+                <w:rFonts w:ascii="Arial" w:cs="Arial" w:eastAsia="Arial" w:hAnsi="Arial"/>
+                <w:sz w:val="17"/>
+                <w:szCs w:val="17"/>
+              </w:rPr>
+              <w:t xml:space="preserve">c7e3197</w:t>
+            </w:r>
+          </w:p>
+        </w:tc>
+        <w:tc>
+          <w:tcPr>
+            <w:tcW w:type="dxa" w:w="1900"/>
+            <w:tcBorders>
+              <w:top w:val="single" w:color="C9D1DB" w:sz="4"/>
+              <w:left w:val="single" w:color="C9D1DB" w:sz="4"/>
+              <w:bottom w:val="single" w:color="C9D1DB" w:sz="4"/>
+              <w:right w:val="single" w:color="C9D1DB" w:sz="4"/>
+            </w:tcBorders>
+            <w:shd w:fill="F3F6FA" w:color="auto" w:val="clear"/>
+            <w:tcMar>
+              <w:top w:type="dxa" w:w="50"/>
+              <w:left w:type="dxa" w:w="80"/>
+              <w:bottom w:type="dxa" w:w="50"/>
+              <w:right w:type="dxa" w:w="80"/>
+            </w:tcMar>
+            <w:vAlign w:val="center"/>
+          </w:tcPr>
+          <w:p>
+            <w:pPr>
+              <w:spacing w:after="0" w:line="230"/>
+              <w:jc w:val="left"/>
+            </w:pPr>
+            <w:r>
+              <w:rPr>
+                <w:rFonts w:ascii="Arial" w:cs="Arial" w:eastAsia="Arial" w:hAnsi="Arial"/>
+                <w:sz w:val="17"/>
+                <w:szCs w:val="17"/>
+              </w:rPr>
+              <w:t xml:space="preserve">Codex</w:t>
+            </w:r>
+          </w:p>
+        </w:tc>
+        <w:tc>
+          <w:tcPr>
+            <w:tcW w:type="dxa" w:w="5460"/>
+            <w:tcBorders>
+              <w:top w:val="single" w:color="C9D1DB" w:sz="4"/>
+              <w:left w:val="single" w:color="C9D1DB" w:sz="4"/>
+              <w:bottom w:val="single" w:color="C9D1DB" w:sz="4"/>
+              <w:right w:val="single" w:color="C9D1DB" w:sz="4"/>
+            </w:tcBorders>
+            <w:shd w:fill="F3F6FA" w:color="auto" w:val="clear"/>
+            <w:tcMar>
+              <w:top w:type="dxa" w:w="50"/>
+              <w:left w:type="dxa" w:w="80"/>
+              <w:bottom w:type="dxa" w:w="50"/>
+              <w:right w:type="dxa" w:w="80"/>
+            </w:tcMar>
+            <w:vAlign w:val="center"/>
+          </w:tcPr>
+          <w:p>
+            <w:pPr>
+              <w:spacing w:after="0" w:line="230"/>
+              <w:jc w:val="left"/>
+            </w:pPr>
+            <w:r>
+              <w:rPr>
+                <w:rFonts w:ascii="Arial" w:cs="Arial" w:eastAsia="Arial" w:hAnsi="Arial"/>
+                <w:sz w:val="17"/>
+                <w:szCs w:val="17"/>
+              </w:rPr>
+              <w:t xml:space="preserve">Ridge en el prototipo, 20 pruebas, GitHub Actions y Pages</w:t>
+            </w:r>
+          </w:p>
+        </w:tc>
+      </w:tr>
+      <w:tr>
+        <w:trPr>
+          <w:cantSplit/>
+        </w:trPr>
+        <w:tc>
+          <w:tcPr>
+            <w:tcW w:type="dxa" w:w="900"/>
+            <w:tcBorders>
+              <w:top w:val="single" w:color="C9D1DB" w:sz="4"/>
+              <w:left w:val="single" w:color="C9D1DB" w:sz="4"/>
+              <w:bottom w:val="single" w:color="C9D1DB" w:sz="4"/>
+              <w:right w:val="single" w:color="C9D1DB" w:sz="4"/>
+            </w:tcBorders>
+            <w:tcMar>
+              <w:top w:type="dxa" w:w="50"/>
+              <w:left w:type="dxa" w:w="80"/>
+              <w:bottom w:type="dxa" w:w="50"/>
+              <w:right w:type="dxa" w:w="80"/>
+            </w:tcMar>
+            <w:vAlign w:val="center"/>
+          </w:tcPr>
+          <w:p>
+            <w:pPr>
+              <w:spacing w:after="0" w:line="230"/>
+              <w:jc w:val="left"/>
+            </w:pPr>
+            <w:r>
+              <w:rPr>
+                <w:rFonts w:ascii="Arial" w:cs="Arial" w:eastAsia="Arial" w:hAnsi="Arial"/>
+                <w:b/>
+                <w:bCs/>
+                <w:sz w:val="17"/>
+                <w:szCs w:val="17"/>
+              </w:rPr>
+              <w:t xml:space="preserve">27 oct</w:t>
+            </w:r>
+          </w:p>
+        </w:tc>
+        <w:tc>
+          <w:tcPr>
+            <w:tcW w:type="dxa" w:w="1100"/>
+            <w:tcBorders>
+              <w:top w:val="single" w:color="C9D1DB" w:sz="4"/>
+              <w:left w:val="single" w:color="C9D1DB" w:sz="4"/>
+              <w:bottom w:val="single" w:color="C9D1DB" w:sz="4"/>
+              <w:right w:val="single" w:color="C9D1DB" w:sz="4"/>
+            </w:tcBorders>
+            <w:tcMar>
+              <w:top w:type="dxa" w:w="50"/>
+              <w:left w:type="dxa" w:w="80"/>
+              <w:bottom w:type="dxa" w:w="50"/>
+              <w:right w:type="dxa" w:w="80"/>
+            </w:tcMar>
+            <w:vAlign w:val="center"/>
+          </w:tcPr>
+          <w:p>
+            <w:pPr>
+              <w:spacing w:after="0" w:line="230"/>
+              <w:jc w:val="left"/>
+            </w:pPr>
+            <w:r>
+              <w:rPr>
+                <w:rFonts w:ascii="Arial" w:cs="Arial" w:eastAsia="Arial" w:hAnsi="Arial"/>
+                <w:sz w:val="17"/>
+                <w:szCs w:val="17"/>
+              </w:rPr>
+              <w:t xml:space="preserve">69be75f</w:t>
+            </w:r>
+          </w:p>
+        </w:tc>
+        <w:tc>
+          <w:tcPr>
+            <w:tcW w:type="dxa" w:w="1900"/>
+            <w:tcBorders>
+              <w:top w:val="single" w:color="C9D1DB" w:sz="4"/>
+              <w:left w:val="single" w:color="C9D1DB" w:sz="4"/>
+              <w:bottom w:val="single" w:color="C9D1DB" w:sz="4"/>
+              <w:right w:val="single" w:color="C9D1DB" w:sz="4"/>
+            </w:tcBorders>
+            <w:tcMar>
+              <w:top w:type="dxa" w:w="50"/>
+              <w:left w:type="dxa" w:w="80"/>
+              <w:bottom w:type="dxa" w:w="50"/>
+              <w:right w:type="dxa" w:w="80"/>
+            </w:tcMar>
+            <w:vAlign w:val="center"/>
+          </w:tcPr>
+          <w:p>
+            <w:pPr>
+              <w:spacing w:after="0" w:line="230"/>
+              <w:jc w:val="left"/>
+            </w:pPr>
+            <w:r>
+              <w:rPr>
+                <w:rFonts w:ascii="Arial" w:cs="Arial" w:eastAsia="Arial" w:hAnsi="Arial"/>
+                <w:sz w:val="17"/>
+                <w:szCs w:val="17"/>
+              </w:rPr>
+              <w:t xml:space="preserve">Codex</w:t>
+            </w:r>
+          </w:p>
+        </w:tc>
+        <w:tc>
+          <w:tcPr>
+            <w:tcW w:type="dxa" w:w="5460"/>
+            <w:tcBorders>
+              <w:top w:val="single" w:color="C9D1DB" w:sz="4"/>
+              <w:left w:val="single" w:color="C9D1DB" w:sz="4"/>
+              <w:bottom w:val="single" w:color="C9D1DB" w:sz="4"/>
+              <w:right w:val="single" w:color="C9D1DB" w:sz="4"/>
+            </w:tcBorders>
+            <w:tcMar>
+              <w:top w:type="dxa" w:w="50"/>
+              <w:left w:type="dxa" w:w="80"/>
+              <w:bottom w:type="dxa" w:w="50"/>
+              <w:right w:type="dxa" w:w="80"/>
+            </w:tcMar>
+            <w:vAlign w:val="center"/>
+          </w:tcPr>
+          <w:p>
+            <w:pPr>
+              <w:spacing w:after="0" w:line="230"/>
+              <w:jc w:val="left"/>
+            </w:pPr>
+            <w:r>
+              <w:rPr>
+                <w:rFonts w:ascii="Arial" w:cs="Arial" w:eastAsia="Arial" w:hAnsi="Arial"/>
+                <w:sz w:val="17"/>
+                <w:szCs w:val="17"/>
+              </w:rPr>
+              <w:t xml:space="preserve">Registro de la reproducción en limpio, con tiempos y límites</w:t>
+            </w:r>
+          </w:p>
+        </w:tc>
+      </w:tr>
+      <w:tr>
+        <w:trPr>
+          <w:cantSplit/>
+        </w:trPr>
+        <w:tc>
+          <w:tcPr>
+            <w:tcW w:type="dxa" w:w="900"/>
+            <w:tcBorders>
+              <w:top w:val="single" w:color="C9D1DB" w:sz="4"/>
+              <w:left w:val="single" w:color="C9D1DB" w:sz="4"/>
+              <w:bottom w:val="single" w:color="C9D1DB" w:sz="4"/>
+              <w:right w:val="single" w:color="C9D1DB" w:sz="4"/>
+            </w:tcBorders>
+            <w:shd w:fill="F3F6FA" w:color="auto" w:val="clear"/>
+            <w:tcMar>
+              <w:top w:type="dxa" w:w="50"/>
+              <w:left w:type="dxa" w:w="80"/>
+              <w:bottom w:type="dxa" w:w="50"/>
+              <w:right w:type="dxa" w:w="80"/>
+            </w:tcMar>
+            <w:vAlign w:val="center"/>
+          </w:tcPr>
+          <w:p>
+            <w:pPr>
+              <w:spacing w:after="0" w:line="230"/>
+              <w:jc w:val="left"/>
+            </w:pPr>
+            <w:r>
+              <w:rPr>
+                <w:rFonts w:ascii="Arial" w:cs="Arial" w:eastAsia="Arial" w:hAnsi="Arial"/>
+                <w:b/>
+                <w:bCs/>
+                <w:sz w:val="17"/>
+                <w:szCs w:val="17"/>
+              </w:rPr>
+              <w:t xml:space="preserve">27 oct</w:t>
+            </w:r>
+          </w:p>
+        </w:tc>
+        <w:tc>
+          <w:tcPr>
+            <w:tcW w:type="dxa" w:w="1100"/>
+            <w:tcBorders>
+              <w:top w:val="single" w:color="C9D1DB" w:sz="4"/>
+              <w:left w:val="single" w:color="C9D1DB" w:sz="4"/>
+              <w:bottom w:val="single" w:color="C9D1DB" w:sz="4"/>
+              <w:right w:val="single" w:color="C9D1DB" w:sz="4"/>
+            </w:tcBorders>
+            <w:shd w:fill="F3F6FA" w:color="auto" w:val="clear"/>
+            <w:tcMar>
+              <w:top w:type="dxa" w:w="50"/>
+              <w:left w:type="dxa" w:w="80"/>
+              <w:bottom w:type="dxa" w:w="50"/>
+              <w:right w:type="dxa" w:w="80"/>
+            </w:tcMar>
+            <w:vAlign w:val="center"/>
+          </w:tcPr>
+          <w:p>
+            <w:pPr>
+              <w:spacing w:after="0" w:line="230"/>
+              <w:jc w:val="left"/>
+            </w:pPr>
+            <w:r>
+              <w:rPr>
+                <w:rFonts w:ascii="Arial" w:cs="Arial" w:eastAsia="Arial" w:hAnsi="Arial"/>
+                <w:sz w:val="17"/>
+                <w:szCs w:val="17"/>
+              </w:rPr>
+              <w:t xml:space="preserve">e5fc3e1</w:t>
+            </w:r>
+          </w:p>
+        </w:tc>
+        <w:tc>
+          <w:tcPr>
+            <w:tcW w:type="dxa" w:w="1900"/>
+            <w:tcBorders>
+              <w:top w:val="single" w:color="C9D1DB" w:sz="4"/>
+              <w:left w:val="single" w:color="C9D1DB" w:sz="4"/>
+              <w:bottom w:val="single" w:color="C9D1DB" w:sz="4"/>
+              <w:right w:val="single" w:color="C9D1DB" w:sz="4"/>
+            </w:tcBorders>
+            <w:shd w:fill="F3F6FA" w:color="auto" w:val="clear"/>
+            <w:tcMar>
+              <w:top w:type="dxa" w:w="50"/>
+              <w:left w:type="dxa" w:w="80"/>
+              <w:bottom w:type="dxa" w:w="50"/>
+              <w:right w:type="dxa" w:w="80"/>
+            </w:tcMar>
+            <w:vAlign w:val="center"/>
+          </w:tcPr>
+          <w:p>
+            <w:pPr>
+              <w:spacing w:after="0" w:line="230"/>
+              <w:jc w:val="left"/>
+            </w:pPr>
+            <w:r>
+              <w:rPr>
+                <w:rFonts w:ascii="Arial" w:cs="Arial" w:eastAsia="Arial" w:hAnsi="Arial"/>
+                <w:sz w:val="17"/>
+                <w:szCs w:val="17"/>
+              </w:rPr>
+              <w:t xml:space="preserve">Equipo y Claude Code</w:t>
+            </w:r>
+          </w:p>
+        </w:tc>
+        <w:tc>
+          <w:tcPr>
+            <w:tcW w:type="dxa" w:w="5460"/>
+            <w:tcBorders>
+              <w:top w:val="single" w:color="C9D1DB" w:sz="4"/>
+              <w:left w:val="single" w:color="C9D1DB" w:sz="4"/>
+              <w:bottom w:val="single" w:color="C9D1DB" w:sz="4"/>
+              <w:right w:val="single" w:color="C9D1DB" w:sz="4"/>
+            </w:tcBorders>
+            <w:shd w:fill="F3F6FA" w:color="auto" w:val="clear"/>
+            <w:tcMar>
+              <w:top w:type="dxa" w:w="50"/>
+              <w:left w:type="dxa" w:w="80"/>
+              <w:bottom w:type="dxa" w:w="50"/>
+              <w:right w:type="dxa" w:w="80"/>
+            </w:tcMar>
+            <w:vAlign w:val="center"/>
+          </w:tcPr>
+          <w:p>
+            <w:pPr>
+              <w:spacing w:after="0" w:line="230"/>
+              <w:jc w:val="left"/>
+            </w:pPr>
+            <w:r>
+              <w:rPr>
+                <w:rFonts w:ascii="Arial" w:cs="Arial" w:eastAsia="Arial" w:hAnsi="Arial"/>
+                <w:sz w:val="17"/>
+                <w:szCs w:val="17"/>
+              </w:rPr>
+              <w:t xml:space="preserve">Integración de la rama de Codex tras revisar el diff; 20/20 pruebas</w:t>
+            </w:r>
+          </w:p>
+        </w:tc>
+      </w:tr>
+    </w:tbl>
+    <w:p>
+      <w:pPr>
+        <w:spacing w:after="160" w:before="60" w:line="240"/>
+        <w:jc w:val="left"/>
+      </w:pPr>
+      <w:r>
+        <w:rPr>
+          <w:rFonts w:ascii="Arial" w:cs="Arial" w:eastAsia="Arial" w:hAnsi="Arial"/>
+          <w:i/>
+          <w:iCs/>
+          <w:color w:val="4B5563"/>
+          <w:sz w:val="17"/>
+          <w:szCs w:val="17"/>
+        </w:rPr>
+        <w:t xml:space="preserve">Nota. </w:t>
+      </w:r>
+      <w:r>
+        <w:rPr>
+          <w:rFonts w:ascii="Arial" w:cs="Arial" w:eastAsia="Arial" w:hAnsi="Arial"/>
+          <w:color w:val="4B5563"/>
+          <w:sz w:val="17"/>
+          <w:szCs w:val="17"/>
+        </w:rPr>
+        <w:t xml:space="preserve">Elaboración propia.</w:t>
+      </w:r>
+    </w:p>
+    <w:p>
+      <w:pPr>
+        <w:keepNext/>
+        <w:spacing w:after="0" w:before="160"/>
+      </w:pPr>
+      <w:r>
+        <w:rPr>
+          <w:rFonts w:ascii="Arial" w:cs="Arial" w:eastAsia="Arial" w:hAnsi="Arial"/>
+          <w:b/>
+          <w:bCs/>
+          <w:color w:val="1F2A44"/>
+          <w:sz w:val="20"/>
+          <w:szCs w:val="20"/>
+        </w:rPr>
+        <w:t xml:space="preserve">Tabla K2</w:t>
+      </w:r>
+    </w:p>
+    <w:p>
+      <w:pPr>
+        <w:keepNext/>
+        <w:spacing w:after="80"/>
+      </w:pPr>
+      <w:r>
+        <w:rPr>
+          <w:rFonts w:ascii="Arial" w:cs="Arial" w:eastAsia="Arial" w:hAnsi="Arial"/>
+          <w:i/>
+          <w:iCs/>
+          <w:color w:val="1F2A44"/>
+          <w:sz w:val="20"/>
+          <w:szCs w:val="20"/>
+        </w:rPr>
+        <w:t xml:space="preserve">Reproducción independiente realizada por Codex</w:t>
+      </w:r>
+    </w:p>
+    <w:tbl>
+      <w:tblPr>
+        <w:tblW w:type="dxa" w:w="9360"/>
+        <w:tblBorders>
+          <w:top w:val="single" w:color="auto" w:sz="4"/>
+          <w:left w:val="single" w:color="auto" w:sz="4"/>
+          <w:bottom w:val="single" w:color="auto" w:sz="4"/>
+          <w:right w:val="single" w:color="auto" w:sz="4"/>
+          <w:insideH w:val="single" w:color="auto" w:sz="4"/>
+          <w:insideV w:val="single" w:color="auto" w:sz="4"/>
+        </w:tblBorders>
+      </w:tblPr>
+      <w:tblGrid>
+        <w:gridCol w:w="4560"/>
+        <w:gridCol w:w="1400"/>
+        <w:gridCol w:w="3400"/>
+      </w:tblGrid>
+      <w:tr>
+        <w:trPr>
+          <w:tblHeader/>
+        </w:trPr>
+        <w:tc>
+          <w:tcPr>
+            <w:tcW w:type="dxa" w:w="4560"/>
+            <w:tcBorders>
+              <w:top w:val="single" w:color="C9D1DB" w:sz="4"/>
+              <w:left w:val="single" w:color="C9D1DB" w:sz="4"/>
+              <w:bottom w:val="single" w:color="C9D1DB" w:sz="4"/>
+              <w:right w:val="single" w:color="C9D1DB" w:sz="4"/>
+            </w:tcBorders>
+            <w:shd w:fill="1F2A44" w:color="auto" w:val="clear"/>
+            <w:tcMar>
+              <w:top w:type="dxa" w:w="50"/>
+              <w:left w:type="dxa" w:w="80"/>
+              <w:bottom w:type="dxa" w:w="50"/>
+              <w:right w:type="dxa" w:w="80"/>
+            </w:tcMar>
+            <w:vAlign w:val="center"/>
+          </w:tcPr>
+          <w:p>
+            <w:pPr>
+              <w:spacing w:after="0" w:line="230"/>
+              <w:jc w:val="left"/>
+            </w:pPr>
+            <w:r>
+              <w:rPr>
+                <w:rFonts w:ascii="Arial" w:cs="Arial" w:eastAsia="Arial" w:hAnsi="Arial"/>
+                <w:b/>
+                <w:bCs/>
+                <w:color w:val="FFFFFF"/>
+                <w:sz w:val="17"/>
+                <w:szCs w:val="17"/>
+              </w:rPr>
+              <w:t xml:space="preserve">Paso de la reproducción en limpio</w:t>
+            </w:r>
+          </w:p>
+        </w:tc>
+        <w:tc>
+          <w:tcPr>
+            <w:tcW w:type="dxa" w:w="1400"/>
+            <w:tcBorders>
+              <w:top w:val="single" w:color="C9D1DB" w:sz="4"/>
+              <w:left w:val="single" w:color="C9D1DB" w:sz="4"/>
+              <w:bottom w:val="single" w:color="C9D1DB" w:sz="4"/>
+              <w:right w:val="single" w:color="C9D1DB" w:sz="4"/>
+            </w:tcBorders>
+            <w:shd w:fill="1F2A44" w:color="auto" w:val="clear"/>
+            <w:tcMar>
+              <w:top w:type="dxa" w:w="50"/>
+              <w:left w:type="dxa" w:w="80"/>
+              <w:bottom w:type="dxa" w:w="50"/>
+              <w:right w:type="dxa" w:w="80"/>
+            </w:tcMar>
+            <w:vAlign w:val="center"/>
+          </w:tcPr>
+          <w:p>
+            <w:pPr>
+              <w:spacing w:after="0" w:line="230"/>
+              <w:jc w:val="left"/>
+            </w:pPr>
+            <w:r>
+              <w:rPr>
+                <w:rFonts w:ascii="Arial" w:cs="Arial" w:eastAsia="Arial" w:hAnsi="Arial"/>
+                <w:b/>
+                <w:bCs/>
+                <w:color w:val="FFFFFF"/>
+                <w:sz w:val="17"/>
+                <w:szCs w:val="17"/>
+              </w:rPr>
+              <w:t xml:space="preserve">Tiempo</w:t>
+            </w:r>
+          </w:p>
+        </w:tc>
+        <w:tc>
+          <w:tcPr>
+            <w:tcW w:type="dxa" w:w="3400"/>
+            <w:tcBorders>
+              <w:top w:val="single" w:color="C9D1DB" w:sz="4"/>
+              <w:left w:val="single" w:color="C9D1DB" w:sz="4"/>
+              <w:bottom w:val="single" w:color="C9D1DB" w:sz="4"/>
+              <w:right w:val="single" w:color="C9D1DB" w:sz="4"/>
+            </w:tcBorders>
+            <w:shd w:fill="1F2A44" w:color="auto" w:val="clear"/>
+            <w:tcMar>
+              <w:top w:type="dxa" w:w="50"/>
+              <w:left w:type="dxa" w:w="80"/>
+              <w:bottom w:type="dxa" w:w="50"/>
+              <w:right w:type="dxa" w:w="80"/>
+            </w:tcMar>
+            <w:vAlign w:val="center"/>
+          </w:tcPr>
+          <w:p>
+            <w:pPr>
+              <w:spacing w:after="0" w:line="230"/>
+              <w:jc w:val="left"/>
+            </w:pPr>
+            <w:r>
+              <w:rPr>
+                <w:rFonts w:ascii="Arial" w:cs="Arial" w:eastAsia="Arial" w:hAnsi="Arial"/>
+                <w:b/>
+                <w:bCs/>
+                <w:color w:val="FFFFFF"/>
+                <w:sz w:val="17"/>
+                <w:szCs w:val="17"/>
+              </w:rPr>
+              <w:t xml:space="preserve">Resultado</w:t>
+            </w:r>
+          </w:p>
+        </w:tc>
+      </w:tr>
+      <w:tr>
+        <w:trPr>
+          <w:cantSplit/>
+        </w:trPr>
+        <w:tc>
+          <w:tcPr>
+            <w:tcW w:type="dxa" w:w="4560"/>
+            <w:tcBorders>
+              <w:top w:val="single" w:color="C9D1DB" w:sz="4"/>
+              <w:left w:val="single" w:color="C9D1DB" w:sz="4"/>
+              <w:bottom w:val="single" w:color="C9D1DB" w:sz="4"/>
+              <w:right w:val="single" w:color="C9D1DB" w:sz="4"/>
+            </w:tcBorders>
+            <w:tcMar>
+              <w:top w:type="dxa" w:w="50"/>
+              <w:left w:type="dxa" w:w="80"/>
+              <w:bottom w:type="dxa" w:w="50"/>
+              <w:right w:type="dxa" w:w="80"/>
+            </w:tcMar>
+            <w:vAlign w:val="center"/>
+          </w:tcPr>
+          <w:p>
+            <w:pPr>
+              <w:spacing w:after="0" w:line="230"/>
+              <w:jc w:val="left"/>
+            </w:pPr>
+            <w:r>
+              <w:rPr>
+                <w:rFonts w:ascii="Arial" w:cs="Arial" w:eastAsia="Arial" w:hAnsi="Arial"/>
+                <w:b/>
+                <w:bCs/>
+                <w:sz w:val="17"/>
+                <w:szCs w:val="17"/>
+              </w:rPr>
+              <w:t xml:space="preserve">Simulación de 3.045 jornadas (dataset.py)</w:t>
+            </w:r>
+          </w:p>
+        </w:tc>
+        <w:tc>
+          <w:tcPr>
+            <w:tcW w:type="dxa" w:w="1400"/>
+            <w:tcBorders>
+              <w:top w:val="single" w:color="C9D1DB" w:sz="4"/>
+              <w:left w:val="single" w:color="C9D1DB" w:sz="4"/>
+              <w:bottom w:val="single" w:color="C9D1DB" w:sz="4"/>
+              <w:right w:val="single" w:color="C9D1DB" w:sz="4"/>
+            </w:tcBorders>
+            <w:tcMar>
+              <w:top w:type="dxa" w:w="50"/>
+              <w:left w:type="dxa" w:w="80"/>
+              <w:bottom w:type="dxa" w:w="50"/>
+              <w:right w:type="dxa" w:w="80"/>
+            </w:tcMar>
+            <w:vAlign w:val="center"/>
+          </w:tcPr>
+          <w:p>
+            <w:pPr>
+              <w:spacing w:after="0" w:line="230"/>
+              <w:jc w:val="left"/>
+            </w:pPr>
+            <w:r>
+              <w:rPr>
+                <w:rFonts w:ascii="Arial" w:cs="Arial" w:eastAsia="Arial" w:hAnsi="Arial"/>
+                <w:sz w:val="17"/>
+                <w:szCs w:val="17"/>
+              </w:rPr>
+              <w:t xml:space="preserve">59 s</w:t>
+            </w:r>
+          </w:p>
+        </w:tc>
+        <w:tc>
+          <w:tcPr>
+            <w:tcW w:type="dxa" w:w="3400"/>
+            <w:tcBorders>
+              <w:top w:val="single" w:color="C9D1DB" w:sz="4"/>
+              <w:left w:val="single" w:color="C9D1DB" w:sz="4"/>
+              <w:bottom w:val="single" w:color="C9D1DB" w:sz="4"/>
+              <w:right w:val="single" w:color="C9D1DB" w:sz="4"/>
+            </w:tcBorders>
+            <w:tcMar>
+              <w:top w:type="dxa" w:w="50"/>
+              <w:left w:type="dxa" w:w="80"/>
+              <w:bottom w:type="dxa" w:w="50"/>
+              <w:right w:type="dxa" w:w="80"/>
+            </w:tcMar>
+            <w:vAlign w:val="center"/>
+          </w:tcPr>
+          <w:p>
+            <w:pPr>
+              <w:spacing w:after="0" w:line="230"/>
+              <w:jc w:val="left"/>
+            </w:pPr>
+            <w:r>
+              <w:rPr>
+                <w:rFonts w:ascii="Arial" w:cs="Arial" w:eastAsia="Arial" w:hAnsi="Arial"/>
+                <w:sz w:val="17"/>
+                <w:szCs w:val="17"/>
+              </w:rPr>
+              <w:t xml:space="preserve">Completado</w:t>
+            </w:r>
+          </w:p>
+        </w:tc>
+      </w:tr>
+      <w:tr>
+        <w:trPr>
+          <w:cantSplit/>
+        </w:trPr>
+        <w:tc>
+          <w:tcPr>
+            <w:tcW w:type="dxa" w:w="4560"/>
+            <w:tcBorders>
+              <w:top w:val="single" w:color="C9D1DB" w:sz="4"/>
+              <w:left w:val="single" w:color="C9D1DB" w:sz="4"/>
+              <w:bottom w:val="single" w:color="C9D1DB" w:sz="4"/>
+              <w:right w:val="single" w:color="C9D1DB" w:sz="4"/>
+            </w:tcBorders>
+            <w:shd w:fill="F3F6FA" w:color="auto" w:val="clear"/>
+            <w:tcMar>
+              <w:top w:type="dxa" w:w="50"/>
+              <w:left w:type="dxa" w:w="80"/>
+              <w:bottom w:type="dxa" w:w="50"/>
+              <w:right w:type="dxa" w:w="80"/>
+            </w:tcMar>
+            <w:vAlign w:val="center"/>
+          </w:tcPr>
+          <w:p>
+            <w:pPr>
+              <w:spacing w:after="0" w:line="230"/>
+              <w:jc w:val="left"/>
+            </w:pPr>
+            <w:r>
+              <w:rPr>
+                <w:rFonts w:ascii="Arial" w:cs="Arial" w:eastAsia="Arial" w:hAnsi="Arial"/>
+                <w:b/>
+                <w:bCs/>
+                <w:sz w:val="17"/>
+                <w:szCs w:val="17"/>
+              </w:rPr>
+              <w:t xml:space="preserve">Calibración contra FASTSim</w:t>
+            </w:r>
+          </w:p>
+        </w:tc>
+        <w:tc>
+          <w:tcPr>
+            <w:tcW w:type="dxa" w:w="1400"/>
+            <w:tcBorders>
+              <w:top w:val="single" w:color="C9D1DB" w:sz="4"/>
+              <w:left w:val="single" w:color="C9D1DB" w:sz="4"/>
+              <w:bottom w:val="single" w:color="C9D1DB" w:sz="4"/>
+              <w:right w:val="single" w:color="C9D1DB" w:sz="4"/>
+            </w:tcBorders>
+            <w:shd w:fill="F3F6FA" w:color="auto" w:val="clear"/>
+            <w:tcMar>
+              <w:top w:type="dxa" w:w="50"/>
+              <w:left w:type="dxa" w:w="80"/>
+              <w:bottom w:type="dxa" w:w="50"/>
+              <w:right w:type="dxa" w:w="80"/>
+            </w:tcMar>
+            <w:vAlign w:val="center"/>
+          </w:tcPr>
+          <w:p>
+            <w:pPr>
+              <w:spacing w:after="0" w:line="230"/>
+              <w:jc w:val="left"/>
+            </w:pPr>
+            <w:r>
+              <w:rPr>
+                <w:rFonts w:ascii="Arial" w:cs="Arial" w:eastAsia="Arial" w:hAnsi="Arial"/>
+                <w:sz w:val="17"/>
+                <w:szCs w:val="17"/>
+              </w:rPr>
+              <w:t xml:space="preserve">4 s</w:t>
+            </w:r>
+          </w:p>
+        </w:tc>
+        <w:tc>
+          <w:tcPr>
+            <w:tcW w:type="dxa" w:w="3400"/>
+            <w:tcBorders>
+              <w:top w:val="single" w:color="C9D1DB" w:sz="4"/>
+              <w:left w:val="single" w:color="C9D1DB" w:sz="4"/>
+              <w:bottom w:val="single" w:color="C9D1DB" w:sz="4"/>
+              <w:right w:val="single" w:color="C9D1DB" w:sz="4"/>
+            </w:tcBorders>
+            <w:shd w:fill="F3F6FA" w:color="auto" w:val="clear"/>
+            <w:tcMar>
+              <w:top w:type="dxa" w:w="50"/>
+              <w:left w:type="dxa" w:w="80"/>
+              <w:bottom w:type="dxa" w:w="50"/>
+              <w:right w:type="dxa" w:w="80"/>
+            </w:tcMar>
+            <w:vAlign w:val="center"/>
+          </w:tcPr>
+          <w:p>
+            <w:pPr>
+              <w:spacing w:after="0" w:line="230"/>
+              <w:jc w:val="left"/>
+            </w:pPr>
+            <w:r>
+              <w:rPr>
+                <w:rFonts w:ascii="Arial" w:cs="Arial" w:eastAsia="Arial" w:hAnsi="Arial"/>
+                <w:sz w:val="17"/>
+                <w:szCs w:val="17"/>
+              </w:rPr>
+              <w:t xml:space="preserve">Completado</w:t>
+            </w:r>
+          </w:p>
+        </w:tc>
+      </w:tr>
+      <w:tr>
+        <w:trPr>
+          <w:cantSplit/>
+        </w:trPr>
+        <w:tc>
+          <w:tcPr>
+            <w:tcW w:type="dxa" w:w="4560"/>
+            <w:tcBorders>
+              <w:top w:val="single" w:color="C9D1DB" w:sz="4"/>
+              <w:left w:val="single" w:color="C9D1DB" w:sz="4"/>
+              <w:bottom w:val="single" w:color="C9D1DB" w:sz="4"/>
+              <w:right w:val="single" w:color="C9D1DB" w:sz="4"/>
+            </w:tcBorders>
+            <w:tcMar>
+              <w:top w:type="dxa" w:w="50"/>
+              <w:left w:type="dxa" w:w="80"/>
+              <w:bottom w:type="dxa" w:w="50"/>
+              <w:right w:type="dxa" w:w="80"/>
+            </w:tcMar>
+            <w:vAlign w:val="center"/>
+          </w:tcPr>
+          <w:p>
+            <w:pPr>
+              <w:spacing w:after="0" w:line="230"/>
+              <w:jc w:val="left"/>
+            </w:pPr>
+            <w:r>
+              <w:rPr>
+                <w:rFonts w:ascii="Arial" w:cs="Arial" w:eastAsia="Arial" w:hAnsi="Arial"/>
+                <w:b/>
+                <w:bCs/>
+                <w:sz w:val="17"/>
+                <w:szCs w:val="17"/>
+              </w:rPr>
+              <w:t xml:space="preserve">Modelos, intervalos y validación externa (model.py)</w:t>
+            </w:r>
+          </w:p>
+        </w:tc>
+        <w:tc>
+          <w:tcPr>
+            <w:tcW w:type="dxa" w:w="1400"/>
+            <w:tcBorders>
+              <w:top w:val="single" w:color="C9D1DB" w:sz="4"/>
+              <w:left w:val="single" w:color="C9D1DB" w:sz="4"/>
+              <w:bottom w:val="single" w:color="C9D1DB" w:sz="4"/>
+              <w:right w:val="single" w:color="C9D1DB" w:sz="4"/>
+            </w:tcBorders>
+            <w:tcMar>
+              <w:top w:type="dxa" w:w="50"/>
+              <w:left w:type="dxa" w:w="80"/>
+              <w:bottom w:type="dxa" w:w="50"/>
+              <w:right w:type="dxa" w:w="80"/>
+            </w:tcMar>
+            <w:vAlign w:val="center"/>
+          </w:tcPr>
+          <w:p>
+            <w:pPr>
+              <w:spacing w:after="0" w:line="230"/>
+              <w:jc w:val="left"/>
+            </w:pPr>
+            <w:r>
+              <w:rPr>
+                <w:rFonts w:ascii="Arial" w:cs="Arial" w:eastAsia="Arial" w:hAnsi="Arial"/>
+                <w:sz w:val="17"/>
+                <w:szCs w:val="17"/>
+              </w:rPr>
+              <w:t xml:space="preserve">818 s</w:t>
+            </w:r>
+          </w:p>
+        </w:tc>
+        <w:tc>
+          <w:tcPr>
+            <w:tcW w:type="dxa" w:w="3400"/>
+            <w:tcBorders>
+              <w:top w:val="single" w:color="C9D1DB" w:sz="4"/>
+              <w:left w:val="single" w:color="C9D1DB" w:sz="4"/>
+              <w:bottom w:val="single" w:color="C9D1DB" w:sz="4"/>
+              <w:right w:val="single" w:color="C9D1DB" w:sz="4"/>
+            </w:tcBorders>
+            <w:tcMar>
+              <w:top w:type="dxa" w:w="50"/>
+              <w:left w:type="dxa" w:w="80"/>
+              <w:bottom w:type="dxa" w:w="50"/>
+              <w:right w:type="dxa" w:w="80"/>
+            </w:tcMar>
+            <w:vAlign w:val="center"/>
+          </w:tcPr>
+          <w:p>
+            <w:pPr>
+              <w:spacing w:after="0" w:line="230"/>
+              <w:jc w:val="left"/>
+            </w:pPr>
+            <w:r>
+              <w:rPr>
+                <w:rFonts w:ascii="Arial" w:cs="Arial" w:eastAsia="Arial" w:hAnsi="Arial"/>
+                <w:sz w:val="17"/>
+                <w:szCs w:val="17"/>
+              </w:rPr>
+              <w:t xml:space="preserve">Completado</w:t>
+            </w:r>
+          </w:p>
+        </w:tc>
+      </w:tr>
+      <w:tr>
+        <w:trPr>
+          <w:cantSplit/>
+        </w:trPr>
+        <w:tc>
+          <w:tcPr>
+            <w:tcW w:type="dxa" w:w="4560"/>
+            <w:tcBorders>
+              <w:top w:val="single" w:color="C9D1DB" w:sz="4"/>
+              <w:left w:val="single" w:color="C9D1DB" w:sz="4"/>
+              <w:bottom w:val="single" w:color="C9D1DB" w:sz="4"/>
+              <w:right w:val="single" w:color="C9D1DB" w:sz="4"/>
+            </w:tcBorders>
+            <w:shd w:fill="F3F6FA" w:color="auto" w:val="clear"/>
+            <w:tcMar>
+              <w:top w:type="dxa" w:w="50"/>
+              <w:left w:type="dxa" w:w="80"/>
+              <w:bottom w:type="dxa" w:w="50"/>
+              <w:right w:type="dxa" w:w="80"/>
+            </w:tcMar>
+            <w:vAlign w:val="center"/>
+          </w:tcPr>
+          <w:p>
+            <w:pPr>
+              <w:spacing w:after="0" w:line="230"/>
+              <w:jc w:val="left"/>
+            </w:pPr>
+            <w:r>
+              <w:rPr>
+                <w:rFonts w:ascii="Arial" w:cs="Arial" w:eastAsia="Arial" w:hAnsi="Arial"/>
+                <w:b/>
+                <w:bCs/>
+                <w:sz w:val="17"/>
+                <w:szCs w:val="17"/>
+              </w:rPr>
+              <w:t xml:space="preserve">Validador de la capa generativa</w:t>
+            </w:r>
+          </w:p>
+        </w:tc>
+        <w:tc>
+          <w:tcPr>
+            <w:tcW w:type="dxa" w:w="1400"/>
+            <w:tcBorders>
+              <w:top w:val="single" w:color="C9D1DB" w:sz="4"/>
+              <w:left w:val="single" w:color="C9D1DB" w:sz="4"/>
+              <w:bottom w:val="single" w:color="C9D1DB" w:sz="4"/>
+              <w:right w:val="single" w:color="C9D1DB" w:sz="4"/>
+            </w:tcBorders>
+            <w:shd w:fill="F3F6FA" w:color="auto" w:val="clear"/>
+            <w:tcMar>
+              <w:top w:type="dxa" w:w="50"/>
+              <w:left w:type="dxa" w:w="80"/>
+              <w:bottom w:type="dxa" w:w="50"/>
+              <w:right w:type="dxa" w:w="80"/>
+            </w:tcMar>
+            <w:vAlign w:val="center"/>
+          </w:tcPr>
+          <w:p>
+            <w:pPr>
+              <w:spacing w:after="0" w:line="230"/>
+              <w:jc w:val="left"/>
+            </w:pPr>
+            <w:r>
+              <w:rPr>
+                <w:rFonts w:ascii="Arial" w:cs="Arial" w:eastAsia="Arial" w:hAnsi="Arial"/>
+                <w:sz w:val="17"/>
+                <w:szCs w:val="17"/>
+              </w:rPr>
+              <w:t xml:space="preserve">1 s</w:t>
+            </w:r>
+          </w:p>
+        </w:tc>
+        <w:tc>
+          <w:tcPr>
+            <w:tcW w:type="dxa" w:w="3400"/>
+            <w:tcBorders>
+              <w:top w:val="single" w:color="C9D1DB" w:sz="4"/>
+              <w:left w:val="single" w:color="C9D1DB" w:sz="4"/>
+              <w:bottom w:val="single" w:color="C9D1DB" w:sz="4"/>
+              <w:right w:val="single" w:color="C9D1DB" w:sz="4"/>
+            </w:tcBorders>
+            <w:shd w:fill="F3F6FA" w:color="auto" w:val="clear"/>
+            <w:tcMar>
+              <w:top w:type="dxa" w:w="50"/>
+              <w:left w:type="dxa" w:w="80"/>
+              <w:bottom w:type="dxa" w:w="50"/>
+              <w:right w:type="dxa" w:w="80"/>
+            </w:tcMar>
+            <w:vAlign w:val="center"/>
+          </w:tcPr>
+          <w:p>
+            <w:pPr>
+              <w:spacing w:after="0" w:line="230"/>
+              <w:jc w:val="left"/>
+            </w:pPr>
+            <w:r>
+              <w:rPr>
+                <w:rFonts w:ascii="Arial" w:cs="Arial" w:eastAsia="Arial" w:hAnsi="Arial"/>
+                <w:sz w:val="17"/>
+                <w:szCs w:val="17"/>
+              </w:rPr>
+              <w:t xml:space="preserve">0, 4, 11 y 12 de 12, igual que la Entrega 3</w:t>
+            </w:r>
+          </w:p>
+        </w:tc>
+      </w:tr>
+      <w:tr>
+        <w:trPr>
+          <w:cantSplit/>
+        </w:trPr>
+        <w:tc>
+          <w:tcPr>
+            <w:tcW w:type="dxa" w:w="4560"/>
+            <w:tcBorders>
+              <w:top w:val="single" w:color="C9D1DB" w:sz="4"/>
+              <w:left w:val="single" w:color="C9D1DB" w:sz="4"/>
+              <w:bottom w:val="single" w:color="C9D1DB" w:sz="4"/>
+              <w:right w:val="single" w:color="C9D1DB" w:sz="4"/>
+            </w:tcBorders>
+            <w:tcMar>
+              <w:top w:type="dxa" w:w="50"/>
+              <w:left w:type="dxa" w:w="80"/>
+              <w:bottom w:type="dxa" w:w="50"/>
+              <w:right w:type="dxa" w:w="80"/>
+            </w:tcMar>
+            <w:vAlign w:val="center"/>
+          </w:tcPr>
+          <w:p>
+            <w:pPr>
+              <w:spacing w:after="0" w:line="230"/>
+              <w:jc w:val="left"/>
+            </w:pPr>
+            <w:r>
+              <w:rPr>
+                <w:rFonts w:ascii="Arial" w:cs="Arial" w:eastAsia="Arial" w:hAnsi="Arial"/>
+                <w:b/>
+                <w:bCs/>
+                <w:sz w:val="17"/>
+                <w:szCs w:val="17"/>
+              </w:rPr>
+              <w:t xml:space="preserve">Validación corregida (mejoras_e4.py)</w:t>
+            </w:r>
+          </w:p>
+        </w:tc>
+        <w:tc>
+          <w:tcPr>
+            <w:tcW w:type="dxa" w:w="1400"/>
+            <w:tcBorders>
+              <w:top w:val="single" w:color="C9D1DB" w:sz="4"/>
+              <w:left w:val="single" w:color="C9D1DB" w:sz="4"/>
+              <w:bottom w:val="single" w:color="C9D1DB" w:sz="4"/>
+              <w:right w:val="single" w:color="C9D1DB" w:sz="4"/>
+            </w:tcBorders>
+            <w:tcMar>
+              <w:top w:type="dxa" w:w="50"/>
+              <w:left w:type="dxa" w:w="80"/>
+              <w:bottom w:type="dxa" w:w="50"/>
+              <w:right w:type="dxa" w:w="80"/>
+            </w:tcMar>
+            <w:vAlign w:val="center"/>
+          </w:tcPr>
+          <w:p>
+            <w:pPr>
+              <w:spacing w:after="0" w:line="230"/>
+              <w:jc w:val="left"/>
+            </w:pPr>
+            <w:r>
+              <w:rPr>
+                <w:rFonts w:ascii="Arial" w:cs="Arial" w:eastAsia="Arial" w:hAnsi="Arial"/>
+                <w:sz w:val="17"/>
+                <w:szCs w:val="17"/>
+              </w:rPr>
+              <w:t xml:space="preserve">Más de 40 min</w:t>
+            </w:r>
+          </w:p>
+        </w:tc>
+        <w:tc>
+          <w:tcPr>
+            <w:tcW w:type="dxa" w:w="3400"/>
+            <w:tcBorders>
+              <w:top w:val="single" w:color="C9D1DB" w:sz="4"/>
+              <w:left w:val="single" w:color="C9D1DB" w:sz="4"/>
+              <w:bottom w:val="single" w:color="C9D1DB" w:sz="4"/>
+              <w:right w:val="single" w:color="C9D1DB" w:sz="4"/>
+            </w:tcBorders>
+            <w:tcMar>
+              <w:top w:type="dxa" w:w="50"/>
+              <w:left w:type="dxa" w:w="80"/>
+              <w:bottom w:type="dxa" w:w="50"/>
+              <w:right w:type="dxa" w:w="80"/>
+            </w:tcMar>
+            <w:vAlign w:val="center"/>
+          </w:tcPr>
+          <w:p>
+            <w:pPr>
+              <w:spacing w:after="0" w:line="230"/>
+              <w:jc w:val="left"/>
+            </w:pPr>
+            <w:r>
+              <w:rPr>
+                <w:rFonts w:ascii="Arial" w:cs="Arial" w:eastAsia="Arial" w:hAnsi="Arial"/>
+                <w:sz w:val="17"/>
+                <w:szCs w:val="17"/>
+              </w:rPr>
+              <w:t xml:space="preserve">Superó el límite del supervisor; completó al ejecutarse sin límite</w:t>
+            </w:r>
+          </w:p>
+        </w:tc>
+      </w:tr>
+      <w:tr>
+        <w:trPr>
+          <w:cantSplit/>
+        </w:trPr>
+        <w:tc>
+          <w:tcPr>
+            <w:tcW w:type="dxa" w:w="4560"/>
+            <w:tcBorders>
+              <w:top w:val="single" w:color="C9D1DB" w:sz="4"/>
+              <w:left w:val="single" w:color="C9D1DB" w:sz="4"/>
+              <w:bottom w:val="single" w:color="C9D1DB" w:sz="4"/>
+              <w:right w:val="single" w:color="C9D1DB" w:sz="4"/>
+            </w:tcBorders>
+            <w:shd w:fill="F3F6FA" w:color="auto" w:val="clear"/>
+            <w:tcMar>
+              <w:top w:type="dxa" w:w="50"/>
+              <w:left w:type="dxa" w:w="80"/>
+              <w:bottom w:type="dxa" w:w="50"/>
+              <w:right w:type="dxa" w:w="80"/>
+            </w:tcMar>
+            <w:vAlign w:val="center"/>
+          </w:tcPr>
+          <w:p>
+            <w:pPr>
+              <w:spacing w:after="0" w:line="230"/>
+              <w:jc w:val="left"/>
+            </w:pPr>
+            <w:r>
+              <w:rPr>
+                <w:rFonts w:ascii="Arial" w:cs="Arial" w:eastAsia="Arial" w:hAnsi="Arial"/>
+                <w:b/>
+                <w:bCs/>
+                <w:sz w:val="17"/>
+                <w:szCs w:val="17"/>
+              </w:rPr>
+              <w:t xml:space="preserve">Informe final y presentación</w:t>
+            </w:r>
+          </w:p>
+        </w:tc>
+        <w:tc>
+          <w:tcPr>
+            <w:tcW w:type="dxa" w:w="1400"/>
+            <w:tcBorders>
+              <w:top w:val="single" w:color="C9D1DB" w:sz="4"/>
+              <w:left w:val="single" w:color="C9D1DB" w:sz="4"/>
+              <w:bottom w:val="single" w:color="C9D1DB" w:sz="4"/>
+              <w:right w:val="single" w:color="C9D1DB" w:sz="4"/>
+            </w:tcBorders>
+            <w:shd w:fill="F3F6FA" w:color="auto" w:val="clear"/>
+            <w:tcMar>
+              <w:top w:type="dxa" w:w="50"/>
+              <w:left w:type="dxa" w:w="80"/>
+              <w:bottom w:type="dxa" w:w="50"/>
+              <w:right w:type="dxa" w:w="80"/>
+            </w:tcMar>
+            <w:vAlign w:val="center"/>
+          </w:tcPr>
+          <w:p>
+            <w:pPr>
+              <w:spacing w:after="0" w:line="230"/>
+              <w:jc w:val="left"/>
+            </w:pPr>
+            <w:r>
+              <w:rPr>
+                <w:rFonts w:ascii="Arial" w:cs="Arial" w:eastAsia="Arial" w:hAnsi="Arial"/>
+                <w:sz w:val="17"/>
+                <w:szCs w:val="17"/>
+              </w:rPr>
+              <w:t xml:space="preserve">20 s</w:t>
+            </w:r>
+          </w:p>
+        </w:tc>
+        <w:tc>
+          <w:tcPr>
+            <w:tcW w:type="dxa" w:w="3400"/>
+            <w:tcBorders>
+              <w:top w:val="single" w:color="C9D1DB" w:sz="4"/>
+              <w:left w:val="single" w:color="C9D1DB" w:sz="4"/>
+              <w:bottom w:val="single" w:color="C9D1DB" w:sz="4"/>
+              <w:right w:val="single" w:color="C9D1DB" w:sz="4"/>
+            </w:tcBorders>
+            <w:shd w:fill="F3F6FA" w:color="auto" w:val="clear"/>
+            <w:tcMar>
+              <w:top w:type="dxa" w:w="50"/>
+              <w:left w:type="dxa" w:w="80"/>
+              <w:bottom w:type="dxa" w:w="50"/>
+              <w:right w:type="dxa" w:w="80"/>
+            </w:tcMar>
+            <w:vAlign w:val="center"/>
+          </w:tcPr>
+          <w:p>
+            <w:pPr>
+              <w:spacing w:after="0" w:line="230"/>
+              <w:jc w:val="left"/>
+            </w:pPr>
+            <w:r>
+              <w:rPr>
+                <w:rFonts w:ascii="Arial" w:cs="Arial" w:eastAsia="Arial" w:hAnsi="Arial"/>
+                <w:sz w:val="17"/>
+                <w:szCs w:val="17"/>
+              </w:rPr>
+              <w:t xml:space="preserve">Completado; PDF de 28 páginas frente a 30 por diferencias de fuentes</w:t>
+            </w:r>
+          </w:p>
+        </w:tc>
+      </w:tr>
+      <w:tr>
+        <w:trPr>
+          <w:cantSplit/>
+        </w:trPr>
+        <w:tc>
+          <w:tcPr>
+            <w:tcW w:type="dxa" w:w="4560"/>
+            <w:tcBorders>
+              <w:top w:val="single" w:color="C9D1DB" w:sz="4"/>
+              <w:left w:val="single" w:color="C9D1DB" w:sz="4"/>
+              <w:bottom w:val="single" w:color="C9D1DB" w:sz="4"/>
+              <w:right w:val="single" w:color="C9D1DB" w:sz="4"/>
+            </w:tcBorders>
+            <w:tcMar>
+              <w:top w:type="dxa" w:w="50"/>
+              <w:left w:type="dxa" w:w="80"/>
+              <w:bottom w:type="dxa" w:w="50"/>
+              <w:right w:type="dxa" w:w="80"/>
+            </w:tcMar>
+            <w:vAlign w:val="center"/>
+          </w:tcPr>
+          <w:p>
+            <w:pPr>
+              <w:spacing w:after="0" w:line="230"/>
+              <w:jc w:val="left"/>
+            </w:pPr>
+            <w:r>
+              <w:rPr>
+                <w:rFonts w:ascii="Arial" w:cs="Arial" w:eastAsia="Arial" w:hAnsi="Arial"/>
+                <w:b/>
+                <w:bCs/>
+                <w:sz w:val="17"/>
+                <w:szCs w:val="17"/>
+              </w:rPr>
+              <w:t xml:space="preserve">Pruebas automáticas (pytest)</w:t>
+            </w:r>
+          </w:p>
+        </w:tc>
+        <w:tc>
+          <w:tcPr>
+            <w:tcW w:type="dxa" w:w="1400"/>
+            <w:tcBorders>
+              <w:top w:val="single" w:color="C9D1DB" w:sz="4"/>
+              <w:left w:val="single" w:color="C9D1DB" w:sz="4"/>
+              <w:bottom w:val="single" w:color="C9D1DB" w:sz="4"/>
+              <w:right w:val="single" w:color="C9D1DB" w:sz="4"/>
+            </w:tcBorders>
+            <w:tcMar>
+              <w:top w:type="dxa" w:w="50"/>
+              <w:left w:type="dxa" w:w="80"/>
+              <w:bottom w:type="dxa" w:w="50"/>
+              <w:right w:type="dxa" w:w="80"/>
+            </w:tcMar>
+            <w:vAlign w:val="center"/>
+          </w:tcPr>
+          <w:p>
+            <w:pPr>
+              <w:spacing w:after="0" w:line="230"/>
+              <w:jc w:val="left"/>
+            </w:pPr>
+            <w:r>
+              <w:rPr>
+                <w:rFonts w:ascii="Arial" w:cs="Arial" w:eastAsia="Arial" w:hAnsi="Arial"/>
+                <w:sz w:val="17"/>
+                <w:szCs w:val="17"/>
+              </w:rPr>
+              <w:t xml:space="preserve">2 s</w:t>
+            </w:r>
+          </w:p>
+        </w:tc>
+        <w:tc>
+          <w:tcPr>
+            <w:tcW w:type="dxa" w:w="3400"/>
+            <w:tcBorders>
+              <w:top w:val="single" w:color="C9D1DB" w:sz="4"/>
+              <w:left w:val="single" w:color="C9D1DB" w:sz="4"/>
+              <w:bottom w:val="single" w:color="C9D1DB" w:sz="4"/>
+              <w:right w:val="single" w:color="C9D1DB" w:sz="4"/>
+            </w:tcBorders>
+            <w:tcMar>
+              <w:top w:type="dxa" w:w="50"/>
+              <w:left w:type="dxa" w:w="80"/>
+              <w:bottom w:type="dxa" w:w="50"/>
+              <w:right w:type="dxa" w:w="80"/>
+            </w:tcMar>
+            <w:vAlign w:val="center"/>
+          </w:tcPr>
+          <w:p>
+            <w:pPr>
+              <w:spacing w:after="0" w:line="230"/>
+              <w:jc w:val="left"/>
+            </w:pPr>
+            <w:r>
+              <w:rPr>
+                <w:rFonts w:ascii="Arial" w:cs="Arial" w:eastAsia="Arial" w:hAnsi="Arial"/>
+                <w:sz w:val="17"/>
+                <w:szCs w:val="17"/>
+              </w:rPr>
+              <w:t xml:space="preserve">20 de 20 aprobadas; se repitieron al integrar</w:t>
+            </w:r>
+          </w:p>
+        </w:tc>
+      </w:tr>
+    </w:tbl>
+    <w:p>
+      <w:pPr>
+        <w:spacing w:after="160" w:before="60" w:line="240"/>
+        <w:jc w:val="left"/>
+      </w:pPr>
+      <w:r>
+        <w:rPr>
+          <w:rFonts w:ascii="Arial" w:cs="Arial" w:eastAsia="Arial" w:hAnsi="Arial"/>
+          <w:i/>
+          <w:iCs/>
+          <w:color w:val="4B5563"/>
+          <w:sz w:val="17"/>
+          <w:szCs w:val="17"/>
+        </w:rPr>
+        <w:t xml:space="preserve">Nota. </w:t>
+      </w:r>
+      <w:r>
+        <w:rPr>
+          <w:rFonts w:ascii="Arial" w:cs="Arial" w:eastAsia="Arial" w:hAnsi="Arial"/>
+          <w:color w:val="4B5563"/>
+          <w:sz w:val="17"/>
+          <w:szCs w:val="17"/>
+        </w:rPr>
+        <w:t xml:space="preserve">Elaboración propia a partir de REPRODUCIBILIDAD.md (Codex, 26 y 27 de octubre de 2026). Entorno Linux con Python 3.12 y dependencias fijadas en requirements.txt. Los flujos de GitHub Actions y Pages están configurados; su ejecución remota requiere habilitarlos en la configuración del repositorio.</w:t>
+      </w:r>
+    </w:p>
+    <w:p>
+      <w:pPr>
+        <w:spacing w:after="120" w:before="0" w:line="264"/>
+        <w:jc w:val="both"/>
+      </w:pPr>
+      <w:r>
+        <w:rPr>
+          <w:rFonts w:ascii="Arial" w:cs="Arial" w:eastAsia="Arial" w:hAnsi="Arial"/>
+          <w:b/>
+          <w:bCs/>
+        </w:rPr>
+        <w:t xml:space="preserve">Qué verifican las 20 pruebas.</w:t>
+      </w:r>
+      <w:r>
+        <w:rPr>
+          <w:rFonts w:ascii="Arial" w:cs="Arial" w:eastAsia="Arial" w:hAnsi="Arial"/>
+        </w:rPr>
+        <w:t xml:space="preserve"> Que sin kit el ahorro sea cero; que el ahorro en el ciclo WLTC con el kit de referencia esté en el rango esperado; que la energía disponible nunca sea negativa; las fórmulas de gasto, ahorro y plazo del caso N1; los estados no aplica y no conviene; que las 12 salidas v3.1 aprueben el validador; que el validador adversarial reproduzca 8 de 10; que el Ridge exportado coincida con scikit-learn; y que Python y JavaScript entreguen la misma cifra.</w:t>
       </w:r>
     </w:p>
     <w:sectPr>

</xml_diff>

<commit_message>
E5: Anexo K entrega el repositorio comprimido y cita el prototipo publicado en Pages
Co-Authored-By: Claude Opus 5.5 <noreply@anthropic.com>
Claude-Session: https://claude.ai/code/session_01Sm1GEyEEaRYCzcLRpQWvbd
</commit_message>
<xml_diff>
--- a/entrega5/TIG_IA_Grupo01_LumineMotors_InformeFinal.docx
+++ b/entrega5/TIG_IA_Grupo01_LumineMotors_InformeFinal.docx
@@ -29589,7 +29589,7 @@
         <w:rPr>
           <w:rFonts w:ascii="Arial" w:cs="Arial" w:eastAsia="Arial" w:hAnsi="Arial"/>
         </w:rPr>
-        <w:t xml:space="preserve">El prototipo completo está en el repositorio del proyecto. La interfaz (entrega3/prototipo/app/index.html) es un archivo único que funciona sin conexión y corre el modelo en el navegador; un flujo de GitHub Actions la publica en GitHub Pages cuando se habilita esa opción en el repositorio.</w:t>
+        <w:t xml:space="preserve">El prototipo completo está en el repositorio del proyecto. La interfaz (entrega3/prototipo/app/index.html) es un archivo único que funciona sin conexión y corre el modelo en el navegador; un flujo de GitHub Actions la publica en https://diegoaam0109-ux.github.io/lumine/ con cada cambio.</w:t>
       </w:r>
     </w:p>
     <w:p>
@@ -36331,7 +36331,7 @@
         <w:rPr>
           <w:rFonts w:ascii="Arial" w:cs="Arial" w:eastAsia="Arial" w:hAnsi="Arial"/>
         </w:rPr>
-        <w:t xml:space="preserve">Repositorio: github.com/diegoaam0109-ux/lumine (rama claude/quirky-darwin-326nn0). El acceso para revisión se entrega al profesor como colaborador de solo lectura. Cada entrega tiene su carpeta (entrega3/, entrega4/ y entrega5/) y cada cambio queda con autor, fecha y propósito.</w:t>
+        <w:t xml:space="preserve">Repositorio: github.com/diegoaam0109-ux/lumine (rama claude/quirky-darwin-326nn0). El repositorio es privado; por eso se entrega comprimido junto a este informe, con su historial completo, y la Tabla K1 resume los commits clave. Cada entrega tiene su carpeta (entrega3/, entrega4/ y entrega5/) y cada cambio queda con autor, fecha y propósito.</w:t>
       </w:r>
     </w:p>
     <w:p>
@@ -38576,7 +38576,7 @@
           <w:sz w:val="17"/>
           <w:szCs w:val="17"/>
         </w:rPr>
-        <w:t xml:space="preserve">Elaboración propia a partir de REPRODUCIBILIDAD.md (Codex, 26 y 27 de octubre de 2026). Entorno Linux con Python 3.12 y dependencias fijadas en requirements.txt. Los flujos de GitHub Actions y Pages están configurados; su ejecución remota requiere habilitarlos en la configuración del repositorio.</w:t>
+        <w:t xml:space="preserve">Elaboración propia a partir de REPRODUCIBILIDAD.md (Codex, 26 y 27 de octubre de 2026). Entorno Linux con Python 3.12 y dependencias fijadas en requirements.txt. El prototipo se publica automáticamente en https://diegoaam0109-ux.github.io/lumine/ con cada cambio.</w:t>
       </w:r>
     </w:p>
     <w:p>

</xml_diff>

<commit_message>
E5: retira el link de Pages, que no se publica con el repositorio privado
Co-Authored-By: Claude Opus 5.5 <noreply@anthropic.com>
Claude-Session: https://claude.ai/code/session_01Sm1GEyEEaRYCzcLRpQWvbd
</commit_message>
<xml_diff>
--- a/entrega5/TIG_IA_Grupo01_LumineMotors_InformeFinal.docx
+++ b/entrega5/TIG_IA_Grupo01_LumineMotors_InformeFinal.docx
@@ -29589,7 +29589,7 @@
         <w:rPr>
           <w:rFonts w:ascii="Arial" w:cs="Arial" w:eastAsia="Arial" w:hAnsi="Arial"/>
         </w:rPr>
-        <w:t xml:space="preserve">El prototipo completo está en el repositorio del proyecto. La interfaz (entrega3/prototipo/app/index.html) es un archivo único que funciona sin conexión y corre el modelo en el navegador; un flujo de GitHub Actions la publica en https://diegoaam0109-ux.github.io/lumine/ con cada cambio.</w:t>
+        <w:t xml:space="preserve">El prototipo completo está en el repositorio del proyecto. La interfaz (entrega3/prototipo/app/index.html) es un archivo único que funciona sin conexión y corre el modelo en el navegador; se entrega en el archivo comprimido de anexos y basta abrirla en un navegador.</w:t>
       </w:r>
     </w:p>
     <w:p>
@@ -38576,7 +38576,7 @@
           <w:sz w:val="17"/>
           <w:szCs w:val="17"/>
         </w:rPr>
-        <w:t xml:space="preserve">Elaboración propia a partir de REPRODUCIBILIDAD.md (Codex, 26 y 27 de octubre de 2026). Entorno Linux con Python 3.12 y dependencias fijadas en requirements.txt. El prototipo se publica automáticamente en https://diegoaam0109-ux.github.io/lumine/ con cada cambio.</w:t>
+        <w:t xml:space="preserve">Elaboración propia a partir de REPRODUCIBILIDAD.md (Codex, 26 y 27 de octubre de 2026). Entorno Linux con Python 3.12 y dependencias fijadas en requirements.txt. El flujo de publicación en GitHub Pages quedó configurado, pero no se activa mientras el repositorio sea privado; el prototipo se entrega como archivo.</w:t>
       </w:r>
     </w:p>
     <w:p>

</xml_diff>